<commit_message>
Add GPO restrictions, background policy, and environment variable documentation
</commit_message>
<xml_diff>
--- a/Documentation/rapport.docx
+++ b/Documentation/rapport.docx
@@ -4357,20 +4357,191 @@
     <w:p xmlns:wp14="http://schemas.microsoft.com/office/word/2010/wordml" wp14:textId="77777777">
       <w:pPr>
         <w:pStyle w:val="Heading2"/>
+      </w:pPr>
+      <w:r>
         <w:rPr>
           <w:b w:val="0"/>
           <w:bCs w:val="0"/>
           <w:u w:val="none"/>
         </w:rPr>
-      </w:pPr>
-      <w:r>
-        <w:rPr>
-          <w:b w:val="0"/>
-          <w:bCs w:val="0"/>
-          <w:u w:val="none"/>
-        </w:rPr>
         <w:t>4.6 Gruppepolitik (GPO)</w:t>
       </w:r>
+    </w:p>
+    <w:p>
+      <w:pPr>
+        <w:shd w:val="clear" w:color="auto" w:fill="FFFFFF" w:themeFill="background1"/>
+        <w:spacing w:before="0" w:beforeAutospacing="off" w:after="200" w:afterAutospacing="off"/>
+      </w:pPr>
+      <w:r>
+        <w:rPr>
+          <w:rFonts w:ascii="Cambria" w:hAnsi="Cambria" w:eastAsia="Cambria" w:cs="Cambria"/>
+          <w:b w:val="0"/>
+          <w:bCs w:val="0"/>
+          <w:i w:val="0"/>
+          <w:iCs w:val="0"/>
+          <w:caps w:val="0"/>
+          <w:smallCaps w:val="0"/>
+          <w:noProof w:val="0"/>
+          <w:color w:val="000000" w:themeColor="text1" w:themeTint="FF" w:themeShade="FF"/>
+          <w:sz w:val="22"/>
+          <w:szCs w:val="22"/>
+          <w:lang w:val="en-US"/>
+        </w:rPr>
+        <w:t>Der blev oprettet en GPO med navnet GPO-user-Restrictions og knyttet til domænet.</w:t>
+      </w:r>
+    </w:p>
+    <w:p>
+      <w:pPr>
+        <w:shd w:val="clear" w:color="auto" w:fill="FFFFFF" w:themeFill="background1"/>
+        <w:spacing w:before="0" w:beforeAutospacing="off" w:after="200" w:afterAutospacing="off"/>
+      </w:pPr>
+      <w:r>
+        <w:rPr>
+          <w:rFonts w:ascii="Cambria" w:hAnsi="Cambria" w:eastAsia="Cambria" w:cs="Cambria"/>
+          <w:b w:val="0"/>
+          <w:bCs w:val="0"/>
+          <w:i w:val="0"/>
+          <w:iCs w:val="0"/>
+          <w:caps w:val="0"/>
+          <w:smallCaps w:val="0"/>
+          <w:noProof w:val="0"/>
+          <w:color w:val="000000" w:themeColor="text1" w:themeTint="FF" w:themeShade="FF"/>
+          <w:sz w:val="22"/>
+          <w:szCs w:val="22"/>
+          <w:lang w:val="en-US"/>
+        </w:rPr>
+        <w:t>GPO’en bruges til at begrænse brugernes mulighed for at ændre brugerfladen og installere programmer.</w:t>
+      </w:r>
+    </w:p>
+    <w:p>
+      <w:pPr>
+        <w:shd w:val="clear" w:color="auto" w:fill="FFFFFF" w:themeFill="background1"/>
+        <w:spacing w:before="0" w:beforeAutospacing="off" w:after="200" w:afterAutospacing="off"/>
+        <w:ind w:left="360" w:right="0" w:hanging="360"/>
+      </w:pPr>
+      <w:r>
+        <w:rPr>
+          <w:rFonts w:ascii="Arial" w:hAnsi="Arial" w:eastAsia="Arial" w:cs="Arial"/>
+          <w:b w:val="0"/>
+          <w:bCs w:val="0"/>
+          <w:i w:val="0"/>
+          <w:iCs w:val="0"/>
+          <w:caps w:val="0"/>
+          <w:smallCaps w:val="0"/>
+          <w:noProof w:val="0"/>
+          <w:color w:val="000000" w:themeColor="text1" w:themeTint="FF" w:themeShade="FF"/>
+          <w:sz w:val="22"/>
+          <w:szCs w:val="22"/>
+          <w:lang w:val="en-US"/>
+        </w:rPr>
+        <w:t>Brugerne kan ikke ændre det tildelte baggrundsbillede.</w:t>
+      </w:r>
+    </w:p>
+    <w:p>
+      <w:pPr>
+        <w:shd w:val="clear" w:color="auto" w:fill="FFFFFF" w:themeFill="background1"/>
+        <w:spacing w:before="0" w:beforeAutospacing="off" w:after="200" w:afterAutospacing="off"/>
+        <w:ind w:left="360" w:right="0" w:hanging="360"/>
+      </w:pPr>
+      <w:r>
+        <w:rPr>
+          <w:rFonts w:ascii="Arial" w:hAnsi="Arial" w:eastAsia="Arial" w:cs="Arial"/>
+          <w:b w:val="0"/>
+          <w:bCs w:val="0"/>
+          <w:i w:val="0"/>
+          <w:iCs w:val="0"/>
+          <w:caps w:val="0"/>
+          <w:smallCaps w:val="0"/>
+          <w:noProof w:val="0"/>
+          <w:color w:val="000000" w:themeColor="text1" w:themeTint="FF" w:themeShade="FF"/>
+          <w:sz w:val="22"/>
+          <w:szCs w:val="22"/>
+          <w:lang w:val="en-US"/>
+        </w:rPr>
+        <w:t>Startmenuen er begrænset, så brugerne ikke kan ændre relevante indstillinger.</w:t>
+      </w:r>
+    </w:p>
+    <w:p>
+      <w:pPr>
+        <w:shd w:val="clear" w:color="auto" w:fill="FFFFFF" w:themeFill="background1"/>
+        <w:spacing w:before="0" w:beforeAutospacing="off" w:after="200" w:afterAutospacing="off"/>
+        <w:ind w:left="360" w:right="0" w:hanging="360"/>
+      </w:pPr>
+      <w:r>
+        <w:rPr>
+          <w:rFonts w:ascii="Arial" w:hAnsi="Arial" w:eastAsia="Arial" w:cs="Arial"/>
+          <w:b w:val="0"/>
+          <w:bCs w:val="0"/>
+          <w:i w:val="0"/>
+          <w:iCs w:val="0"/>
+          <w:caps w:val="0"/>
+          <w:smallCaps w:val="0"/>
+          <w:noProof w:val="0"/>
+          <w:color w:val="000000" w:themeColor="text1" w:themeTint="FF" w:themeShade="FF"/>
+          <w:sz w:val="22"/>
+          <w:szCs w:val="22"/>
+          <w:lang w:val="en-US"/>
+        </w:rPr>
+        <w:t>Brugerne begrænses fra selv at installere programmer via Windows Installer.</w:t>
+      </w:r>
+    </w:p>
+    <w:p>
+      <w:pPr>
+        <w:shd w:val="clear" w:color="auto" w:fill="FFFFFF" w:themeFill="background1"/>
+        <w:spacing w:before="0" w:beforeAutospacing="off" w:after="200" w:afterAutospacing="off"/>
+        <w:ind w:left="360" w:right="0" w:hanging="360"/>
+      </w:pPr>
+      <w:r>
+        <w:rPr>
+          <w:rFonts w:ascii="Arial" w:hAnsi="Arial" w:eastAsia="Arial" w:cs="Arial"/>
+          <w:b w:val="0"/>
+          <w:bCs w:val="0"/>
+          <w:i w:val="0"/>
+          <w:iCs w:val="0"/>
+          <w:caps w:val="0"/>
+          <w:smallCaps w:val="0"/>
+          <w:noProof w:val="0"/>
+          <w:color w:val="000000" w:themeColor="text1" w:themeTint="FF" w:themeShade="FF"/>
+          <w:sz w:val="22"/>
+          <w:szCs w:val="22"/>
+          <w:lang w:val="en-US"/>
+        </w:rPr>
+        <w:t>Der anvendes et fælles baggrundsbillede for brugerne i afdelingen, som ligger på serveren.</w:t>
+      </w:r>
+    </w:p>
+    <w:p>
+      <w:pPr>
+        <w:shd w:val="clear" w:color="auto" w:fill="FFFFFF" w:themeFill="background1"/>
+        <w:spacing w:before="0" w:beforeAutospacing="off" w:after="200" w:afterAutospacing="off"/>
+        <w:ind w:left="360" w:right="0" w:hanging="360"/>
+      </w:pPr>
+      <w:r>
+        <w:rPr>
+          <w:rFonts w:ascii="Arial" w:hAnsi="Arial" w:eastAsia="Arial" w:cs="Arial"/>
+          <w:b w:val="0"/>
+          <w:bCs w:val="0"/>
+          <w:i w:val="0"/>
+          <w:iCs w:val="0"/>
+          <w:caps w:val="0"/>
+          <w:smallCaps w:val="0"/>
+          <w:noProof w:val="0"/>
+          <w:color w:val="000000" w:themeColor="text1" w:themeTint="FF" w:themeShade="FF"/>
+          <w:sz w:val="22"/>
+          <w:szCs w:val="22"/>
+          <w:lang w:val="en-US"/>
+        </w:rPr>
+        <w:t>GPO’en blev opdateret med gpupdate /force for at anvende ændringerne.</w:t>
+      </w:r>
+    </w:p>
+    <w:p>
+      <w:pPr>
+        <w:pStyle w:val="Normal"/>
+      </w:pPr>
+    </w:p>
+    <w:p>
+      <w:pPr>
+        <w:pStyle w:val="Normal"/>
+      </w:pPr>
     </w:p>
     <w:p xmlns:wp14="http://schemas.microsoft.com/office/word/2010/wordml" wp14:textId="77777777">
       <w:pPr>
@@ -6108,7 +6279,308 @@
         <w:t>5.3 Wallpaper og brugerrestriktioner</w:t>
       </w:r>
     </w:p>
-    <w:p xmlns:wp14="http://schemas.microsoft.com/office/word/2010/wordml" wp14:textId="77777777">
+    <w:p xmlns:wp14="http://schemas.microsoft.com/office/word/2010/wordml" wp14:textId="52349474">
+      <w:pPr>
+        <w:shd w:val="clear" w:color="auto" w:fill="FFFFFF" w:themeFill="background1"/>
+        <w:spacing w:before="0" w:beforeAutospacing="off" w:after="200" w:afterAutospacing="off"/>
+        <w:rPr>
+          <w:rFonts w:ascii="Calibri" w:hAnsi="Calibri" w:eastAsia="Calibri" w:cs="Calibri" w:asciiTheme="majorAscii" w:hAnsiTheme="majorAscii" w:eastAsiaTheme="majorAscii" w:cstheme="majorAscii"/>
+          <w:b w:val="0"/>
+          <w:bCs w:val="0"/>
+          <w:i w:val="0"/>
+          <w:iCs w:val="0"/>
+          <w:caps w:val="0"/>
+          <w:smallCaps w:val="0"/>
+          <w:noProof w:val="0"/>
+          <w:color w:val="000000" w:themeColor="text1" w:themeTint="FF" w:themeShade="FF"/>
+          <w:sz w:val="22"/>
+          <w:szCs w:val="22"/>
+          <w:lang w:val="en-US"/>
+        </w:rPr>
+      </w:pPr>
+      <w:r>
+        <w:rPr>
+          <w:rFonts w:ascii="Calibri" w:hAnsi="Calibri" w:eastAsia="Calibri" w:cs="Calibri" w:asciiTheme="majorAscii" w:hAnsiTheme="majorAscii" w:eastAsiaTheme="majorAscii" w:cstheme="majorAscii"/>
+          <w:b w:val="0"/>
+          <w:bCs w:val="0"/>
+          <w:i w:val="0"/>
+          <w:iCs w:val="0"/>
+          <w:caps w:val="0"/>
+          <w:smallCaps w:val="0"/>
+          <w:noProof w:val="0"/>
+          <w:color w:val="000000" w:themeColor="text1" w:themeTint="FF" w:themeShade="FF"/>
+          <w:sz w:val="22"/>
+          <w:szCs w:val="22"/>
+          <w:lang w:val="en-US"/>
+        </w:rPr>
+        <w:t>Formålet var at konfigurere en fast skrivebordsbaggrund på klienterne via Group Policy.</w:t>
+      </w:r>
+    </w:p>
+    <w:p xmlns:wp14="http://schemas.microsoft.com/office/word/2010/wordml" wp14:textId="27DB564D">
+      <w:pPr>
+        <w:shd w:val="clear" w:color="auto" w:fill="FFFFFF" w:themeFill="background1"/>
+        <w:spacing w:before="0" w:beforeAutospacing="off" w:after="200" w:afterAutospacing="off"/>
+        <w:rPr>
+          <w:rFonts w:ascii="Calibri" w:hAnsi="Calibri" w:eastAsia="Calibri" w:cs="Calibri" w:asciiTheme="majorAscii" w:hAnsiTheme="majorAscii" w:eastAsiaTheme="majorAscii" w:cstheme="majorAscii"/>
+          <w:b w:val="0"/>
+          <w:bCs w:val="0"/>
+          <w:i w:val="0"/>
+          <w:iCs w:val="0"/>
+          <w:caps w:val="0"/>
+          <w:smallCaps w:val="0"/>
+          <w:noProof w:val="0"/>
+          <w:color w:val="000000" w:themeColor="text1" w:themeTint="FF" w:themeShade="FF"/>
+          <w:sz w:val="22"/>
+          <w:szCs w:val="22"/>
+          <w:lang w:val="en-US"/>
+        </w:rPr>
+      </w:pPr>
+      <w:r>
+        <w:rPr>
+          <w:rFonts w:ascii="Calibri" w:hAnsi="Calibri" w:eastAsia="Calibri" w:cs="Calibri" w:asciiTheme="majorAscii" w:hAnsiTheme="majorAscii" w:eastAsiaTheme="majorAscii" w:cstheme="majorAscii"/>
+          <w:b w:val="0"/>
+          <w:bCs w:val="0"/>
+          <w:i w:val="0"/>
+          <w:iCs w:val="0"/>
+          <w:caps w:val="0"/>
+          <w:smallCaps w:val="0"/>
+          <w:noProof w:val="0"/>
+          <w:color w:val="000000" w:themeColor="text1" w:themeTint="FF" w:themeShade="FF"/>
+          <w:sz w:val="22"/>
+          <w:szCs w:val="22"/>
+          <w:lang w:val="en-US"/>
+        </w:rPr>
+        <w:t>1. Placering og deling af billeder</w:t>
+      </w:r>
+    </w:p>
+    <w:p xmlns:wp14="http://schemas.microsoft.com/office/word/2010/wordml" wp14:textId="6B427CDC">
+      <w:pPr>
+        <w:shd w:val="clear" w:color="auto" w:fill="FFFFFF" w:themeFill="background1"/>
+        <w:spacing w:before="0" w:beforeAutospacing="off" w:after="200" w:afterAutospacing="off"/>
+        <w:rPr>
+          <w:rFonts w:ascii="Calibri" w:hAnsi="Calibri" w:eastAsia="Calibri" w:cs="Calibri" w:asciiTheme="majorAscii" w:hAnsiTheme="majorAscii" w:eastAsiaTheme="majorAscii" w:cstheme="majorAscii"/>
+          <w:b w:val="0"/>
+          <w:bCs w:val="0"/>
+          <w:i w:val="0"/>
+          <w:iCs w:val="0"/>
+          <w:caps w:val="0"/>
+          <w:smallCaps w:val="0"/>
+          <w:noProof w:val="0"/>
+          <w:color w:val="000000" w:themeColor="text1" w:themeTint="FF" w:themeShade="FF"/>
+          <w:sz w:val="22"/>
+          <w:szCs w:val="22"/>
+          <w:lang w:val="en-US"/>
+        </w:rPr>
+      </w:pPr>
+      <w:r>
+        <w:rPr>
+          <w:rFonts w:ascii="Calibri" w:hAnsi="Calibri" w:eastAsia="Calibri" w:cs="Calibri" w:asciiTheme="majorAscii" w:hAnsiTheme="majorAscii" w:eastAsiaTheme="majorAscii" w:cstheme="majorAscii"/>
+          <w:b w:val="0"/>
+          <w:bCs w:val="0"/>
+          <w:i w:val="0"/>
+          <w:iCs w:val="0"/>
+          <w:caps w:val="0"/>
+          <w:smallCaps w:val="0"/>
+          <w:noProof w:val="0"/>
+          <w:color w:val="000000" w:themeColor="text1" w:themeTint="FF" w:themeShade="FF"/>
+          <w:sz w:val="22"/>
+          <w:szCs w:val="22"/>
+          <w:lang w:val="en-US"/>
+        </w:rPr>
+        <w:t>Billederne blev placeret på serveren i mappen D:\wallpaper. Mappen blev delt på netværket som "wallpaper", så klienterne kunne tilgå billederne via en UNC-sti.</w:t>
+      </w:r>
+    </w:p>
+    <w:p xmlns:wp14="http://schemas.microsoft.com/office/word/2010/wordml" wp14:textId="1F70F020">
+      <w:pPr>
+        <w:shd w:val="clear" w:color="auto" w:fill="FFFFFF" w:themeFill="background1"/>
+        <w:spacing w:before="0" w:beforeAutospacing="off" w:after="200" w:afterAutospacing="off"/>
+        <w:rPr>
+          <w:rFonts w:ascii="Calibri" w:hAnsi="Calibri" w:eastAsia="Calibri" w:cs="Calibri" w:asciiTheme="majorAscii" w:hAnsiTheme="majorAscii" w:eastAsiaTheme="majorAscii" w:cstheme="majorAscii"/>
+          <w:b w:val="0"/>
+          <w:bCs w:val="0"/>
+          <w:i w:val="0"/>
+          <w:iCs w:val="0"/>
+          <w:caps w:val="0"/>
+          <w:smallCaps w:val="0"/>
+          <w:noProof w:val="0"/>
+          <w:color w:val="000000" w:themeColor="text1" w:themeTint="FF" w:themeShade="FF"/>
+          <w:sz w:val="22"/>
+          <w:szCs w:val="22"/>
+          <w:lang w:val="en-US"/>
+        </w:rPr>
+      </w:pPr>
+      <w:r>
+        <w:rPr>
+          <w:rFonts w:ascii="Calibri" w:hAnsi="Calibri" w:eastAsia="Calibri" w:cs="Calibri" w:asciiTheme="majorAscii" w:hAnsiTheme="majorAscii" w:eastAsiaTheme="majorAscii" w:cstheme="majorAscii"/>
+          <w:b w:val="0"/>
+          <w:bCs w:val="0"/>
+          <w:i w:val="0"/>
+          <w:iCs w:val="0"/>
+          <w:caps w:val="0"/>
+          <w:smallCaps w:val="0"/>
+          <w:noProof w:val="0"/>
+          <w:color w:val="000000" w:themeColor="text1" w:themeTint="FF" w:themeShade="FF"/>
+          <w:sz w:val="22"/>
+          <w:szCs w:val="22"/>
+          <w:lang w:val="en-US"/>
+        </w:rPr>
+        <w:t>2. Konfiguration af Group Policy</w:t>
+      </w:r>
+    </w:p>
+    <w:p xmlns:wp14="http://schemas.microsoft.com/office/word/2010/wordml" wp14:textId="0146DB5F">
+      <w:pPr>
+        <w:shd w:val="clear" w:color="auto" w:fill="FFFFFF" w:themeFill="background1"/>
+        <w:spacing w:before="0" w:beforeAutospacing="off" w:after="200" w:afterAutospacing="off"/>
+        <w:rPr>
+          <w:rFonts w:ascii="Calibri" w:hAnsi="Calibri" w:eastAsia="Calibri" w:cs="Calibri" w:asciiTheme="majorAscii" w:hAnsiTheme="majorAscii" w:eastAsiaTheme="majorAscii" w:cstheme="majorAscii"/>
+          <w:b w:val="0"/>
+          <w:bCs w:val="0"/>
+          <w:i w:val="0"/>
+          <w:iCs w:val="0"/>
+          <w:caps w:val="0"/>
+          <w:smallCaps w:val="0"/>
+          <w:noProof w:val="0"/>
+          <w:color w:val="000000" w:themeColor="text1" w:themeTint="FF" w:themeShade="FF"/>
+          <w:sz w:val="22"/>
+          <w:szCs w:val="22"/>
+          <w:lang w:val="en-US"/>
+        </w:rPr>
+      </w:pPr>
+      <w:r>
+        <w:rPr>
+          <w:rFonts w:ascii="Calibri" w:hAnsi="Calibri" w:eastAsia="Calibri" w:cs="Calibri" w:asciiTheme="majorAscii" w:hAnsiTheme="majorAscii" w:eastAsiaTheme="majorAscii" w:cstheme="majorAscii"/>
+          <w:b w:val="0"/>
+          <w:bCs w:val="0"/>
+          <w:i w:val="0"/>
+          <w:iCs w:val="0"/>
+          <w:caps w:val="0"/>
+          <w:smallCaps w:val="0"/>
+          <w:noProof w:val="0"/>
+          <w:color w:val="000000" w:themeColor="text1" w:themeTint="FF" w:themeShade="FF"/>
+          <w:sz w:val="22"/>
+          <w:szCs w:val="22"/>
+          <w:lang w:val="en-US"/>
+        </w:rPr>
+        <w:t xml:space="preserve">I Group Policy blev indstillingen "Desktop Wallpaper" aktiveret. Her blev stien til det ønskede billede angivet som en UNC-sti, f.eks. </w:t>
+      </w:r>
+      <w:hyperlink r:id="R459b18bf99214cd8">
+        <w:r>
+          <w:rPr>
+            <w:rStyle w:val="Hyperlink"/>
+            <w:rFonts w:ascii="Calibri" w:hAnsi="Calibri" w:eastAsia="Calibri" w:cs="Calibri" w:asciiTheme="majorAscii" w:hAnsiTheme="majorAscii" w:eastAsiaTheme="majorAscii" w:cstheme="majorAscii"/>
+            <w:b w:val="0"/>
+            <w:bCs w:val="0"/>
+            <w:i w:val="0"/>
+            <w:iCs w:val="0"/>
+            <w:caps w:val="0"/>
+            <w:smallCaps w:val="0"/>
+            <w:noProof w:val="0"/>
+            <w:sz w:val="22"/>
+            <w:szCs w:val="22"/>
+            <w:lang w:val="en-US"/>
+          </w:rPr>
+          <w:t>\\SRV01\wallpaper\d1.jpg</w:t>
+        </w:r>
+      </w:hyperlink>
+      <w:r>
+        <w:rPr>
+          <w:rFonts w:ascii="Calibri" w:hAnsi="Calibri" w:eastAsia="Calibri" w:cs="Calibri" w:asciiTheme="majorAscii" w:hAnsiTheme="majorAscii" w:eastAsiaTheme="majorAscii" w:cstheme="majorAscii"/>
+          <w:b w:val="0"/>
+          <w:bCs w:val="0"/>
+          <w:i w:val="0"/>
+          <w:iCs w:val="0"/>
+          <w:caps w:val="0"/>
+          <w:smallCaps w:val="0"/>
+          <w:noProof w:val="0"/>
+          <w:color w:val="000000" w:themeColor="text1" w:themeTint="FF" w:themeShade="FF"/>
+          <w:sz w:val="22"/>
+          <w:szCs w:val="22"/>
+          <w:lang w:val="en-US"/>
+        </w:rPr>
+        <w:t>.</w:t>
+      </w:r>
+    </w:p>
+    <w:p xmlns:wp14="http://schemas.microsoft.com/office/word/2010/wordml" wp14:textId="1E0C8C71">
+      <w:pPr>
+        <w:shd w:val="clear" w:color="auto" w:fill="FFFFFF" w:themeFill="background1"/>
+        <w:spacing w:before="0" w:beforeAutospacing="off" w:after="200" w:afterAutospacing="off"/>
+        <w:rPr>
+          <w:rFonts w:ascii="Calibri" w:hAnsi="Calibri" w:eastAsia="Calibri" w:cs="Calibri" w:asciiTheme="majorAscii" w:hAnsiTheme="majorAscii" w:eastAsiaTheme="majorAscii" w:cstheme="majorAscii"/>
+          <w:b w:val="0"/>
+          <w:bCs w:val="0"/>
+          <w:i w:val="0"/>
+          <w:iCs w:val="0"/>
+          <w:caps w:val="0"/>
+          <w:smallCaps w:val="0"/>
+          <w:noProof w:val="0"/>
+          <w:color w:val="000000" w:themeColor="text1" w:themeTint="FF" w:themeShade="FF"/>
+          <w:sz w:val="22"/>
+          <w:szCs w:val="22"/>
+          <w:lang w:val="en-US"/>
+        </w:rPr>
+      </w:pPr>
+      <w:r>
+        <w:rPr>
+          <w:rFonts w:ascii="Calibri" w:hAnsi="Calibri" w:eastAsia="Calibri" w:cs="Calibri" w:asciiTheme="majorAscii" w:hAnsiTheme="majorAscii" w:eastAsiaTheme="majorAscii" w:cstheme="majorAscii"/>
+          <w:b w:val="0"/>
+          <w:bCs w:val="0"/>
+          <w:i w:val="0"/>
+          <w:iCs w:val="0"/>
+          <w:caps w:val="0"/>
+          <w:smallCaps w:val="0"/>
+          <w:noProof w:val="0"/>
+          <w:color w:val="000000" w:themeColor="text1" w:themeTint="FF" w:themeShade="FF"/>
+          <w:sz w:val="22"/>
+          <w:szCs w:val="22"/>
+          <w:lang w:val="en-US"/>
+        </w:rPr>
+        <w:t>3. Anvendelse på klienten</w:t>
+      </w:r>
+    </w:p>
+    <w:p xmlns:wp14="http://schemas.microsoft.com/office/word/2010/wordml" wp14:textId="01614BE6">
+      <w:pPr>
+        <w:shd w:val="clear" w:color="auto" w:fill="FFFFFF" w:themeFill="background1"/>
+        <w:spacing w:before="0" w:beforeAutospacing="off" w:after="200" w:afterAutospacing="off"/>
+      </w:pPr>
+      <w:r>
+        <w:rPr>
+          <w:rFonts w:ascii="Calibri" w:hAnsi="Calibri" w:eastAsia="Calibri" w:cs="Calibri" w:asciiTheme="majorAscii" w:hAnsiTheme="majorAscii" w:eastAsiaTheme="majorAscii" w:cstheme="majorAscii"/>
+          <w:b w:val="0"/>
+          <w:bCs w:val="0"/>
+          <w:i w:val="0"/>
+          <w:iCs w:val="0"/>
+          <w:caps w:val="0"/>
+          <w:smallCaps w:val="0"/>
+          <w:noProof w:val="0"/>
+          <w:color w:val="000000" w:themeColor="text1" w:themeTint="FF" w:themeShade="FF"/>
+          <w:sz w:val="22"/>
+          <w:szCs w:val="22"/>
+          <w:lang w:val="en-US"/>
+        </w:rPr>
+        <w:t>På klienten blev Group Policy opdateret med kommandoen gpupdate /force. Herefter blev den konfigurerede skrivebordsbaggrund anvendt på klientens skrivebord.</w:t>
+      </w:r>
+    </w:p>
+    <w:p xmlns:wp14="http://schemas.microsoft.com/office/word/2010/wordml" wp14:textId="778AB5DC">
+      <w:pPr>
+        <w:shd w:val="clear" w:color="auto" w:fill="FFFFFF" w:themeFill="background1"/>
+        <w:spacing w:before="0" w:beforeAutospacing="off" w:after="200" w:afterAutospacing="off"/>
+        <w:rPr>
+          <w:rFonts w:ascii="Calibri" w:hAnsi="Calibri" w:eastAsia="Calibri" w:cs="Calibri" w:asciiTheme="majorAscii" w:hAnsiTheme="majorAscii" w:eastAsiaTheme="majorAscii" w:cstheme="majorAscii"/>
+          <w:b w:val="0"/>
+          <w:bCs w:val="0"/>
+          <w:i w:val="0"/>
+          <w:iCs w:val="0"/>
+          <w:caps w:val="0"/>
+          <w:smallCaps w:val="0"/>
+          <w:noProof w:val="0"/>
+          <w:color w:val="000000" w:themeColor="text1" w:themeTint="FF" w:themeShade="FF"/>
+          <w:sz w:val="22"/>
+          <w:szCs w:val="22"/>
+          <w:lang w:val="en-US"/>
+        </w:rPr>
+      </w:pPr>
+    </w:p>
+    <w:p xmlns:wp14="http://schemas.microsoft.com/office/word/2010/wordml" wp14:textId="24F7C0DF">
       <w:pPr>
         <w:rPr>
           <w:b w:val="0"/>
@@ -6116,14 +6588,6 @@
           <w:u w:val="none"/>
         </w:rPr>
       </w:pPr>
-      <w:r>
-        <w:rPr>
-          <w:b w:val="0"/>
-          <w:bCs w:val="0"/>
-          <w:u w:val="none"/>
-        </w:rPr>
-        <w:t>Skriv indhold her...</w:t>
-      </w:r>
       <w:r>
         <w:br/>
       </w:r>

</xml_diff>

<commit_message>
Add VPN and LibreOffice configuration
</commit_message>
<xml_diff>
--- a/Documentation/rapport.docx
+++ b/Documentation/rapport.docx
@@ -6165,25 +6165,705 @@
         <w:t>5. Sikkerhed</w:t>
       </w:r>
     </w:p>
-    <w:p xmlns:wp14="http://schemas.microsoft.com/office/word/2010/wordml" wp14:textId="77777777">
-      <w:pPr>
-        <w:rPr>
-          <w:b w:val="0"/>
-          <w:bCs w:val="0"/>
-          <w:u w:val="none"/>
-        </w:rPr>
-      </w:pPr>
-      <w:r>
-        <w:rPr>
-          <w:b w:val="0"/>
-          <w:bCs w:val="0"/>
-          <w:u w:val="none"/>
-        </w:rPr>
-        <w:t>Skriv indhold her...</w:t>
+    <w:p xmlns:wp14="http://schemas.microsoft.com/office/word/2010/wordml" wp14:textId="0B9F3610">
+      <w:pPr>
+        <w:pStyle w:val="Heading2"/>
+        <w:spacing w:before="200" w:beforeAutospacing="off" w:after="0" w:afterAutospacing="off" w:line="276" w:lineRule="auto"/>
+      </w:pPr>
+      <w:r>
+        <w:rPr>
+          <w:rFonts w:ascii="Calibri" w:hAnsi="Calibri" w:eastAsia="Calibri" w:cs="Calibri"/>
+          <w:b w:val="1"/>
+          <w:bCs w:val="1"/>
+          <w:noProof w:val="0"/>
+          <w:color w:val="4F81BD" w:themeColor="accent1" w:themeTint="FF" w:themeShade="FF"/>
+          <w:sz w:val="26"/>
+          <w:szCs w:val="26"/>
+          <w:lang w:val="en-US"/>
+        </w:rPr>
+        <w:t>1. Formål</w:t>
+      </w:r>
+    </w:p>
+    <w:p xmlns:wp14="http://schemas.microsoft.com/office/word/2010/wordml" wp14:textId="372ADD2B">
+      <w:pPr>
+        <w:spacing w:before="0" w:beforeAutospacing="off" w:after="200" w:afterAutospacing="off" w:line="276" w:lineRule="auto"/>
+      </w:pPr>
+      <w:r>
+        <w:rPr>
+          <w:rFonts w:ascii="Arial" w:hAnsi="Arial" w:eastAsia="Arial" w:cs="Arial"/>
+          <w:noProof w:val="0"/>
+          <w:sz w:val="22"/>
+          <w:szCs w:val="22"/>
+          <w:lang w:val="en-US"/>
+        </w:rPr>
+        <w:t>Formålet var at konfigurere og teste en VPN-forbindelse fra en Windows-klient til SRV01, så brugeren kan få adgang til det interne netværk og filshares via VPN.</w:t>
+      </w:r>
+    </w:p>
+    <w:p xmlns:wp14="http://schemas.microsoft.com/office/word/2010/wordml" wp14:textId="4C3D5F3C">
+      <w:pPr>
+        <w:pStyle w:val="Heading2"/>
+        <w:spacing w:before="200" w:beforeAutospacing="off" w:after="0" w:afterAutospacing="off" w:line="276" w:lineRule="auto"/>
+      </w:pPr>
+      <w:r>
+        <w:rPr>
+          <w:rFonts w:ascii="Calibri" w:hAnsi="Calibri" w:eastAsia="Calibri" w:cs="Calibri"/>
+          <w:b w:val="1"/>
+          <w:bCs w:val="1"/>
+          <w:noProof w:val="0"/>
+          <w:color w:val="4F81BD" w:themeColor="accent1" w:themeTint="FF" w:themeShade="FF"/>
+          <w:sz w:val="26"/>
+          <w:szCs w:val="26"/>
+          <w:lang w:val="en-US"/>
+        </w:rPr>
+        <w:t>2. Installation af Remote Access</w:t>
+      </w:r>
+    </w:p>
+    <w:p xmlns:wp14="http://schemas.microsoft.com/office/word/2010/wordml" wp14:textId="372FA8EA">
+      <w:pPr>
+        <w:spacing w:before="0" w:beforeAutospacing="off" w:after="200" w:afterAutospacing="off" w:line="276" w:lineRule="auto"/>
+      </w:pPr>
+      <w:r>
+        <w:rPr>
+          <w:rFonts w:ascii="Arial" w:hAnsi="Arial" w:eastAsia="Arial" w:cs="Arial"/>
+          <w:noProof w:val="0"/>
+          <w:sz w:val="22"/>
+          <w:szCs w:val="22"/>
+          <w:lang w:val="en-US"/>
+        </w:rPr>
+        <w:t>På SRV01 blev Server Manager åbnet. Under Manage → Add Roles and Features blev Remote Access installeret. Under Role Services blev DirectAccess and VPN (RAS) samt Routing installeret. Installationen blev gennemført med status “Installation succeeded”.</w:t>
+      </w:r>
+    </w:p>
+    <w:p xmlns:wp14="http://schemas.microsoft.com/office/word/2010/wordml" wp14:textId="482F4DFA">
+      <w:pPr>
+        <w:pStyle w:val="Heading2"/>
+        <w:spacing w:before="200" w:beforeAutospacing="off" w:after="0" w:afterAutospacing="off" w:line="276" w:lineRule="auto"/>
+      </w:pPr>
+      <w:r>
+        <w:rPr>
+          <w:rFonts w:ascii="Calibri" w:hAnsi="Calibri" w:eastAsia="Calibri" w:cs="Calibri"/>
+          <w:b w:val="1"/>
+          <w:bCs w:val="1"/>
+          <w:noProof w:val="0"/>
+          <w:color w:val="4F81BD" w:themeColor="accent1" w:themeTint="FF" w:themeShade="FF"/>
+          <w:sz w:val="26"/>
+          <w:szCs w:val="26"/>
+          <w:lang w:val="en-US"/>
+        </w:rPr>
+        <w:t>3. Installation og konfiguration af RRAS</w:t>
+      </w:r>
+    </w:p>
+    <w:p xmlns:wp14="http://schemas.microsoft.com/office/word/2010/wordml" wp14:textId="250B6324">
+      <w:pPr>
+        <w:spacing w:before="0" w:beforeAutospacing="off" w:after="200" w:afterAutospacing="off" w:line="276" w:lineRule="auto"/>
+      </w:pPr>
+      <w:r>
+        <w:rPr>
+          <w:rFonts w:ascii="Arial" w:hAnsi="Arial" w:eastAsia="Arial" w:cs="Arial"/>
+          <w:noProof w:val="0"/>
+          <w:sz w:val="22"/>
+          <w:szCs w:val="22"/>
+          <w:lang w:val="en-US"/>
+        </w:rPr>
+        <w:t>Efter installationen blev Server Manager → Tools → Routing and Remote Access åbnet. SRV01 blev konfigureret med Configure and Enable Routing and Remote Access. VPN/RAS blev valgt, og RRAS-servicen blev startet.</w:t>
+      </w:r>
+    </w:p>
+    <w:p xmlns:wp14="http://schemas.microsoft.com/office/word/2010/wordml" wp14:textId="50D304C9">
+      <w:pPr>
+        <w:pStyle w:val="Heading2"/>
+        <w:spacing w:before="200" w:beforeAutospacing="off" w:after="0" w:afterAutospacing="off" w:line="276" w:lineRule="auto"/>
+      </w:pPr>
+      <w:r>
+        <w:rPr>
+          <w:rFonts w:ascii="Calibri" w:hAnsi="Calibri" w:eastAsia="Calibri" w:cs="Calibri"/>
+          <w:b w:val="1"/>
+          <w:bCs w:val="1"/>
+          <w:noProof w:val="0"/>
+          <w:color w:val="4F81BD" w:themeColor="accent1" w:themeTint="FF" w:themeShade="FF"/>
+          <w:sz w:val="26"/>
+          <w:szCs w:val="26"/>
+          <w:lang w:val="en-US"/>
+        </w:rPr>
+        <w:t>4. VPN-konfiguration og authentication</w:t>
+      </w:r>
+    </w:p>
+    <w:p xmlns:wp14="http://schemas.microsoft.com/office/word/2010/wordml" wp14:textId="2E9936AE">
+      <w:pPr>
+        <w:spacing w:before="0" w:beforeAutospacing="off" w:after="200" w:afterAutospacing="off" w:line="276" w:lineRule="auto"/>
+      </w:pPr>
+      <w:r>
+        <w:rPr>
+          <w:rFonts w:ascii="Arial" w:hAnsi="Arial" w:eastAsia="Arial" w:cs="Arial"/>
+          <w:noProof w:val="0"/>
+          <w:sz w:val="22"/>
+          <w:szCs w:val="22"/>
+          <w:lang w:val="en-US"/>
+        </w:rPr>
+        <w:t>Under SRV01 → Properties → Security blev Windows Authentication og Windows Accounting anvendt. Under Authentication Methods var EAP og MS-CHAP v2 aktiveret.</w:t>
+      </w:r>
+    </w:p>
+    <w:p xmlns:wp14="http://schemas.microsoft.com/office/word/2010/wordml" wp14:textId="5957D689">
+      <w:pPr>
+        <w:pStyle w:val="Heading2"/>
+        <w:spacing w:before="200" w:beforeAutospacing="off" w:after="0" w:afterAutospacing="off" w:line="276" w:lineRule="auto"/>
+      </w:pPr>
+      <w:r>
+        <w:rPr>
+          <w:rFonts w:ascii="Calibri" w:hAnsi="Calibri" w:eastAsia="Calibri" w:cs="Calibri"/>
+          <w:b w:val="1"/>
+          <w:bCs w:val="1"/>
+          <w:noProof w:val="0"/>
+          <w:color w:val="4F81BD" w:themeColor="accent1" w:themeTint="FF" w:themeShade="FF"/>
+          <w:sz w:val="26"/>
+          <w:szCs w:val="26"/>
+          <w:lang w:val="en-US"/>
+        </w:rPr>
+        <w:t>5. VPN-adressepool</w:t>
+      </w:r>
+    </w:p>
+    <w:p xmlns:wp14="http://schemas.microsoft.com/office/word/2010/wordml" wp14:textId="7167BE51">
+      <w:pPr>
+        <w:spacing w:before="0" w:beforeAutospacing="off" w:after="200" w:afterAutospacing="off" w:line="276" w:lineRule="auto"/>
+      </w:pPr>
+      <w:r>
+        <w:rPr>
+          <w:rFonts w:ascii="Arial" w:hAnsi="Arial" w:eastAsia="Arial" w:cs="Arial"/>
+          <w:noProof w:val="0"/>
+          <w:sz w:val="22"/>
+          <w:szCs w:val="22"/>
+          <w:lang w:val="en-US"/>
+        </w:rPr>
+        <w:t>LAN-netværket var 192.168.10.0/24. Den første VPN-pool lå i samme subnet, hvilket gav et routingproblem. VPN-poolen blev derfor ændret til et separat netværk: 192.168.20.200 – 192.168.20.220. VPN-netværket blev dermed 192.168.20.0/24.</w:t>
+      </w:r>
+    </w:p>
+    <w:p xmlns:wp14="http://schemas.microsoft.com/office/word/2010/wordml" wp14:textId="0D0D4EB9">
+      <w:pPr>
+        <w:pStyle w:val="Heading2"/>
+        <w:spacing w:before="200" w:beforeAutospacing="off" w:after="0" w:afterAutospacing="off" w:line="276" w:lineRule="auto"/>
+      </w:pPr>
+      <w:r>
+        <w:rPr>
+          <w:rFonts w:ascii="Calibri" w:hAnsi="Calibri" w:eastAsia="Calibri" w:cs="Calibri"/>
+          <w:b w:val="1"/>
+          <w:bCs w:val="1"/>
+          <w:noProof w:val="0"/>
+          <w:color w:val="4F81BD" w:themeColor="accent1" w:themeTint="FF" w:themeShade="FF"/>
+          <w:sz w:val="26"/>
+          <w:szCs w:val="26"/>
+          <w:lang w:val="en-US"/>
+        </w:rPr>
+        <w:t>6. Windows Firewall – problem og løsning</w:t>
+      </w:r>
+    </w:p>
+    <w:p xmlns:wp14="http://schemas.microsoft.com/office/word/2010/wordml" wp14:textId="44BB5B37">
+      <w:pPr>
+        <w:spacing w:before="0" w:beforeAutospacing="off" w:after="200" w:afterAutospacing="off" w:line="276" w:lineRule="auto"/>
+      </w:pPr>
+      <w:r>
+        <w:rPr>
+          <w:rFonts w:ascii="Arial" w:hAnsi="Arial" w:eastAsia="Arial" w:cs="Arial"/>
+          <w:noProof w:val="0"/>
+          <w:sz w:val="22"/>
+          <w:szCs w:val="22"/>
+          <w:lang w:val="en-US"/>
+        </w:rPr>
+        <w:t>RRAS viste først, at de nødvendige VPN-porte var blokeret af Windows Firewall. Firewall-profilerne blev kontrolleret med PowerShell. RRAS-firewallreglerne blev fundet deaktiverede og blev aktiveret med kommandoen nedenfor. Efter dette viste RRAS “VPN connectivity: Working properly”.</w:t>
+      </w:r>
+    </w:p>
+    <w:p xmlns:wp14="http://schemas.microsoft.com/office/word/2010/wordml" wp14:textId="4C639065">
+      <w:pPr>
+        <w:pStyle w:val="Heading2"/>
+        <w:spacing w:before="200" w:beforeAutospacing="off" w:after="0" w:afterAutospacing="off" w:line="276" w:lineRule="auto"/>
+      </w:pPr>
+      <w:r>
+        <w:rPr>
+          <w:rFonts w:ascii="Calibri" w:hAnsi="Calibri" w:eastAsia="Calibri" w:cs="Calibri"/>
+          <w:b w:val="1"/>
+          <w:bCs w:val="1"/>
+          <w:noProof w:val="0"/>
+          <w:color w:val="4F81BD" w:themeColor="accent1" w:themeTint="FF" w:themeShade="FF"/>
+          <w:sz w:val="26"/>
+          <w:szCs w:val="26"/>
+          <w:lang w:val="en-US"/>
+        </w:rPr>
+        <w:t>7. PowerShell-kommandoer</w:t>
+      </w:r>
+    </w:p>
+    <w:p xmlns:wp14="http://schemas.microsoft.com/office/word/2010/wordml" wp14:textId="3E3980CB">
+      <w:pPr>
+        <w:spacing w:before="0" w:beforeAutospacing="off" w:after="200" w:afterAutospacing="off" w:line="276" w:lineRule="auto"/>
+      </w:pPr>
+      <w:r>
+        <w:rPr>
+          <w:rFonts w:ascii="Arial" w:hAnsi="Arial" w:eastAsia="Arial" w:cs="Arial"/>
+          <w:noProof w:val="0"/>
+          <w:sz w:val="22"/>
+          <w:szCs w:val="22"/>
+          <w:lang w:val="en-US"/>
+        </w:rPr>
+        <w:t>Kontrol af firewall-profiler:</w:t>
       </w:r>
       <w:r>
         <w:br/>
       </w:r>
+      <w:r>
+        <w:rPr>
+          <w:rFonts w:ascii="Arial" w:hAnsi="Arial" w:eastAsia="Arial" w:cs="Arial"/>
+          <w:noProof w:val="0"/>
+          <w:sz w:val="22"/>
+          <w:szCs w:val="22"/>
+          <w:lang w:val="en-US"/>
+        </w:rPr>
+        <w:t xml:space="preserve"> Get-NetFirewallProfile | Select Name, Enabled</w:t>
+      </w:r>
+    </w:p>
+    <w:p xmlns:wp14="http://schemas.microsoft.com/office/word/2010/wordml" wp14:textId="718C1609">
+      <w:pPr>
+        <w:spacing w:before="0" w:beforeAutospacing="off" w:after="200" w:afterAutospacing="off" w:line="276" w:lineRule="auto"/>
+      </w:pPr>
+      <w:r>
+        <w:rPr>
+          <w:rFonts w:ascii="Arial" w:hAnsi="Arial" w:eastAsia="Arial" w:cs="Arial"/>
+          <w:noProof w:val="0"/>
+          <w:sz w:val="22"/>
+          <w:szCs w:val="22"/>
+          <w:lang w:val="en-US"/>
+        </w:rPr>
+        <w:t>Kontrol af RRAS-regler:</w:t>
+      </w:r>
+      <w:r>
+        <w:br/>
+      </w:r>
+      <w:r>
+        <w:rPr>
+          <w:rFonts w:ascii="Arial" w:hAnsi="Arial" w:eastAsia="Arial" w:cs="Arial"/>
+          <w:noProof w:val="0"/>
+          <w:sz w:val="22"/>
+          <w:szCs w:val="22"/>
+          <w:lang w:val="en-US"/>
+        </w:rPr>
+        <w:t xml:space="preserve"> Get-NetFirewallRule -DisplayGroup "Routing and Remote Access" | Select DisplayName, Enabled, Direction, Action</w:t>
+      </w:r>
+    </w:p>
+    <w:p xmlns:wp14="http://schemas.microsoft.com/office/word/2010/wordml" wp14:textId="6E13C4DB">
+      <w:pPr>
+        <w:spacing w:before="0" w:beforeAutospacing="off" w:after="200" w:afterAutospacing="off" w:line="276" w:lineRule="auto"/>
+      </w:pPr>
+      <w:r>
+        <w:rPr>
+          <w:rFonts w:ascii="Arial" w:hAnsi="Arial" w:eastAsia="Arial" w:cs="Arial"/>
+          <w:noProof w:val="0"/>
+          <w:sz w:val="22"/>
+          <w:szCs w:val="22"/>
+          <w:lang w:val="en-US"/>
+        </w:rPr>
+        <w:t>Aktivering af RRAS-regler:</w:t>
+      </w:r>
+      <w:r>
+        <w:br/>
+      </w:r>
+      <w:r>
+        <w:rPr>
+          <w:rFonts w:ascii="Arial" w:hAnsi="Arial" w:eastAsia="Arial" w:cs="Arial"/>
+          <w:noProof w:val="0"/>
+          <w:sz w:val="22"/>
+          <w:szCs w:val="22"/>
+          <w:lang w:val="en-US"/>
+        </w:rPr>
+        <w:t xml:space="preserve"> Set-NetFirewallRule -DisplayGroup "Routing and Remote Access" -Enabled True</w:t>
+      </w:r>
+    </w:p>
+    <w:p xmlns:wp14="http://schemas.microsoft.com/office/word/2010/wordml" wp14:textId="7BD56E51">
+      <w:pPr>
+        <w:pStyle w:val="Heading2"/>
+        <w:spacing w:before="200" w:beforeAutospacing="off" w:after="0" w:afterAutospacing="off" w:line="276" w:lineRule="auto"/>
+      </w:pPr>
+      <w:r>
+        <w:rPr>
+          <w:rFonts w:ascii="Calibri" w:hAnsi="Calibri" w:eastAsia="Calibri" w:cs="Calibri"/>
+          <w:b w:val="1"/>
+          <w:bCs w:val="1"/>
+          <w:noProof w:val="0"/>
+          <w:color w:val="4F81BD" w:themeColor="accent1" w:themeTint="FF" w:themeShade="FF"/>
+          <w:sz w:val="26"/>
+          <w:szCs w:val="26"/>
+          <w:lang w:val="en-US"/>
+        </w:rPr>
+        <w:t>8. Brugeradgang</w:t>
+      </w:r>
+    </w:p>
+    <w:p xmlns:wp14="http://schemas.microsoft.com/office/word/2010/wordml" wp14:textId="2651DB55">
+      <w:pPr>
+        <w:spacing w:before="0" w:beforeAutospacing="off" w:after="200" w:afterAutospacing="off" w:line="276" w:lineRule="auto"/>
+      </w:pPr>
+      <w:r>
+        <w:rPr>
+          <w:rFonts w:ascii="Arial" w:hAnsi="Arial" w:eastAsia="Arial" w:cs="Arial"/>
+          <w:noProof w:val="0"/>
+          <w:sz w:val="22"/>
+          <w:szCs w:val="22"/>
+          <w:lang w:val="en-US"/>
+        </w:rPr>
+        <w:t>I Active Directory Users and Computers blev den relevante bruger åbnet. Under Dial-in blev Network Access Permission sat til Control access through NPS Network Policy.</w:t>
+      </w:r>
+    </w:p>
+    <w:p xmlns:wp14="http://schemas.microsoft.com/office/word/2010/wordml" wp14:textId="1D585DC5">
+      <w:pPr>
+        <w:pStyle w:val="Heading2"/>
+        <w:spacing w:before="200" w:beforeAutospacing="off" w:after="0" w:afterAutospacing="off" w:line="276" w:lineRule="auto"/>
+      </w:pPr>
+      <w:r>
+        <w:rPr>
+          <w:rFonts w:ascii="Calibri" w:hAnsi="Calibri" w:eastAsia="Calibri" w:cs="Calibri"/>
+          <w:b w:val="1"/>
+          <w:bCs w:val="1"/>
+          <w:noProof w:val="0"/>
+          <w:color w:val="4F81BD" w:themeColor="accent1" w:themeTint="FF" w:themeShade="FF"/>
+          <w:sz w:val="26"/>
+          <w:szCs w:val="26"/>
+          <w:lang w:val="en-US"/>
+        </w:rPr>
+        <w:t>9. Windows-klient – VPN</w:t>
+      </w:r>
+    </w:p>
+    <w:p xmlns:wp14="http://schemas.microsoft.com/office/word/2010/wordml" wp14:textId="12DBBB04">
+      <w:pPr>
+        <w:spacing w:before="0" w:beforeAutospacing="off" w:after="200" w:afterAutospacing="off" w:line="276" w:lineRule="auto"/>
+      </w:pPr>
+      <w:r>
+        <w:rPr>
+          <w:rFonts w:ascii="Arial" w:hAnsi="Arial" w:eastAsia="Arial" w:cs="Arial"/>
+          <w:noProof w:val="0"/>
+          <w:sz w:val="22"/>
+          <w:szCs w:val="22"/>
+          <w:lang w:val="en-US"/>
+        </w:rPr>
+        <w:t>På Windows-klienten blev den indbyggede VPN-klient brugt. Der blev oprettet en VPN-forbindelse med navnet VPN-SRV01. VPN-provider var Windows (built-in), og forbindelsen blev etableret med brugerens domænekonto.</w:t>
+      </w:r>
+    </w:p>
+    <w:p xmlns:wp14="http://schemas.microsoft.com/office/word/2010/wordml" wp14:textId="748506FB">
+      <w:pPr>
+        <w:pStyle w:val="Heading2"/>
+        <w:spacing w:before="200" w:beforeAutospacing="off" w:after="0" w:afterAutospacing="off" w:line="276" w:lineRule="auto"/>
+      </w:pPr>
+      <w:r>
+        <w:rPr>
+          <w:rFonts w:ascii="Calibri" w:hAnsi="Calibri" w:eastAsia="Calibri" w:cs="Calibri"/>
+          <w:b w:val="1"/>
+          <w:bCs w:val="1"/>
+          <w:noProof w:val="0"/>
+          <w:color w:val="4F81BD" w:themeColor="accent1" w:themeTint="FF" w:themeShade="FF"/>
+          <w:sz w:val="26"/>
+          <w:szCs w:val="26"/>
+          <w:lang w:val="en-US"/>
+        </w:rPr>
+        <w:t>10. Group Policy-begrænsning</w:t>
+      </w:r>
+    </w:p>
+    <w:p xmlns:wp14="http://schemas.microsoft.com/office/word/2010/wordml" wp14:textId="4913A39A">
+      <w:pPr>
+        <w:spacing w:before="0" w:beforeAutospacing="off" w:after="200" w:afterAutospacing="off" w:line="276" w:lineRule="auto"/>
+      </w:pPr>
+      <w:r>
+        <w:rPr>
+          <w:rFonts w:ascii="Arial" w:hAnsi="Arial" w:eastAsia="Arial" w:cs="Arial"/>
+          <w:noProof w:val="0"/>
+          <w:sz w:val="22"/>
+          <w:szCs w:val="22"/>
+          <w:lang w:val="en-US"/>
+        </w:rPr>
+        <w:t>På klienten var Prohibit access to Control Panel and PC settings tidligere aktiv. Den blev sat til Disabled, så de nødvendige VPN- og netværksindstillinger kunne åbnes.</w:t>
+      </w:r>
+    </w:p>
+    <w:p xmlns:wp14="http://schemas.microsoft.com/office/word/2010/wordml" wp14:textId="251654B1">
+      <w:pPr>
+        <w:pStyle w:val="Heading2"/>
+        <w:spacing w:before="200" w:beforeAutospacing="off" w:after="0" w:afterAutospacing="off" w:line="276" w:lineRule="auto"/>
+      </w:pPr>
+      <w:r>
+        <w:rPr>
+          <w:rFonts w:ascii="Calibri" w:hAnsi="Calibri" w:eastAsia="Calibri" w:cs="Calibri"/>
+          <w:b w:val="1"/>
+          <w:bCs w:val="1"/>
+          <w:noProof w:val="0"/>
+          <w:color w:val="4F81BD" w:themeColor="accent1" w:themeTint="FF" w:themeShade="FF"/>
+          <w:sz w:val="26"/>
+          <w:szCs w:val="26"/>
+          <w:lang w:val="en-US"/>
+        </w:rPr>
+        <w:t>11. Kontrol af VPN-IP</w:t>
+      </w:r>
+    </w:p>
+    <w:p xmlns:wp14="http://schemas.microsoft.com/office/word/2010/wordml" wp14:textId="6F40170B">
+      <w:pPr>
+        <w:spacing w:before="0" w:beforeAutospacing="off" w:after="200" w:afterAutospacing="off" w:line="276" w:lineRule="auto"/>
+      </w:pPr>
+      <w:r>
+        <w:rPr>
+          <w:rFonts w:ascii="Arial" w:hAnsi="Arial" w:eastAsia="Arial" w:cs="Arial"/>
+          <w:noProof w:val="0"/>
+          <w:sz w:val="22"/>
+          <w:szCs w:val="22"/>
+          <w:lang w:val="en-US"/>
+        </w:rPr>
+        <w:t>VPN-forbindelsen blev kontrolleret med ipconfig. PPP adapter VPN-SRV01 fik en adresse fra VPN-poolen. I den afsluttende test var adressen 192.168.20.201. Ved en tidligere test blev 192.168.20.212 tildelt.</w:t>
+      </w:r>
+    </w:p>
+    <w:p xmlns:wp14="http://schemas.microsoft.com/office/word/2010/wordml" wp14:textId="3B58269A">
+      <w:pPr>
+        <w:pStyle w:val="Heading2"/>
+        <w:spacing w:before="200" w:beforeAutospacing="off" w:after="0" w:afterAutospacing="off" w:line="276" w:lineRule="auto"/>
+      </w:pPr>
+      <w:r>
+        <w:rPr>
+          <w:rFonts w:ascii="Calibri" w:hAnsi="Calibri" w:eastAsia="Calibri" w:cs="Calibri"/>
+          <w:b w:val="1"/>
+          <w:bCs w:val="1"/>
+          <w:noProof w:val="0"/>
+          <w:color w:val="4F81BD" w:themeColor="accent1" w:themeTint="FF" w:themeShade="FF"/>
+          <w:sz w:val="26"/>
+          <w:szCs w:val="26"/>
+          <w:lang w:val="en-US"/>
+        </w:rPr>
+        <w:t>12. Routing og netværkstest</w:t>
+      </w:r>
+    </w:p>
+    <w:p xmlns:wp14="http://schemas.microsoft.com/office/word/2010/wordml" wp14:textId="6C2E7ACD">
+      <w:pPr>
+        <w:spacing w:before="0" w:beforeAutospacing="off" w:after="200" w:afterAutospacing="off" w:line="276" w:lineRule="auto"/>
+      </w:pPr>
+      <w:r>
+        <w:rPr>
+          <w:rFonts w:ascii="Arial" w:hAnsi="Arial" w:eastAsia="Arial" w:cs="Arial"/>
+          <w:noProof w:val="0"/>
+          <w:sz w:val="22"/>
+          <w:szCs w:val="22"/>
+          <w:lang w:val="en-US"/>
+        </w:rPr>
+        <w:t>Routing blev kontrolleret med route print. Forbindelsen til SRV01 blev testet med tracert -d 192.168.10.10 og ping 192.168.10.10. Ping-testen gav 0 % packet loss.</w:t>
+      </w:r>
+    </w:p>
+    <w:p xmlns:wp14="http://schemas.microsoft.com/office/word/2010/wordml" wp14:textId="3C5C4FA2">
+      <w:pPr>
+        <w:pStyle w:val="Heading2"/>
+        <w:spacing w:before="200" w:beforeAutospacing="off" w:after="0" w:afterAutospacing="off" w:line="276" w:lineRule="auto"/>
+      </w:pPr>
+      <w:r>
+        <w:rPr>
+          <w:rFonts w:ascii="Calibri" w:hAnsi="Calibri" w:eastAsia="Calibri" w:cs="Calibri"/>
+          <w:b w:val="1"/>
+          <w:bCs w:val="1"/>
+          <w:noProof w:val="0"/>
+          <w:color w:val="4F81BD" w:themeColor="accent1" w:themeTint="FF" w:themeShade="FF"/>
+          <w:sz w:val="26"/>
+          <w:szCs w:val="26"/>
+          <w:lang w:val="en-US"/>
+        </w:rPr>
+        <w:t>13. Test af filshare</w:t>
+      </w:r>
+    </w:p>
+    <w:p xmlns:wp14="http://schemas.microsoft.com/office/word/2010/wordml" wp14:textId="6B607619">
+      <w:pPr>
+        <w:spacing w:before="0" w:beforeAutospacing="off" w:after="200" w:afterAutospacing="off" w:line="276" w:lineRule="auto"/>
+      </w:pPr>
+      <w:r>
+        <w:rPr>
+          <w:rFonts w:ascii="Arial" w:hAnsi="Arial" w:eastAsia="Arial" w:cs="Arial"/>
+          <w:noProof w:val="0"/>
+          <w:sz w:val="22"/>
+          <w:szCs w:val="22"/>
+          <w:lang w:val="en-US"/>
+        </w:rPr>
+        <w:t xml:space="preserve">SMB-adgang blev testet via </w:t>
+      </w:r>
+      <w:hyperlink r:id="R33b4df5d0e5748db">
+        <w:r>
+          <w:rPr>
+            <w:rStyle w:val="Hyperlink"/>
+            <w:noProof w:val="0"/>
+            <w:lang w:val="en-US"/>
+          </w:rPr>
+          <w:t>\\SRV01\Shares</w:t>
+        </w:r>
+      </w:hyperlink>
+      <w:r>
+        <w:rPr>
+          <w:rFonts w:ascii="Arial" w:hAnsi="Arial" w:eastAsia="Arial" w:cs="Arial"/>
+          <w:noProof w:val="0"/>
+          <w:sz w:val="22"/>
+          <w:szCs w:val="22"/>
+          <w:lang w:val="en-US"/>
+        </w:rPr>
+        <w:t xml:space="preserve"> og </w:t>
+      </w:r>
+      <w:hyperlink r:id="R92aa2b8a2357483c">
+        <w:r>
+          <w:rPr>
+            <w:rStyle w:val="Hyperlink"/>
+            <w:noProof w:val="0"/>
+            <w:lang w:val="en-US"/>
+          </w:rPr>
+          <w:t>\\SRV01\Shares\users\ao</w:t>
+        </w:r>
+      </w:hyperlink>
+      <w:r>
+        <w:rPr>
+          <w:rFonts w:ascii="Arial" w:hAnsi="Arial" w:eastAsia="Arial" w:cs="Arial"/>
+          <w:noProof w:val="0"/>
+          <w:sz w:val="22"/>
+          <w:szCs w:val="22"/>
+          <w:lang w:val="en-US"/>
+        </w:rPr>
+        <w:t>. Brugeren kunne åbne mappen og oprette en fil, hvilket bekræftede skriveadgang.</w:t>
+      </w:r>
+    </w:p>
+    <w:p xmlns:wp14="http://schemas.microsoft.com/office/word/2010/wordml" wp14:textId="422D804B">
+      <w:pPr>
+        <w:pStyle w:val="Heading2"/>
+        <w:spacing w:before="200" w:beforeAutospacing="off" w:after="0" w:afterAutospacing="off" w:line="276" w:lineRule="auto"/>
+      </w:pPr>
+      <w:r>
+        <w:rPr>
+          <w:rFonts w:ascii="Calibri" w:hAnsi="Calibri" w:eastAsia="Calibri" w:cs="Calibri"/>
+          <w:b w:val="1"/>
+          <w:bCs w:val="1"/>
+          <w:noProof w:val="0"/>
+          <w:color w:val="4F81BD" w:themeColor="accent1" w:themeTint="FF" w:themeShade="FF"/>
+          <w:sz w:val="26"/>
+          <w:szCs w:val="26"/>
+          <w:lang w:val="en-US"/>
+        </w:rPr>
+        <w:t>14. IP-adresser</w:t>
+      </w:r>
+    </w:p>
+    <w:p xmlns:wp14="http://schemas.microsoft.com/office/word/2010/wordml" wp14:textId="15433FEE">
+      <w:pPr>
+        <w:spacing w:before="0" w:beforeAutospacing="off" w:after="200" w:afterAutospacing="off" w:line="276" w:lineRule="auto"/>
+      </w:pPr>
+      <w:r>
+        <w:rPr>
+          <w:rFonts w:ascii="Arial" w:hAnsi="Arial" w:eastAsia="Arial" w:cs="Arial"/>
+          <w:noProof w:val="0"/>
+          <w:sz w:val="22"/>
+          <w:szCs w:val="22"/>
+          <w:lang w:val="en-US"/>
+        </w:rPr>
+        <w:t>SRV01 – intern IP: 192.168.10.10</w:t>
+      </w:r>
+      <w:r>
+        <w:br/>
+      </w:r>
+      <w:r>
+        <w:rPr>
+          <w:rFonts w:ascii="Arial" w:hAnsi="Arial" w:eastAsia="Arial" w:cs="Arial"/>
+          <w:noProof w:val="0"/>
+          <w:sz w:val="22"/>
+          <w:szCs w:val="22"/>
+          <w:lang w:val="en-US"/>
+        </w:rPr>
+        <w:t xml:space="preserve"> LAN-netværk: 192.168.10.0/24</w:t>
+      </w:r>
+      <w:r>
+        <w:br/>
+      </w:r>
+      <w:r>
+        <w:rPr>
+          <w:rFonts w:ascii="Arial" w:hAnsi="Arial" w:eastAsia="Arial" w:cs="Arial"/>
+          <w:noProof w:val="0"/>
+          <w:sz w:val="22"/>
+          <w:szCs w:val="22"/>
+          <w:lang w:val="en-US"/>
+        </w:rPr>
+        <w:t xml:space="preserve"> Default Gateway: 192.168.10.1</w:t>
+      </w:r>
+      <w:r>
+        <w:br/>
+      </w:r>
+      <w:r>
+        <w:rPr>
+          <w:rFonts w:ascii="Arial" w:hAnsi="Arial" w:eastAsia="Arial" w:cs="Arial"/>
+          <w:noProof w:val="0"/>
+          <w:sz w:val="22"/>
+          <w:szCs w:val="22"/>
+          <w:lang w:val="en-US"/>
+        </w:rPr>
+        <w:t xml:space="preserve"> VPN-netværk: 192.168.20.0/24</w:t>
+      </w:r>
+      <w:r>
+        <w:br/>
+      </w:r>
+      <w:r>
+        <w:rPr>
+          <w:rFonts w:ascii="Arial" w:hAnsi="Arial" w:eastAsia="Arial" w:cs="Arial"/>
+          <w:noProof w:val="0"/>
+          <w:sz w:val="22"/>
+          <w:szCs w:val="22"/>
+          <w:lang w:val="en-US"/>
+        </w:rPr>
+        <w:t xml:space="preserve"> VPN-pool: 192.168.20.200 – 192.168.20.220</w:t>
+      </w:r>
+      <w:r>
+        <w:br/>
+      </w:r>
+      <w:r>
+        <w:rPr>
+          <w:rFonts w:ascii="Arial" w:hAnsi="Arial" w:eastAsia="Arial" w:cs="Arial"/>
+          <w:noProof w:val="0"/>
+          <w:sz w:val="22"/>
+          <w:szCs w:val="22"/>
+          <w:lang w:val="en-US"/>
+        </w:rPr>
+        <w:t xml:space="preserve"> VPN-klient – afsluttende test: 192.168.20.201</w:t>
+      </w:r>
+      <w:r>
+        <w:br/>
+      </w:r>
+      <w:r>
+        <w:rPr>
+          <w:rFonts w:ascii="Arial" w:hAnsi="Arial" w:eastAsia="Arial" w:cs="Arial"/>
+          <w:noProof w:val="0"/>
+          <w:sz w:val="22"/>
+          <w:szCs w:val="22"/>
+          <w:lang w:val="en-US"/>
+        </w:rPr>
+        <w:t xml:space="preserve"> VPN-klient – tidligere test: 192.168.20.212</w:t>
+      </w:r>
+    </w:p>
+    <w:p xmlns:wp14="http://schemas.microsoft.com/office/word/2010/wordml" wp14:textId="7B155279">
+      <w:pPr>
+        <w:pStyle w:val="Heading2"/>
+        <w:spacing w:before="200" w:beforeAutospacing="off" w:after="0" w:afterAutospacing="off" w:line="276" w:lineRule="auto"/>
+      </w:pPr>
+      <w:r>
+        <w:rPr>
+          <w:rFonts w:ascii="Calibri" w:hAnsi="Calibri" w:eastAsia="Calibri" w:cs="Calibri"/>
+          <w:b w:val="1"/>
+          <w:bCs w:val="1"/>
+          <w:noProof w:val="0"/>
+          <w:color w:val="4F81BD" w:themeColor="accent1" w:themeTint="FF" w:themeShade="FF"/>
+          <w:sz w:val="26"/>
+          <w:szCs w:val="26"/>
+          <w:lang w:val="en-US"/>
+        </w:rPr>
+        <w:t>15. Samlet resultat</w:t>
+      </w:r>
+    </w:p>
+    <w:p xmlns:wp14="http://schemas.microsoft.com/office/word/2010/wordml" wp14:textId="0E363C72">
+      <w:pPr>
+        <w:spacing w:before="0" w:beforeAutospacing="off" w:after="200" w:afterAutospacing="off" w:line="276" w:lineRule="auto"/>
+      </w:pPr>
+      <w:r>
+        <w:rPr>
+          <w:rFonts w:ascii="Arial" w:hAnsi="Arial" w:eastAsia="Arial" w:cs="Arial"/>
+          <w:noProof w:val="0"/>
+          <w:sz w:val="22"/>
+          <w:szCs w:val="22"/>
+          <w:lang w:val="en-US"/>
+        </w:rPr>
+        <w:t>VPN-forbindelsen fungerer. Klienten kan oprette VPN-forbindelse, modtage en IP-adresse fra VPN-poolen, nå SRV01, kommunikere med serveren via ping og få adgang til SMB-shares og brugerens mappe. Den vigtigste fejl under opsætningen var de deaktiverede Routing and Remote Access-firewallregler samt det oprindelige overlap mellem LAN- og VPN-subnettet.</w:t>
+      </w:r>
+    </w:p>
+    <w:p xmlns:wp14="http://schemas.microsoft.com/office/word/2010/wordml" wp14:textId="59CCB784">
+      <w:pPr/>
     </w:p>
     <w:p xmlns:wp14="http://schemas.microsoft.com/office/word/2010/wordml" wp14:textId="77777777">
       <w:pPr>
@@ -7238,6 +7918,1768 @@
     </w:p>
     <w:p>
       <w:pPr>
+        <w:pStyle w:val="Heading1"/>
+      </w:pPr>
+      <w:r>
+        <w:rPr>
+          <w:noProof w:val="0"/>
+          <w:lang w:val="de-DE"/>
+        </w:rPr>
+        <w:t xml:space="preserve">7. Installation </w:t>
+      </w:r>
+      <w:r>
+        <w:rPr>
+          <w:noProof w:val="0"/>
+          <w:lang w:val="de-DE"/>
+        </w:rPr>
+        <w:t>af</w:t>
+      </w:r>
+      <w:r>
+        <w:rPr>
+          <w:noProof w:val="0"/>
+          <w:lang w:val="de-DE"/>
+        </w:rPr>
+        <w:t xml:space="preserve"> LibreOffice via Startup </w:t>
+      </w:r>
+      <w:r>
+        <w:rPr>
+          <w:noProof w:val="0"/>
+          <w:lang w:val="de-DE"/>
+        </w:rPr>
+        <w:t>Script</w:t>
+      </w:r>
+    </w:p>
+    <w:p>
+      <w:pPr>
+        <w:pStyle w:val="Normal"/>
+        <w:rPr>
+          <w:noProof w:val="0"/>
+          <w:lang w:val="de-DE"/>
+        </w:rPr>
+      </w:pPr>
+    </w:p>
+    <w:p>
+      <w:pPr>
+        <w:spacing w:before="0" w:beforeAutospacing="off" w:after="200" w:afterAutospacing="off" w:line="276" w:lineRule="auto"/>
+      </w:pPr>
+      <w:r>
+        <w:rPr>
+          <w:rFonts w:ascii="Arial" w:hAnsi="Arial" w:eastAsia="Arial" w:cs="Arial"/>
+          <w:b w:val="1"/>
+          <w:bCs w:val="1"/>
+          <w:noProof w:val="0"/>
+          <w:sz w:val="24"/>
+          <w:szCs w:val="24"/>
+          <w:lang w:val="en-US"/>
+        </w:rPr>
+        <w:t>Formål</w:t>
+      </w:r>
+    </w:p>
+    <w:p>
+      <w:pPr>
+        <w:spacing w:before="0" w:beforeAutospacing="off" w:after="200" w:afterAutospacing="off" w:line="276" w:lineRule="auto"/>
+      </w:pPr>
+      <w:r>
+        <w:rPr>
+          <w:rFonts w:ascii="Arial" w:hAnsi="Arial" w:eastAsia="Arial" w:cs="Arial"/>
+          <w:noProof w:val="0"/>
+          <w:sz w:val="21"/>
+          <w:szCs w:val="21"/>
+          <w:lang w:val="en-US"/>
+        </w:rPr>
+        <w:t>Formålet er at installere LibreOffice automatisk på klientcomputere i domænet ved hjælp af et Startup Script i Group Policy. Installationen udføres under computerens opstart og kræver derfor ikke, at en bruger starter installationen manuelt.</w:t>
+      </w:r>
+    </w:p>
+    <w:p>
+      <w:pPr>
+        <w:spacing w:before="0" w:beforeAutospacing="off" w:after="200" w:afterAutospacing="off" w:line="276" w:lineRule="auto"/>
+      </w:pPr>
+      <w:r>
+        <w:rPr>
+          <w:rFonts w:ascii="Arial" w:hAnsi="Arial" w:eastAsia="Arial" w:cs="Arial"/>
+          <w:b w:val="1"/>
+          <w:bCs w:val="1"/>
+          <w:noProof w:val="0"/>
+          <w:sz w:val="24"/>
+          <w:szCs w:val="24"/>
+          <w:lang w:val="en-US"/>
+        </w:rPr>
+        <w:t>1. Placering af installationsfilen</w:t>
+      </w:r>
+    </w:p>
+    <w:p>
+      <w:pPr>
+        <w:spacing w:before="0" w:beforeAutospacing="off" w:after="200" w:afterAutospacing="off" w:line="276" w:lineRule="auto"/>
+      </w:pPr>
+      <w:r>
+        <w:rPr>
+          <w:rFonts w:ascii="Arial" w:hAnsi="Arial" w:eastAsia="Arial" w:cs="Arial"/>
+          <w:noProof w:val="0"/>
+          <w:sz w:val="21"/>
+          <w:szCs w:val="21"/>
+          <w:lang w:val="en-US"/>
+        </w:rPr>
+        <w:t>LibreOffice MSI-filen er placeret på serverens netværksshare:</w:t>
+      </w:r>
+      <w:r>
+        <w:br/>
+      </w:r>
+      <w:r>
+        <w:rPr>
+          <w:rFonts w:ascii="Arial" w:hAnsi="Arial" w:eastAsia="Arial" w:cs="Arial"/>
+          <w:noProof w:val="0"/>
+          <w:sz w:val="21"/>
+          <w:szCs w:val="21"/>
+          <w:lang w:val="en-US"/>
+        </w:rPr>
+        <w:t xml:space="preserve"> </w:t>
+      </w:r>
+      <w:r>
+        <w:br/>
+      </w:r>
+      <w:r>
+        <w:fldChar w:fldCharType="begin"/>
+      </w:r>
+      <w:r>
+        <w:instrText xml:space="preserve">HYPERLINK "file:///\\SRV01\software\libreoffice\LibreOffice_26.2.5_Win_x86-64.msi" </w:instrText>
+      </w:r>
+      <w:r>
+        <w:fldChar w:fldCharType="separate"/>
+      </w:r>
+      <w:r>
+        <w:rPr>
+          <w:rStyle w:val="Hyperlink"/>
+          <w:noProof w:val="0"/>
+          <w:lang w:val="en-US"/>
+        </w:rPr>
+        <w:t>\\SRV01\software\libreoffice\LibreOffice_26.2.5_Win_x86-64.msi</w:t>
+      </w:r>
+      <w:r>
+        <w:fldChar w:fldCharType="end"/>
+      </w:r>
+      <w:r>
+        <w:br/>
+      </w:r>
+      <w:r>
+        <w:rPr>
+          <w:rFonts w:ascii="Arial" w:hAnsi="Arial" w:eastAsia="Arial" w:cs="Arial"/>
+          <w:noProof w:val="0"/>
+          <w:sz w:val="21"/>
+          <w:szCs w:val="21"/>
+          <w:lang w:val="en-US"/>
+        </w:rPr>
+        <w:t xml:space="preserve"> </w:t>
+      </w:r>
+      <w:r>
+        <w:br/>
+      </w:r>
+      <w:r>
+        <w:rPr>
+          <w:rFonts w:ascii="Arial" w:hAnsi="Arial" w:eastAsia="Arial" w:cs="Arial"/>
+          <w:noProof w:val="0"/>
+          <w:sz w:val="21"/>
+          <w:szCs w:val="21"/>
+          <w:lang w:val="en-US"/>
+        </w:rPr>
+        <w:t>MSI-filen skal være placeret på en netværksplacering, som klientcomputerne kan tilgå. Der anvendes en UNC-sti i stedet for et mapped network drive.</w:t>
+      </w:r>
+    </w:p>
+    <w:p>
+      <w:pPr>
+        <w:spacing w:before="0" w:beforeAutospacing="off" w:after="200" w:afterAutospacing="off" w:line="276" w:lineRule="auto"/>
+      </w:pPr>
+      <w:r>
+        <w:rPr>
+          <w:rFonts w:ascii="Arial" w:hAnsi="Arial" w:eastAsia="Arial" w:cs="Arial"/>
+          <w:b w:val="1"/>
+          <w:bCs w:val="1"/>
+          <w:noProof w:val="0"/>
+          <w:sz w:val="24"/>
+          <w:szCs w:val="24"/>
+          <w:lang w:val="en-US"/>
+        </w:rPr>
+        <w:t>2. Åbn Group Policy Management Editor</w:t>
+      </w:r>
+    </w:p>
+    <w:p>
+      <w:pPr>
+        <w:spacing w:before="0" w:beforeAutospacing="off" w:after="200" w:afterAutospacing="off" w:line="276" w:lineRule="auto"/>
+      </w:pPr>
+      <w:r>
+        <w:rPr>
+          <w:rFonts w:ascii="Arial" w:hAnsi="Arial" w:eastAsia="Arial" w:cs="Arial"/>
+          <w:noProof w:val="0"/>
+          <w:sz w:val="21"/>
+          <w:szCs w:val="21"/>
+          <w:lang w:val="en-US"/>
+        </w:rPr>
+        <w:t>Den eksisterende GPO blev åbnet:</w:t>
+      </w:r>
+      <w:r>
+        <w:br/>
+      </w:r>
+      <w:r>
+        <w:rPr>
+          <w:rFonts w:ascii="Arial" w:hAnsi="Arial" w:eastAsia="Arial" w:cs="Arial"/>
+          <w:noProof w:val="0"/>
+          <w:sz w:val="21"/>
+          <w:szCs w:val="21"/>
+          <w:lang w:val="en-US"/>
+        </w:rPr>
+        <w:t xml:space="preserve"> </w:t>
+      </w:r>
+      <w:r>
+        <w:br/>
+      </w:r>
+      <w:r>
+        <w:rPr>
+          <w:rFonts w:ascii="Arial" w:hAnsi="Arial" w:eastAsia="Arial" w:cs="Arial"/>
+          <w:noProof w:val="0"/>
+          <w:sz w:val="21"/>
+          <w:szCs w:val="21"/>
+          <w:lang w:val="en-US"/>
+        </w:rPr>
+        <w:t>GPO-software-Deployment</w:t>
+      </w:r>
+      <w:r>
+        <w:br/>
+      </w:r>
+      <w:r>
+        <w:rPr>
+          <w:rFonts w:ascii="Arial" w:hAnsi="Arial" w:eastAsia="Arial" w:cs="Arial"/>
+          <w:noProof w:val="0"/>
+          <w:sz w:val="21"/>
+          <w:szCs w:val="21"/>
+          <w:lang w:val="en-US"/>
+        </w:rPr>
+        <w:t xml:space="preserve"> </w:t>
+      </w:r>
+      <w:r>
+        <w:br/>
+      </w:r>
+      <w:r>
+        <w:rPr>
+          <w:rFonts w:ascii="Arial" w:hAnsi="Arial" w:eastAsia="Arial" w:cs="Arial"/>
+          <w:noProof w:val="0"/>
+          <w:sz w:val="21"/>
+          <w:szCs w:val="21"/>
+          <w:lang w:val="en-US"/>
+        </w:rPr>
+        <w:t>Derefter navigeres til:</w:t>
+      </w:r>
+      <w:r>
+        <w:br/>
+      </w:r>
+      <w:r>
+        <w:rPr>
+          <w:rFonts w:ascii="Arial" w:hAnsi="Arial" w:eastAsia="Arial" w:cs="Arial"/>
+          <w:noProof w:val="0"/>
+          <w:sz w:val="21"/>
+          <w:szCs w:val="21"/>
+          <w:lang w:val="en-US"/>
+        </w:rPr>
+        <w:t xml:space="preserve"> </w:t>
+      </w:r>
+      <w:r>
+        <w:br/>
+      </w:r>
+      <w:r>
+        <w:rPr>
+          <w:rFonts w:ascii="Arial" w:hAnsi="Arial" w:eastAsia="Arial" w:cs="Arial"/>
+          <w:noProof w:val="0"/>
+          <w:sz w:val="21"/>
+          <w:szCs w:val="21"/>
+          <w:lang w:val="en-US"/>
+        </w:rPr>
+        <w:t>Computer Configuration</w:t>
+      </w:r>
+      <w:r>
+        <w:br/>
+      </w:r>
+      <w:r>
+        <w:rPr>
+          <w:rFonts w:ascii="Arial" w:hAnsi="Arial" w:eastAsia="Arial" w:cs="Arial"/>
+          <w:noProof w:val="0"/>
+          <w:sz w:val="21"/>
+          <w:szCs w:val="21"/>
+          <w:lang w:val="en-US"/>
+        </w:rPr>
+        <w:t xml:space="preserve">     → Policies</w:t>
+      </w:r>
+      <w:r>
+        <w:br/>
+      </w:r>
+      <w:r>
+        <w:rPr>
+          <w:rFonts w:ascii="Arial" w:hAnsi="Arial" w:eastAsia="Arial" w:cs="Arial"/>
+          <w:noProof w:val="0"/>
+          <w:sz w:val="21"/>
+          <w:szCs w:val="21"/>
+          <w:lang w:val="en-US"/>
+        </w:rPr>
+        <w:t xml:space="preserve">         → Windows Settings</w:t>
+      </w:r>
+      <w:r>
+        <w:br/>
+      </w:r>
+      <w:r>
+        <w:rPr>
+          <w:rFonts w:ascii="Arial" w:hAnsi="Arial" w:eastAsia="Arial" w:cs="Arial"/>
+          <w:noProof w:val="0"/>
+          <w:sz w:val="21"/>
+          <w:szCs w:val="21"/>
+          <w:lang w:val="en-US"/>
+        </w:rPr>
+        <w:t xml:space="preserve">             → Scripts (Startup/Shutdown)</w:t>
+      </w:r>
+      <w:r>
+        <w:br/>
+      </w:r>
+      <w:r>
+        <w:rPr>
+          <w:rFonts w:ascii="Arial" w:hAnsi="Arial" w:eastAsia="Arial" w:cs="Arial"/>
+          <w:noProof w:val="0"/>
+          <w:sz w:val="21"/>
+          <w:szCs w:val="21"/>
+          <w:lang w:val="en-US"/>
+        </w:rPr>
+        <w:t xml:space="preserve">                 → Startup</w:t>
+      </w:r>
+    </w:p>
+    <w:p>
+      <w:pPr>
+        <w:spacing w:before="0" w:beforeAutospacing="off" w:after="200" w:afterAutospacing="off" w:line="276" w:lineRule="auto"/>
+      </w:pPr>
+      <w:r>
+        <w:rPr>
+          <w:rFonts w:ascii="Arial" w:hAnsi="Arial" w:eastAsia="Arial" w:cs="Arial"/>
+          <w:b w:val="1"/>
+          <w:bCs w:val="1"/>
+          <w:noProof w:val="0"/>
+          <w:sz w:val="24"/>
+          <w:szCs w:val="24"/>
+          <w:lang w:val="en-US"/>
+        </w:rPr>
+        <w:t>3. Opret Startup Script</w:t>
+      </w:r>
+    </w:p>
+    <w:p>
+      <w:pPr>
+        <w:spacing w:before="0" w:beforeAutospacing="off" w:after="200" w:afterAutospacing="off" w:line="276" w:lineRule="auto"/>
+      </w:pPr>
+      <w:r>
+        <w:rPr>
+          <w:rFonts w:ascii="Arial" w:hAnsi="Arial" w:eastAsia="Arial" w:cs="Arial"/>
+          <w:noProof w:val="0"/>
+          <w:sz w:val="21"/>
+          <w:szCs w:val="21"/>
+          <w:lang w:val="en-US"/>
+        </w:rPr>
+        <w:t>Under Startup Properties vælges:</w:t>
+      </w:r>
+      <w:r>
+        <w:br/>
+      </w:r>
+      <w:r>
+        <w:rPr>
+          <w:rFonts w:ascii="Arial" w:hAnsi="Arial" w:eastAsia="Arial" w:cs="Arial"/>
+          <w:noProof w:val="0"/>
+          <w:sz w:val="21"/>
+          <w:szCs w:val="21"/>
+          <w:lang w:val="en-US"/>
+        </w:rPr>
+        <w:t xml:space="preserve"> </w:t>
+      </w:r>
+      <w:r>
+        <w:br/>
+      </w:r>
+      <w:r>
+        <w:rPr>
+          <w:rFonts w:ascii="Arial" w:hAnsi="Arial" w:eastAsia="Arial" w:cs="Arial"/>
+          <w:noProof w:val="0"/>
+          <w:sz w:val="21"/>
+          <w:szCs w:val="21"/>
+          <w:lang w:val="en-US"/>
+        </w:rPr>
+        <w:t>Show Files...</w:t>
+      </w:r>
+      <w:r>
+        <w:br/>
+      </w:r>
+      <w:r>
+        <w:rPr>
+          <w:rFonts w:ascii="Arial" w:hAnsi="Arial" w:eastAsia="Arial" w:cs="Arial"/>
+          <w:noProof w:val="0"/>
+          <w:sz w:val="21"/>
+          <w:szCs w:val="21"/>
+          <w:lang w:val="en-US"/>
+        </w:rPr>
+        <w:t xml:space="preserve"> </w:t>
+      </w:r>
+      <w:r>
+        <w:br/>
+      </w:r>
+      <w:r>
+        <w:rPr>
+          <w:rFonts w:ascii="Arial" w:hAnsi="Arial" w:eastAsia="Arial" w:cs="Arial"/>
+          <w:noProof w:val="0"/>
+          <w:sz w:val="21"/>
+          <w:szCs w:val="21"/>
+          <w:lang w:val="en-US"/>
+        </w:rPr>
+        <w:t>I den viste mappe oprettes følgende fil:</w:t>
+      </w:r>
+      <w:r>
+        <w:br/>
+      </w:r>
+      <w:r>
+        <w:rPr>
+          <w:rFonts w:ascii="Arial" w:hAnsi="Arial" w:eastAsia="Arial" w:cs="Arial"/>
+          <w:noProof w:val="0"/>
+          <w:sz w:val="21"/>
+          <w:szCs w:val="21"/>
+          <w:lang w:val="en-US"/>
+        </w:rPr>
+        <w:t xml:space="preserve"> </w:t>
+      </w:r>
+      <w:r>
+        <w:br/>
+      </w:r>
+      <w:r>
+        <w:rPr>
+          <w:rFonts w:ascii="Arial" w:hAnsi="Arial" w:eastAsia="Arial" w:cs="Arial"/>
+          <w:noProof w:val="0"/>
+          <w:sz w:val="21"/>
+          <w:szCs w:val="21"/>
+          <w:lang w:val="en-US"/>
+        </w:rPr>
+        <w:t>Install-LibreOffice.cmd</w:t>
+      </w:r>
+    </w:p>
+    <w:p>
+      <w:pPr>
+        <w:spacing w:before="0" w:beforeAutospacing="off" w:after="200" w:afterAutospacing="off" w:line="276" w:lineRule="auto"/>
+      </w:pPr>
+      <w:r>
+        <w:rPr>
+          <w:rFonts w:ascii="Arial" w:hAnsi="Arial" w:eastAsia="Arial" w:cs="Arial"/>
+          <w:b w:val="1"/>
+          <w:bCs w:val="1"/>
+          <w:noProof w:val="0"/>
+          <w:sz w:val="24"/>
+          <w:szCs w:val="24"/>
+          <w:lang w:val="en-US"/>
+        </w:rPr>
+        <w:t>4. Indhold af scriptet</w:t>
+      </w:r>
+    </w:p>
+    <w:p>
+      <w:pPr>
+        <w:spacing w:before="0" w:beforeAutospacing="off" w:after="200" w:afterAutospacing="off" w:line="276" w:lineRule="auto"/>
+      </w:pPr>
+      <w:r>
+        <w:rPr>
+          <w:rFonts w:ascii="Arial" w:hAnsi="Arial" w:eastAsia="Arial" w:cs="Arial"/>
+          <w:noProof w:val="0"/>
+          <w:sz w:val="21"/>
+          <w:szCs w:val="21"/>
+          <w:lang w:val="en-US"/>
+        </w:rPr>
+        <w:t>Filen Install-LibreOffice.cmd indeholder:</w:t>
+      </w:r>
+    </w:p>
+    <w:p>
+      <w:pPr>
+        <w:spacing w:before="0" w:beforeAutospacing="off" w:after="200" w:afterAutospacing="off" w:line="276" w:lineRule="auto"/>
+        <w:ind w:left="360" w:right="0"/>
+      </w:pPr>
+      <w:r>
+        <w:rPr>
+          <w:rFonts w:ascii="Courier New" w:hAnsi="Courier New" w:eastAsia="Courier New" w:cs="Courier New"/>
+          <w:noProof w:val="0"/>
+          <w:sz w:val="18"/>
+          <w:szCs w:val="18"/>
+          <w:lang w:val="en-US"/>
+        </w:rPr>
+        <w:t>@echo off</w:t>
+      </w:r>
+      <w:r>
+        <w:br/>
+      </w:r>
+      <w:r>
+        <w:rPr>
+          <w:rFonts w:ascii="Courier New" w:hAnsi="Courier New" w:eastAsia="Courier New" w:cs="Courier New"/>
+          <w:noProof w:val="0"/>
+          <w:sz w:val="18"/>
+          <w:szCs w:val="18"/>
+          <w:lang w:val="en-US"/>
+        </w:rPr>
+        <w:t xml:space="preserve"> msiexec.exe /i "</w:t>
+      </w:r>
+      <w:r>
+        <w:fldChar w:fldCharType="begin"/>
+      </w:r>
+      <w:r>
+        <w:instrText xml:space="preserve">HYPERLINK "file:///\\SRV01\software\libreoffice\LibreOffice_26.2.5_Win_x86-64.msi" </w:instrText>
+      </w:r>
+      <w:r>
+        <w:fldChar w:fldCharType="separate"/>
+      </w:r>
+      <w:r>
+        <w:rPr>
+          <w:rStyle w:val="Hyperlink"/>
+          <w:noProof w:val="0"/>
+          <w:lang w:val="en-US"/>
+        </w:rPr>
+        <w:t>\\SRV01\software\libreoffice\LibreOffice_26.2.5_Win_x86-64.msi</w:t>
+      </w:r>
+      <w:r>
+        <w:fldChar w:fldCharType="end"/>
+      </w:r>
+      <w:r>
+        <w:rPr>
+          <w:rFonts w:ascii="Courier New" w:hAnsi="Courier New" w:eastAsia="Courier New" w:cs="Courier New"/>
+          <w:noProof w:val="0"/>
+          <w:sz w:val="18"/>
+          <w:szCs w:val="18"/>
+          <w:lang w:val="en-US"/>
+        </w:rPr>
+        <w:t>" /qn /norestart</w:t>
+      </w:r>
+      <w:r>
+        <w:br/>
+      </w:r>
+      <w:r>
+        <w:rPr>
+          <w:rFonts w:ascii="Courier New" w:hAnsi="Courier New" w:eastAsia="Courier New" w:cs="Courier New"/>
+          <w:noProof w:val="0"/>
+          <w:sz w:val="18"/>
+          <w:szCs w:val="18"/>
+          <w:lang w:val="en-US"/>
+        </w:rPr>
+        <w:t xml:space="preserve"> exit /b 0</w:t>
+      </w:r>
+    </w:p>
+    <w:p>
+      <w:pPr>
+        <w:spacing w:before="0" w:beforeAutospacing="off" w:after="200" w:afterAutospacing="off" w:line="276" w:lineRule="auto"/>
+      </w:pPr>
+      <w:r>
+        <w:rPr>
+          <w:rFonts w:ascii="Arial" w:hAnsi="Arial" w:eastAsia="Arial" w:cs="Arial"/>
+          <w:b w:val="1"/>
+          <w:bCs w:val="1"/>
+          <w:noProof w:val="0"/>
+          <w:sz w:val="24"/>
+          <w:szCs w:val="24"/>
+          <w:lang w:val="en-US"/>
+        </w:rPr>
+        <w:t>5. Tilføj scriptet til Startup</w:t>
+      </w:r>
+    </w:p>
+    <w:p>
+      <w:pPr>
+        <w:spacing w:before="0" w:beforeAutospacing="off" w:after="200" w:afterAutospacing="off" w:line="276" w:lineRule="auto"/>
+      </w:pPr>
+      <w:r>
+        <w:rPr>
+          <w:rFonts w:ascii="Arial" w:hAnsi="Arial" w:eastAsia="Arial" w:cs="Arial"/>
+          <w:noProof w:val="0"/>
+          <w:sz w:val="21"/>
+          <w:szCs w:val="21"/>
+          <w:lang w:val="en-US"/>
+        </w:rPr>
+        <w:t>I Startup Properties vælges:</w:t>
+      </w:r>
+      <w:r>
+        <w:br/>
+      </w:r>
+      <w:r>
+        <w:rPr>
+          <w:rFonts w:ascii="Arial" w:hAnsi="Arial" w:eastAsia="Arial" w:cs="Arial"/>
+          <w:noProof w:val="0"/>
+          <w:sz w:val="21"/>
+          <w:szCs w:val="21"/>
+          <w:lang w:val="en-US"/>
+        </w:rPr>
+        <w:t xml:space="preserve"> </w:t>
+      </w:r>
+      <w:r>
+        <w:br/>
+      </w:r>
+      <w:r>
+        <w:rPr>
+          <w:rFonts w:ascii="Arial" w:hAnsi="Arial" w:eastAsia="Arial" w:cs="Arial"/>
+          <w:noProof w:val="0"/>
+          <w:sz w:val="21"/>
+          <w:szCs w:val="21"/>
+          <w:lang w:val="en-US"/>
+        </w:rPr>
+        <w:t>Add...</w:t>
+      </w:r>
+      <w:r>
+        <w:br/>
+      </w:r>
+      <w:r>
+        <w:rPr>
+          <w:rFonts w:ascii="Arial" w:hAnsi="Arial" w:eastAsia="Arial" w:cs="Arial"/>
+          <w:noProof w:val="0"/>
+          <w:sz w:val="21"/>
+          <w:szCs w:val="21"/>
+          <w:lang w:val="en-US"/>
+        </w:rPr>
+        <w:t xml:space="preserve"> </w:t>
+      </w:r>
+      <w:r>
+        <w:br/>
+      </w:r>
+      <w:r>
+        <w:rPr>
+          <w:rFonts w:ascii="Arial" w:hAnsi="Arial" w:eastAsia="Arial" w:cs="Arial"/>
+          <w:noProof w:val="0"/>
+          <w:sz w:val="21"/>
+          <w:szCs w:val="21"/>
+          <w:lang w:val="en-US"/>
+        </w:rPr>
+        <w:t>Derefter vælges:</w:t>
+      </w:r>
+      <w:r>
+        <w:br/>
+      </w:r>
+      <w:r>
+        <w:rPr>
+          <w:rFonts w:ascii="Arial" w:hAnsi="Arial" w:eastAsia="Arial" w:cs="Arial"/>
+          <w:noProof w:val="0"/>
+          <w:sz w:val="21"/>
+          <w:szCs w:val="21"/>
+          <w:lang w:val="en-US"/>
+        </w:rPr>
+        <w:t xml:space="preserve"> </w:t>
+      </w:r>
+      <w:r>
+        <w:br/>
+      </w:r>
+      <w:r>
+        <w:rPr>
+          <w:rFonts w:ascii="Arial" w:hAnsi="Arial" w:eastAsia="Arial" w:cs="Arial"/>
+          <w:noProof w:val="0"/>
+          <w:sz w:val="21"/>
+          <w:szCs w:val="21"/>
+          <w:lang w:val="en-US"/>
+        </w:rPr>
+        <w:t>Install-LibreOffice.cmd</w:t>
+      </w:r>
+      <w:r>
+        <w:br/>
+      </w:r>
+      <w:r>
+        <w:rPr>
+          <w:rFonts w:ascii="Arial" w:hAnsi="Arial" w:eastAsia="Arial" w:cs="Arial"/>
+          <w:noProof w:val="0"/>
+          <w:sz w:val="21"/>
+          <w:szCs w:val="21"/>
+          <w:lang w:val="en-US"/>
+        </w:rPr>
+        <w:t xml:space="preserve"> </w:t>
+      </w:r>
+      <w:r>
+        <w:br/>
+      </w:r>
+      <w:r>
+        <w:rPr>
+          <w:rFonts w:ascii="Arial" w:hAnsi="Arial" w:eastAsia="Arial" w:cs="Arial"/>
+          <w:noProof w:val="0"/>
+          <w:sz w:val="21"/>
+          <w:szCs w:val="21"/>
+          <w:lang w:val="en-US"/>
+        </w:rPr>
+        <w:t>Scriptet vises herefter i listen under Startup.</w:t>
+      </w:r>
+      <w:r>
+        <w:br/>
+      </w:r>
+      <w:r>
+        <w:rPr>
+          <w:rFonts w:ascii="Arial" w:hAnsi="Arial" w:eastAsia="Arial" w:cs="Arial"/>
+          <w:noProof w:val="0"/>
+          <w:sz w:val="21"/>
+          <w:szCs w:val="21"/>
+          <w:lang w:val="en-US"/>
+        </w:rPr>
+        <w:t xml:space="preserve"> </w:t>
+      </w:r>
+      <w:r>
+        <w:br/>
+      </w:r>
+      <w:r>
+        <w:rPr>
+          <w:rFonts w:ascii="Arial" w:hAnsi="Arial" w:eastAsia="Arial" w:cs="Arial"/>
+          <w:noProof w:val="0"/>
+          <w:sz w:val="21"/>
+          <w:szCs w:val="21"/>
+          <w:lang w:val="en-US"/>
+        </w:rPr>
+        <w:t>Der vælges:</w:t>
+      </w:r>
+      <w:r>
+        <w:br/>
+      </w:r>
+      <w:r>
+        <w:rPr>
+          <w:rFonts w:ascii="Arial" w:hAnsi="Arial" w:eastAsia="Arial" w:cs="Arial"/>
+          <w:noProof w:val="0"/>
+          <w:sz w:val="21"/>
+          <w:szCs w:val="21"/>
+          <w:lang w:val="en-US"/>
+        </w:rPr>
+        <w:t xml:space="preserve"> </w:t>
+      </w:r>
+      <w:r>
+        <w:br/>
+      </w:r>
+      <w:r>
+        <w:rPr>
+          <w:rFonts w:ascii="Arial" w:hAnsi="Arial" w:eastAsia="Arial" w:cs="Arial"/>
+          <w:noProof w:val="0"/>
+          <w:sz w:val="21"/>
+          <w:szCs w:val="21"/>
+          <w:lang w:val="en-US"/>
+        </w:rPr>
+        <w:t>Apply → OK</w:t>
+      </w:r>
+    </w:p>
+    <w:p>
+      <w:pPr>
+        <w:spacing w:before="0" w:beforeAutospacing="off" w:after="200" w:afterAutospacing="off" w:line="276" w:lineRule="auto"/>
+      </w:pPr>
+      <w:r>
+        <w:rPr>
+          <w:rFonts w:ascii="Arial" w:hAnsi="Arial" w:eastAsia="Arial" w:cs="Arial"/>
+          <w:b w:val="1"/>
+          <w:bCs w:val="1"/>
+          <w:noProof w:val="0"/>
+          <w:sz w:val="24"/>
+          <w:szCs w:val="24"/>
+          <w:lang w:val="en-US"/>
+        </w:rPr>
+        <w:t>6. Opdater Group Policy</w:t>
+      </w:r>
+    </w:p>
+    <w:p>
+      <w:pPr>
+        <w:spacing w:before="0" w:beforeAutospacing="off" w:after="200" w:afterAutospacing="off" w:line="276" w:lineRule="auto"/>
+      </w:pPr>
+      <w:r>
+        <w:rPr>
+          <w:rFonts w:ascii="Arial" w:hAnsi="Arial" w:eastAsia="Arial" w:cs="Arial"/>
+          <w:noProof w:val="0"/>
+          <w:sz w:val="21"/>
+          <w:szCs w:val="21"/>
+          <w:lang w:val="en-US"/>
+        </w:rPr>
+        <w:t>På klientcomputeren åbnes Command Prompt som Administrator.</w:t>
+      </w:r>
+      <w:r>
+        <w:br/>
+      </w:r>
+      <w:r>
+        <w:rPr>
+          <w:rFonts w:ascii="Arial" w:hAnsi="Arial" w:eastAsia="Arial" w:cs="Arial"/>
+          <w:noProof w:val="0"/>
+          <w:sz w:val="21"/>
+          <w:szCs w:val="21"/>
+          <w:lang w:val="en-US"/>
+        </w:rPr>
+        <w:t xml:space="preserve"> </w:t>
+      </w:r>
+      <w:r>
+        <w:br/>
+      </w:r>
+      <w:r>
+        <w:rPr>
+          <w:rFonts w:ascii="Arial" w:hAnsi="Arial" w:eastAsia="Arial" w:cs="Arial"/>
+          <w:noProof w:val="0"/>
+          <w:sz w:val="21"/>
+          <w:szCs w:val="21"/>
+          <w:lang w:val="en-US"/>
+        </w:rPr>
+        <w:t>Følgende kommando køres:</w:t>
+      </w:r>
+      <w:r>
+        <w:br/>
+      </w:r>
+      <w:r>
+        <w:rPr>
+          <w:rFonts w:ascii="Arial" w:hAnsi="Arial" w:eastAsia="Arial" w:cs="Arial"/>
+          <w:noProof w:val="0"/>
+          <w:sz w:val="21"/>
+          <w:szCs w:val="21"/>
+          <w:lang w:val="en-US"/>
+        </w:rPr>
+        <w:t xml:space="preserve"> </w:t>
+      </w:r>
+      <w:r>
+        <w:br/>
+      </w:r>
+      <w:r>
+        <w:rPr>
+          <w:rFonts w:ascii="Arial" w:hAnsi="Arial" w:eastAsia="Arial" w:cs="Arial"/>
+          <w:noProof w:val="0"/>
+          <w:sz w:val="21"/>
+          <w:szCs w:val="21"/>
+          <w:lang w:val="en-US"/>
+        </w:rPr>
+        <w:t>gpupdate /force</w:t>
+      </w:r>
+      <w:r>
+        <w:br/>
+      </w:r>
+      <w:r>
+        <w:rPr>
+          <w:rFonts w:ascii="Arial" w:hAnsi="Arial" w:eastAsia="Arial" w:cs="Arial"/>
+          <w:noProof w:val="0"/>
+          <w:sz w:val="21"/>
+          <w:szCs w:val="21"/>
+          <w:lang w:val="en-US"/>
+        </w:rPr>
+        <w:t xml:space="preserve"> </w:t>
+      </w:r>
+      <w:r>
+        <w:br/>
+      </w:r>
+      <w:r>
+        <w:rPr>
+          <w:rFonts w:ascii="Arial" w:hAnsi="Arial" w:eastAsia="Arial" w:cs="Arial"/>
+          <w:noProof w:val="0"/>
+          <w:sz w:val="21"/>
+          <w:szCs w:val="21"/>
+          <w:lang w:val="en-US"/>
+        </w:rPr>
+        <w:t>Dette tvinger computeren til at hente og anvende den seneste Group Policy-konfiguration.</w:t>
+      </w:r>
+    </w:p>
+    <w:p>
+      <w:pPr>
+        <w:spacing w:before="0" w:beforeAutospacing="off" w:after="200" w:afterAutospacing="off" w:line="276" w:lineRule="auto"/>
+      </w:pPr>
+      <w:r>
+        <w:rPr>
+          <w:rFonts w:ascii="Arial" w:hAnsi="Arial" w:eastAsia="Arial" w:cs="Arial"/>
+          <w:b w:val="1"/>
+          <w:bCs w:val="1"/>
+          <w:noProof w:val="0"/>
+          <w:sz w:val="24"/>
+          <w:szCs w:val="24"/>
+          <w:lang w:val="en-US"/>
+        </w:rPr>
+        <w:t>7. Kontrol af Group Policy</w:t>
+      </w:r>
+    </w:p>
+    <w:p>
+      <w:pPr>
+        <w:spacing w:before="0" w:beforeAutospacing="off" w:after="200" w:afterAutospacing="off" w:line="276" w:lineRule="auto"/>
+      </w:pPr>
+      <w:r>
+        <w:rPr>
+          <w:rFonts w:ascii="Arial" w:hAnsi="Arial" w:eastAsia="Arial" w:cs="Arial"/>
+          <w:noProof w:val="0"/>
+          <w:sz w:val="21"/>
+          <w:szCs w:val="21"/>
+          <w:lang w:val="en-US"/>
+        </w:rPr>
+        <w:t>For at kontrollere, om GPO'en er blevet anvendt, køres:</w:t>
+      </w:r>
+      <w:r>
+        <w:br/>
+      </w:r>
+      <w:r>
+        <w:rPr>
+          <w:rFonts w:ascii="Arial" w:hAnsi="Arial" w:eastAsia="Arial" w:cs="Arial"/>
+          <w:noProof w:val="0"/>
+          <w:sz w:val="21"/>
+          <w:szCs w:val="21"/>
+          <w:lang w:val="en-US"/>
+        </w:rPr>
+        <w:t xml:space="preserve"> </w:t>
+      </w:r>
+      <w:r>
+        <w:br/>
+      </w:r>
+      <w:r>
+        <w:rPr>
+          <w:rFonts w:ascii="Arial" w:hAnsi="Arial" w:eastAsia="Arial" w:cs="Arial"/>
+          <w:noProof w:val="0"/>
+          <w:sz w:val="21"/>
+          <w:szCs w:val="21"/>
+          <w:lang w:val="en-US"/>
+        </w:rPr>
+        <w:t>gpresult /r</w:t>
+      </w:r>
+      <w:r>
+        <w:br/>
+      </w:r>
+      <w:r>
+        <w:rPr>
+          <w:rFonts w:ascii="Arial" w:hAnsi="Arial" w:eastAsia="Arial" w:cs="Arial"/>
+          <w:noProof w:val="0"/>
+          <w:sz w:val="21"/>
+          <w:szCs w:val="21"/>
+          <w:lang w:val="en-US"/>
+        </w:rPr>
+        <w:t xml:space="preserve"> </w:t>
+      </w:r>
+      <w:r>
+        <w:br/>
+      </w:r>
+      <w:r>
+        <w:rPr>
+          <w:rFonts w:ascii="Arial" w:hAnsi="Arial" w:eastAsia="Arial" w:cs="Arial"/>
+          <w:noProof w:val="0"/>
+          <w:sz w:val="21"/>
+          <w:szCs w:val="21"/>
+          <w:lang w:val="en-US"/>
+        </w:rPr>
+        <w:t>Under Computer Settings skal følgende GPO fremgå:</w:t>
+      </w:r>
+      <w:r>
+        <w:br/>
+      </w:r>
+      <w:r>
+        <w:rPr>
+          <w:rFonts w:ascii="Arial" w:hAnsi="Arial" w:eastAsia="Arial" w:cs="Arial"/>
+          <w:noProof w:val="0"/>
+          <w:sz w:val="21"/>
+          <w:szCs w:val="21"/>
+          <w:lang w:val="en-US"/>
+        </w:rPr>
+        <w:t xml:space="preserve"> </w:t>
+      </w:r>
+      <w:r>
+        <w:br/>
+      </w:r>
+      <w:r>
+        <w:rPr>
+          <w:rFonts w:ascii="Arial" w:hAnsi="Arial" w:eastAsia="Arial" w:cs="Arial"/>
+          <w:noProof w:val="0"/>
+          <w:sz w:val="21"/>
+          <w:szCs w:val="21"/>
+          <w:lang w:val="en-US"/>
+        </w:rPr>
+        <w:t>GPO-software-Deployment</w:t>
+      </w:r>
+      <w:r>
+        <w:br/>
+      </w:r>
+      <w:r>
+        <w:rPr>
+          <w:rFonts w:ascii="Arial" w:hAnsi="Arial" w:eastAsia="Arial" w:cs="Arial"/>
+          <w:noProof w:val="0"/>
+          <w:sz w:val="21"/>
+          <w:szCs w:val="21"/>
+          <w:lang w:val="en-US"/>
+        </w:rPr>
+        <w:t xml:space="preserve"> </w:t>
+      </w:r>
+      <w:r>
+        <w:br/>
+      </w:r>
+      <w:r>
+        <w:rPr>
+          <w:rFonts w:ascii="Arial" w:hAnsi="Arial" w:eastAsia="Arial" w:cs="Arial"/>
+          <w:noProof w:val="0"/>
+          <w:sz w:val="21"/>
+          <w:szCs w:val="21"/>
+          <w:lang w:val="en-US"/>
+        </w:rPr>
+        <w:t>Dette bekræfter, at GPO'en er anvendt på computeren.</w:t>
+      </w:r>
+    </w:p>
+    <w:p>
+      <w:pPr>
+        <w:spacing w:before="0" w:beforeAutospacing="off" w:after="200" w:afterAutospacing="off" w:line="276" w:lineRule="auto"/>
+      </w:pPr>
+      <w:r>
+        <w:rPr>
+          <w:rFonts w:ascii="Arial" w:hAnsi="Arial" w:eastAsia="Arial" w:cs="Arial"/>
+          <w:b w:val="1"/>
+          <w:bCs w:val="1"/>
+          <w:noProof w:val="0"/>
+          <w:sz w:val="24"/>
+          <w:szCs w:val="24"/>
+          <w:lang w:val="en-US"/>
+        </w:rPr>
+        <w:t>8. Installation ved Startup</w:t>
+      </w:r>
+    </w:p>
+    <w:p>
+      <w:pPr>
+        <w:spacing w:before="0" w:beforeAutospacing="off" w:after="200" w:afterAutospacing="off" w:line="276" w:lineRule="auto"/>
+      </w:pPr>
+      <w:r>
+        <w:rPr>
+          <w:rFonts w:ascii="Arial" w:hAnsi="Arial" w:eastAsia="Arial" w:cs="Arial"/>
+          <w:noProof w:val="0"/>
+          <w:sz w:val="21"/>
+          <w:szCs w:val="21"/>
+          <w:lang w:val="en-US"/>
+        </w:rPr>
+        <w:t>Startup Scriptet køres, når computeren starter.</w:t>
+      </w:r>
+      <w:r>
+        <w:br/>
+      </w:r>
+      <w:r>
+        <w:rPr>
+          <w:rFonts w:ascii="Arial" w:hAnsi="Arial" w:eastAsia="Arial" w:cs="Arial"/>
+          <w:noProof w:val="0"/>
+          <w:sz w:val="21"/>
+          <w:szCs w:val="21"/>
+          <w:lang w:val="en-US"/>
+        </w:rPr>
+        <w:t xml:space="preserve"> </w:t>
+      </w:r>
+      <w:r>
+        <w:br/>
+      </w:r>
+      <w:r>
+        <w:rPr>
+          <w:rFonts w:ascii="Arial" w:hAnsi="Arial" w:eastAsia="Arial" w:cs="Arial"/>
+          <w:noProof w:val="0"/>
+          <w:sz w:val="21"/>
+          <w:szCs w:val="21"/>
+          <w:lang w:val="en-US"/>
+        </w:rPr>
+        <w:t>Computer Startup</w:t>
+      </w:r>
+      <w:r>
+        <w:br/>
+      </w:r>
+      <w:r>
+        <w:rPr>
+          <w:rFonts w:ascii="Arial" w:hAnsi="Arial" w:eastAsia="Arial" w:cs="Arial"/>
+          <w:noProof w:val="0"/>
+          <w:sz w:val="21"/>
+          <w:szCs w:val="21"/>
+          <w:lang w:val="en-US"/>
+        </w:rPr>
+        <w:t xml:space="preserve"> ↓</w:t>
+      </w:r>
+      <w:r>
+        <w:br/>
+      </w:r>
+      <w:r>
+        <w:rPr>
+          <w:rFonts w:ascii="Arial" w:hAnsi="Arial" w:eastAsia="Arial" w:cs="Arial"/>
+          <w:noProof w:val="0"/>
+          <w:sz w:val="21"/>
+          <w:szCs w:val="21"/>
+          <w:lang w:val="en-US"/>
+        </w:rPr>
+        <w:t xml:space="preserve"> Group Policy anvendes</w:t>
+      </w:r>
+      <w:r>
+        <w:br/>
+      </w:r>
+      <w:r>
+        <w:rPr>
+          <w:rFonts w:ascii="Arial" w:hAnsi="Arial" w:eastAsia="Arial" w:cs="Arial"/>
+          <w:noProof w:val="0"/>
+          <w:sz w:val="21"/>
+          <w:szCs w:val="21"/>
+          <w:lang w:val="en-US"/>
+        </w:rPr>
+        <w:t xml:space="preserve"> ↓</w:t>
+      </w:r>
+      <w:r>
+        <w:br/>
+      </w:r>
+      <w:r>
+        <w:rPr>
+          <w:rFonts w:ascii="Arial" w:hAnsi="Arial" w:eastAsia="Arial" w:cs="Arial"/>
+          <w:noProof w:val="0"/>
+          <w:sz w:val="21"/>
+          <w:szCs w:val="21"/>
+          <w:lang w:val="en-US"/>
+        </w:rPr>
+        <w:t xml:space="preserve"> Startup Script køres</w:t>
+      </w:r>
+      <w:r>
+        <w:br/>
+      </w:r>
+      <w:r>
+        <w:rPr>
+          <w:rFonts w:ascii="Arial" w:hAnsi="Arial" w:eastAsia="Arial" w:cs="Arial"/>
+          <w:noProof w:val="0"/>
+          <w:sz w:val="21"/>
+          <w:szCs w:val="21"/>
+          <w:lang w:val="en-US"/>
+        </w:rPr>
+        <w:t xml:space="preserve"> ↓</w:t>
+      </w:r>
+      <w:r>
+        <w:br/>
+      </w:r>
+      <w:r>
+        <w:rPr>
+          <w:rFonts w:ascii="Arial" w:hAnsi="Arial" w:eastAsia="Arial" w:cs="Arial"/>
+          <w:noProof w:val="0"/>
+          <w:sz w:val="21"/>
+          <w:szCs w:val="21"/>
+          <w:lang w:val="en-US"/>
+        </w:rPr>
+        <w:t xml:space="preserve"> Install-LibreOffice.cmd</w:t>
+      </w:r>
+      <w:r>
+        <w:br/>
+      </w:r>
+      <w:r>
+        <w:rPr>
+          <w:rFonts w:ascii="Arial" w:hAnsi="Arial" w:eastAsia="Arial" w:cs="Arial"/>
+          <w:noProof w:val="0"/>
+          <w:sz w:val="21"/>
+          <w:szCs w:val="21"/>
+          <w:lang w:val="en-US"/>
+        </w:rPr>
+        <w:t xml:space="preserve"> ↓</w:t>
+      </w:r>
+      <w:r>
+        <w:br/>
+      </w:r>
+      <w:r>
+        <w:rPr>
+          <w:rFonts w:ascii="Arial" w:hAnsi="Arial" w:eastAsia="Arial" w:cs="Arial"/>
+          <w:noProof w:val="0"/>
+          <w:sz w:val="21"/>
+          <w:szCs w:val="21"/>
+          <w:lang w:val="en-US"/>
+        </w:rPr>
+        <w:t xml:space="preserve"> msiexec.exe</w:t>
+      </w:r>
+      <w:r>
+        <w:br/>
+      </w:r>
+      <w:r>
+        <w:rPr>
+          <w:rFonts w:ascii="Arial" w:hAnsi="Arial" w:eastAsia="Arial" w:cs="Arial"/>
+          <w:noProof w:val="0"/>
+          <w:sz w:val="21"/>
+          <w:szCs w:val="21"/>
+          <w:lang w:val="en-US"/>
+        </w:rPr>
+        <w:t xml:space="preserve"> ↓</w:t>
+      </w:r>
+      <w:r>
+        <w:br/>
+      </w:r>
+      <w:r>
+        <w:rPr>
+          <w:rFonts w:ascii="Arial" w:hAnsi="Arial" w:eastAsia="Arial" w:cs="Arial"/>
+          <w:noProof w:val="0"/>
+          <w:sz w:val="21"/>
+          <w:szCs w:val="21"/>
+          <w:lang w:val="en-US"/>
+        </w:rPr>
+        <w:t xml:space="preserve"> LibreOffice installeres</w:t>
+      </w:r>
+      <w:r>
+        <w:br/>
+      </w:r>
+      <w:r>
+        <w:rPr>
+          <w:rFonts w:ascii="Arial" w:hAnsi="Arial" w:eastAsia="Arial" w:cs="Arial"/>
+          <w:noProof w:val="0"/>
+          <w:sz w:val="21"/>
+          <w:szCs w:val="21"/>
+          <w:lang w:val="en-US"/>
+        </w:rPr>
+        <w:t xml:space="preserve"> </w:t>
+      </w:r>
+      <w:r>
+        <w:br/>
+      </w:r>
+      <w:r>
+        <w:rPr>
+          <w:rFonts w:ascii="Arial" w:hAnsi="Arial" w:eastAsia="Arial" w:cs="Arial"/>
+          <w:noProof w:val="0"/>
+          <w:sz w:val="21"/>
+          <w:szCs w:val="21"/>
+          <w:lang w:val="en-US"/>
+        </w:rPr>
+        <w:t>Installationen kører silent, fordi /qn anvendes. Derfor vises installationsguiden normalt ikke for brugeren.</w:t>
+      </w:r>
+    </w:p>
+    <w:p>
+      <w:pPr>
+        <w:spacing w:before="0" w:beforeAutospacing="off" w:after="200" w:afterAutospacing="off" w:line="276" w:lineRule="auto"/>
+      </w:pPr>
+      <w:r>
+        <w:rPr>
+          <w:rFonts w:ascii="Arial" w:hAnsi="Arial" w:eastAsia="Arial" w:cs="Arial"/>
+          <w:b w:val="1"/>
+          <w:bCs w:val="1"/>
+          <w:noProof w:val="0"/>
+          <w:sz w:val="24"/>
+          <w:szCs w:val="24"/>
+          <w:lang w:val="en-US"/>
+        </w:rPr>
+        <w:t>9. Test</w:t>
+      </w:r>
+    </w:p>
+    <w:p>
+      <w:pPr>
+        <w:spacing w:before="0" w:beforeAutospacing="off" w:after="200" w:afterAutospacing="off" w:line="276" w:lineRule="auto"/>
+      </w:pPr>
+      <w:r>
+        <w:rPr>
+          <w:rFonts w:ascii="Arial" w:hAnsi="Arial" w:eastAsia="Arial" w:cs="Arial"/>
+          <w:noProof w:val="0"/>
+          <w:sz w:val="21"/>
+          <w:szCs w:val="21"/>
+          <w:lang w:val="en-US"/>
+        </w:rPr>
+        <w:t>Under testen blev klientcomputeren opdateret med:</w:t>
+      </w:r>
+      <w:r>
+        <w:br/>
+      </w:r>
+      <w:r>
+        <w:rPr>
+          <w:rFonts w:ascii="Arial" w:hAnsi="Arial" w:eastAsia="Arial" w:cs="Arial"/>
+          <w:noProof w:val="0"/>
+          <w:sz w:val="21"/>
+          <w:szCs w:val="21"/>
+          <w:lang w:val="en-US"/>
+        </w:rPr>
+        <w:t xml:space="preserve"> </w:t>
+      </w:r>
+      <w:r>
+        <w:br/>
+      </w:r>
+      <w:r>
+        <w:rPr>
+          <w:rFonts w:ascii="Arial" w:hAnsi="Arial" w:eastAsia="Arial" w:cs="Arial"/>
+          <w:noProof w:val="0"/>
+          <w:sz w:val="21"/>
+          <w:szCs w:val="21"/>
+          <w:lang w:val="en-US"/>
+        </w:rPr>
+        <w:t>gpupdate /force</w:t>
+      </w:r>
+      <w:r>
+        <w:br/>
+      </w:r>
+      <w:r>
+        <w:rPr>
+          <w:rFonts w:ascii="Arial" w:hAnsi="Arial" w:eastAsia="Arial" w:cs="Arial"/>
+          <w:noProof w:val="0"/>
+          <w:sz w:val="21"/>
+          <w:szCs w:val="21"/>
+          <w:lang w:val="en-US"/>
+        </w:rPr>
+        <w:t xml:space="preserve"> </w:t>
+      </w:r>
+      <w:r>
+        <w:br/>
+      </w:r>
+      <w:r>
+        <w:rPr>
+          <w:rFonts w:ascii="Arial" w:hAnsi="Arial" w:eastAsia="Arial" w:cs="Arial"/>
+          <w:noProof w:val="0"/>
+          <w:sz w:val="21"/>
+          <w:szCs w:val="21"/>
+          <w:lang w:val="en-US"/>
+        </w:rPr>
+        <w:t>GPO'en blev registreret som anvendt på computeren.</w:t>
+      </w:r>
+      <w:r>
+        <w:br/>
+      </w:r>
+      <w:r>
+        <w:rPr>
+          <w:rFonts w:ascii="Arial" w:hAnsi="Arial" w:eastAsia="Arial" w:cs="Arial"/>
+          <w:noProof w:val="0"/>
+          <w:sz w:val="21"/>
+          <w:szCs w:val="21"/>
+          <w:lang w:val="en-US"/>
+        </w:rPr>
+        <w:t xml:space="preserve"> </w:t>
+      </w:r>
+      <w:r>
+        <w:br/>
+      </w:r>
+      <w:r>
+        <w:rPr>
+          <w:rFonts w:ascii="Arial" w:hAnsi="Arial" w:eastAsia="Arial" w:cs="Arial"/>
+          <w:noProof w:val="0"/>
+          <w:sz w:val="21"/>
+          <w:szCs w:val="21"/>
+          <w:lang w:val="en-US"/>
+        </w:rPr>
+        <w:t>Efterfølgende blev LibreOffice installeret på klienten. Programmet kunne ses på skrivebordet efter installationen.</w:t>
+      </w:r>
+      <w:r>
+        <w:br/>
+      </w:r>
+      <w:r>
+        <w:rPr>
+          <w:rFonts w:ascii="Arial" w:hAnsi="Arial" w:eastAsia="Arial" w:cs="Arial"/>
+          <w:noProof w:val="0"/>
+          <w:sz w:val="21"/>
+          <w:szCs w:val="21"/>
+          <w:lang w:val="en-US"/>
+        </w:rPr>
+        <w:t xml:space="preserve"> </w:t>
+      </w:r>
+      <w:r>
+        <w:br/>
+      </w:r>
+      <w:r>
+        <w:rPr>
+          <w:rFonts w:ascii="Arial" w:hAnsi="Arial" w:eastAsia="Arial" w:cs="Arial"/>
+          <w:noProof w:val="0"/>
+          <w:sz w:val="21"/>
+          <w:szCs w:val="21"/>
+          <w:lang w:val="en-US"/>
+        </w:rPr>
+        <w:t>Installationen kan tage lidt tid, fordi MSI-pakken hentes fra netværksplaceringen:</w:t>
+      </w:r>
+      <w:r>
+        <w:br/>
+      </w:r>
+      <w:r>
+        <w:rPr>
+          <w:rFonts w:ascii="Arial" w:hAnsi="Arial" w:eastAsia="Arial" w:cs="Arial"/>
+          <w:noProof w:val="0"/>
+          <w:sz w:val="21"/>
+          <w:szCs w:val="21"/>
+          <w:lang w:val="en-US"/>
+        </w:rPr>
+        <w:t xml:space="preserve"> </w:t>
+      </w:r>
+      <w:r>
+        <w:br/>
+      </w:r>
+      <w:r>
+        <w:fldChar w:fldCharType="begin"/>
+      </w:r>
+      <w:r>
+        <w:instrText xml:space="preserve">HYPERLINK "file:///\\SRV01\software\libreoffice\" </w:instrText>
+      </w:r>
+      <w:r>
+        <w:fldChar w:fldCharType="separate"/>
+      </w:r>
+      <w:r>
+        <w:rPr>
+          <w:rStyle w:val="Hyperlink"/>
+          <w:noProof w:val="0"/>
+          <w:lang w:val="en-US"/>
+        </w:rPr>
+        <w:t>\\SRV01\software\libreoffice\</w:t>
+      </w:r>
+      <w:r>
+        <w:fldChar w:fldCharType="end"/>
+      </w:r>
+    </w:p>
+    <w:p>
+      <w:pPr>
+        <w:spacing w:before="0" w:beforeAutospacing="off" w:after="200" w:afterAutospacing="off" w:line="276" w:lineRule="auto"/>
+      </w:pPr>
+      <w:r>
+        <w:rPr>
+          <w:rFonts w:ascii="Arial" w:hAnsi="Arial" w:eastAsia="Arial" w:cs="Arial"/>
+          <w:b w:val="1"/>
+          <w:bCs w:val="1"/>
+          <w:noProof w:val="0"/>
+          <w:sz w:val="24"/>
+          <w:szCs w:val="24"/>
+          <w:lang w:val="en-US"/>
+        </w:rPr>
+        <w:t>10. Hvorfor Startup Script blev anvendt</w:t>
+      </w:r>
+    </w:p>
+    <w:p>
+      <w:pPr>
+        <w:spacing w:before="0" w:beforeAutospacing="off" w:after="200" w:afterAutospacing="off" w:line="276" w:lineRule="auto"/>
+      </w:pPr>
+      <w:r>
+        <w:rPr>
+          <w:rFonts w:ascii="Arial" w:hAnsi="Arial" w:eastAsia="Arial" w:cs="Arial"/>
+          <w:noProof w:val="0"/>
+          <w:sz w:val="21"/>
+          <w:szCs w:val="21"/>
+          <w:lang w:val="en-US"/>
+        </w:rPr>
+        <w:t>Den oprindelige metode med Software Installation under:</w:t>
+      </w:r>
+      <w:r>
+        <w:br/>
+      </w:r>
+      <w:r>
+        <w:rPr>
+          <w:rFonts w:ascii="Arial" w:hAnsi="Arial" w:eastAsia="Arial" w:cs="Arial"/>
+          <w:noProof w:val="0"/>
+          <w:sz w:val="21"/>
+          <w:szCs w:val="21"/>
+          <w:lang w:val="en-US"/>
+        </w:rPr>
+        <w:t xml:space="preserve"> </w:t>
+      </w:r>
+      <w:r>
+        <w:br/>
+      </w:r>
+      <w:r>
+        <w:rPr>
+          <w:rFonts w:ascii="Arial" w:hAnsi="Arial" w:eastAsia="Arial" w:cs="Arial"/>
+          <w:noProof w:val="0"/>
+          <w:sz w:val="21"/>
+          <w:szCs w:val="21"/>
+          <w:lang w:val="en-US"/>
+        </w:rPr>
+        <w:t>Computer Configuration</w:t>
+      </w:r>
+      <w:r>
+        <w:br/>
+      </w:r>
+      <w:r>
+        <w:rPr>
+          <w:rFonts w:ascii="Arial" w:hAnsi="Arial" w:eastAsia="Arial" w:cs="Arial"/>
+          <w:noProof w:val="0"/>
+          <w:sz w:val="21"/>
+          <w:szCs w:val="21"/>
+          <w:lang w:val="en-US"/>
+        </w:rPr>
+        <w:t xml:space="preserve"> → Policies</w:t>
+      </w:r>
+      <w:r>
+        <w:br/>
+      </w:r>
+      <w:r>
+        <w:rPr>
+          <w:rFonts w:ascii="Arial" w:hAnsi="Arial" w:eastAsia="Arial" w:cs="Arial"/>
+          <w:noProof w:val="0"/>
+          <w:sz w:val="21"/>
+          <w:szCs w:val="21"/>
+          <w:lang w:val="en-US"/>
+        </w:rPr>
+        <w:t xml:space="preserve"> → Software Settings</w:t>
+      </w:r>
+      <w:r>
+        <w:br/>
+      </w:r>
+      <w:r>
+        <w:rPr>
+          <w:rFonts w:ascii="Arial" w:hAnsi="Arial" w:eastAsia="Arial" w:cs="Arial"/>
+          <w:noProof w:val="0"/>
+          <w:sz w:val="21"/>
+          <w:szCs w:val="21"/>
+          <w:lang w:val="en-US"/>
+        </w:rPr>
+        <w:t xml:space="preserve"> → Software Installation</w:t>
+      </w:r>
+      <w:r>
+        <w:br/>
+      </w:r>
+      <w:r>
+        <w:rPr>
+          <w:rFonts w:ascii="Arial" w:hAnsi="Arial" w:eastAsia="Arial" w:cs="Arial"/>
+          <w:noProof w:val="0"/>
+          <w:sz w:val="21"/>
+          <w:szCs w:val="21"/>
+          <w:lang w:val="en-US"/>
+        </w:rPr>
+        <w:t xml:space="preserve"> </w:t>
+      </w:r>
+      <w:r>
+        <w:br/>
+      </w:r>
+      <w:r>
+        <w:rPr>
+          <w:rFonts w:ascii="Arial" w:hAnsi="Arial" w:eastAsia="Arial" w:cs="Arial"/>
+          <w:noProof w:val="0"/>
+          <w:sz w:val="21"/>
+          <w:szCs w:val="21"/>
+          <w:lang w:val="en-US"/>
+        </w:rPr>
+        <w:t>gav fejlen:</w:t>
+      </w:r>
+      <w:r>
+        <w:br/>
+      </w:r>
+      <w:r>
+        <w:rPr>
+          <w:rFonts w:ascii="Arial" w:hAnsi="Arial" w:eastAsia="Arial" w:cs="Arial"/>
+          <w:noProof w:val="0"/>
+          <w:sz w:val="21"/>
+          <w:szCs w:val="21"/>
+          <w:lang w:val="en-US"/>
+        </w:rPr>
+        <w:t xml:space="preserve"> </w:t>
+      </w:r>
+      <w:r>
+        <w:br/>
+      </w:r>
+      <w:r>
+        <w:rPr>
+          <w:rFonts w:ascii="Arial" w:hAnsi="Arial" w:eastAsia="Arial" w:cs="Arial"/>
+          <w:noProof w:val="0"/>
+          <w:sz w:val="21"/>
+          <w:szCs w:val="21"/>
+          <w:lang w:val="en-US"/>
+        </w:rPr>
+        <w:t>“Unable to extract deployment information from the package.”</w:t>
+      </w:r>
+      <w:r>
+        <w:br/>
+      </w:r>
+      <w:r>
+        <w:rPr>
+          <w:rFonts w:ascii="Arial" w:hAnsi="Arial" w:eastAsia="Arial" w:cs="Arial"/>
+          <w:noProof w:val="0"/>
+          <w:sz w:val="21"/>
+          <w:szCs w:val="21"/>
+          <w:lang w:val="en-US"/>
+        </w:rPr>
+        <w:t xml:space="preserve"> </w:t>
+      </w:r>
+      <w:r>
+        <w:br/>
+      </w:r>
+      <w:r>
+        <w:rPr>
+          <w:rFonts w:ascii="Arial" w:hAnsi="Arial" w:eastAsia="Arial" w:cs="Arial"/>
+          <w:noProof w:val="0"/>
+          <w:sz w:val="21"/>
+          <w:szCs w:val="21"/>
+          <w:lang w:val="en-US"/>
+        </w:rPr>
+        <w:t>Derfor blev installationen ændret til en Startup Script-baseret installation.</w:t>
+      </w:r>
+      <w:r>
+        <w:br/>
+      </w:r>
+      <w:r>
+        <w:rPr>
+          <w:rFonts w:ascii="Arial" w:hAnsi="Arial" w:eastAsia="Arial" w:cs="Arial"/>
+          <w:noProof w:val="0"/>
+          <w:sz w:val="21"/>
+          <w:szCs w:val="21"/>
+          <w:lang w:val="en-US"/>
+        </w:rPr>
+        <w:t xml:space="preserve"> </w:t>
+      </w:r>
+      <w:r>
+        <w:br/>
+      </w:r>
+      <w:r>
+        <w:rPr>
+          <w:rFonts w:ascii="Arial" w:hAnsi="Arial" w:eastAsia="Arial" w:cs="Arial"/>
+          <w:noProof w:val="0"/>
+          <w:sz w:val="21"/>
+          <w:szCs w:val="21"/>
+          <w:lang w:val="en-US"/>
+        </w:rPr>
+        <w:t>Denne metode anvender Windows Installer direkte via msiexec.exe og starter installationen under computerens opstart.</w:t>
+      </w:r>
+    </w:p>
+    <w:p>
+      <w:pPr>
+        <w:spacing w:before="0" w:beforeAutospacing="off" w:after="200" w:afterAutospacing="off" w:line="276" w:lineRule="auto"/>
+      </w:pPr>
+      <w:r>
+        <w:rPr>
+          <w:rFonts w:ascii="Arial" w:hAnsi="Arial" w:eastAsia="Arial" w:cs="Arial"/>
+          <w:b w:val="1"/>
+          <w:bCs w:val="1"/>
+          <w:noProof w:val="0"/>
+          <w:sz w:val="24"/>
+          <w:szCs w:val="24"/>
+          <w:lang w:val="en-US"/>
+        </w:rPr>
+        <w:t>Resultat</w:t>
+      </w:r>
+    </w:p>
+    <w:p>
+      <w:pPr>
+        <w:spacing w:before="0" w:beforeAutospacing="off" w:after="200" w:afterAutospacing="off" w:line="276" w:lineRule="auto"/>
+      </w:pPr>
+      <w:r>
+        <w:rPr>
+          <w:rFonts w:ascii="Arial" w:hAnsi="Arial" w:eastAsia="Arial" w:cs="Arial"/>
+          <w:noProof w:val="0"/>
+          <w:sz w:val="21"/>
+          <w:szCs w:val="21"/>
+          <w:lang w:val="en-US"/>
+        </w:rPr>
+        <w:t>LibreOffice er konfigureret til automatisk installation via Group Policy Startup Script.</w:t>
+      </w:r>
+      <w:r>
+        <w:br/>
+      </w:r>
+      <w:r>
+        <w:rPr>
+          <w:rFonts w:ascii="Arial" w:hAnsi="Arial" w:eastAsia="Arial" w:cs="Arial"/>
+          <w:noProof w:val="0"/>
+          <w:sz w:val="21"/>
+          <w:szCs w:val="21"/>
+          <w:lang w:val="en-US"/>
+        </w:rPr>
+        <w:t xml:space="preserve"> </w:t>
+      </w:r>
+      <w:r>
+        <w:br/>
+      </w:r>
+      <w:r>
+        <w:rPr>
+          <w:rFonts w:ascii="Arial" w:hAnsi="Arial" w:eastAsia="Arial" w:cs="Arial"/>
+          <w:noProof w:val="0"/>
+          <w:sz w:val="21"/>
+          <w:szCs w:val="21"/>
+          <w:lang w:val="en-US"/>
+        </w:rPr>
+        <w:t>GPO-software-Deployment</w:t>
+      </w:r>
+      <w:r>
+        <w:br/>
+      </w:r>
+      <w:r>
+        <w:rPr>
+          <w:rFonts w:ascii="Arial" w:hAnsi="Arial" w:eastAsia="Arial" w:cs="Arial"/>
+          <w:noProof w:val="0"/>
+          <w:sz w:val="21"/>
+          <w:szCs w:val="21"/>
+          <w:lang w:val="en-US"/>
+        </w:rPr>
+        <w:t xml:space="preserve"> → Computer Configuration</w:t>
+      </w:r>
+      <w:r>
+        <w:br/>
+      </w:r>
+      <w:r>
+        <w:rPr>
+          <w:rFonts w:ascii="Arial" w:hAnsi="Arial" w:eastAsia="Arial" w:cs="Arial"/>
+          <w:noProof w:val="0"/>
+          <w:sz w:val="21"/>
+          <w:szCs w:val="21"/>
+          <w:lang w:val="en-US"/>
+        </w:rPr>
+        <w:t xml:space="preserve"> → Policies</w:t>
+      </w:r>
+      <w:r>
+        <w:br/>
+      </w:r>
+      <w:r>
+        <w:rPr>
+          <w:rFonts w:ascii="Arial" w:hAnsi="Arial" w:eastAsia="Arial" w:cs="Arial"/>
+          <w:noProof w:val="0"/>
+          <w:sz w:val="21"/>
+          <w:szCs w:val="21"/>
+          <w:lang w:val="en-US"/>
+        </w:rPr>
+        <w:t xml:space="preserve"> → Windows Settings</w:t>
+      </w:r>
+      <w:r>
+        <w:br/>
+      </w:r>
+      <w:r>
+        <w:rPr>
+          <w:rFonts w:ascii="Arial" w:hAnsi="Arial" w:eastAsia="Arial" w:cs="Arial"/>
+          <w:noProof w:val="0"/>
+          <w:sz w:val="21"/>
+          <w:szCs w:val="21"/>
+          <w:lang w:val="en-US"/>
+        </w:rPr>
+        <w:t xml:space="preserve"> → Scripts (Startup/Shutdown)</w:t>
+      </w:r>
+      <w:r>
+        <w:br/>
+      </w:r>
+      <w:r>
+        <w:rPr>
+          <w:rFonts w:ascii="Arial" w:hAnsi="Arial" w:eastAsia="Arial" w:cs="Arial"/>
+          <w:noProof w:val="0"/>
+          <w:sz w:val="21"/>
+          <w:szCs w:val="21"/>
+          <w:lang w:val="en-US"/>
+        </w:rPr>
+        <w:t xml:space="preserve"> → Startup</w:t>
+      </w:r>
+      <w:r>
+        <w:br/>
+      </w:r>
+      <w:r>
+        <w:rPr>
+          <w:rFonts w:ascii="Arial" w:hAnsi="Arial" w:eastAsia="Arial" w:cs="Arial"/>
+          <w:noProof w:val="0"/>
+          <w:sz w:val="21"/>
+          <w:szCs w:val="21"/>
+          <w:lang w:val="en-US"/>
+        </w:rPr>
+        <w:t xml:space="preserve"> → Install-LibreOffice.cmd</w:t>
+      </w:r>
+      <w:r>
+        <w:br/>
+      </w:r>
+      <w:r>
+        <w:rPr>
+          <w:rFonts w:ascii="Arial" w:hAnsi="Arial" w:eastAsia="Arial" w:cs="Arial"/>
+          <w:noProof w:val="0"/>
+          <w:sz w:val="21"/>
+          <w:szCs w:val="21"/>
+          <w:lang w:val="en-US"/>
+        </w:rPr>
+        <w:t xml:space="preserve"> → msiexec.exe</w:t>
+      </w:r>
+      <w:r>
+        <w:br/>
+      </w:r>
+      <w:r>
+        <w:rPr>
+          <w:rFonts w:ascii="Arial" w:hAnsi="Arial" w:eastAsia="Arial" w:cs="Arial"/>
+          <w:noProof w:val="0"/>
+          <w:sz w:val="21"/>
+          <w:szCs w:val="21"/>
+          <w:lang w:val="en-US"/>
+        </w:rPr>
+        <w:t xml:space="preserve"> → LibreOffice</w:t>
+      </w:r>
+      <w:r>
+        <w:br/>
+      </w:r>
+      <w:r>
+        <w:rPr>
+          <w:rFonts w:ascii="Arial" w:hAnsi="Arial" w:eastAsia="Arial" w:cs="Arial"/>
+          <w:noProof w:val="0"/>
+          <w:sz w:val="21"/>
+          <w:szCs w:val="21"/>
+          <w:lang w:val="en-US"/>
+        </w:rPr>
+        <w:t xml:space="preserve"> </w:t>
+      </w:r>
+      <w:r>
+        <w:br/>
+      </w:r>
+      <w:r>
+        <w:rPr>
+          <w:rFonts w:ascii="Arial" w:hAnsi="Arial" w:eastAsia="Arial" w:cs="Arial"/>
+          <w:noProof w:val="0"/>
+          <w:sz w:val="21"/>
+          <w:szCs w:val="21"/>
+          <w:lang w:val="en-US"/>
+        </w:rPr>
+        <w:t>Status: Implementeret og testet.</w:t>
+      </w:r>
+    </w:p>
+    <w:p>
+      <w:pPr>
+        <w:pStyle w:val="Normal"/>
+        <w:rPr>
+          <w:noProof w:val="0"/>
+          <w:lang w:val="de-DE"/>
+        </w:rPr>
+      </w:pPr>
+    </w:p>
+    <w:p>
+      <w:pPr>
         <w:rPr>
           <w:b w:val="0"/>
           <w:bCs w:val="0"/>
@@ -8474,7 +10916,7 @@
           <w:caps w:val="0"/>
           <w:smallCaps w:val="0"/>
           <w:noProof w:val="0"/>
-          <w:color w:val="4F81BD" w:themeColor="accent1" w:themeTint="FF" w:themeShade="FF"/>
+          <w:color w:val="4F80BD"/>
           <w:sz w:val="26"/>
           <w:szCs w:val="26"/>
           <w:lang w:val="en-US"/>
@@ -8491,88 +10933,13 @@
           <w:caps w:val="0"/>
           <w:smallCaps w:val="0"/>
           <w:noProof w:val="0"/>
-          <w:color w:val="4F81BD" w:themeColor="accent1" w:themeTint="FF" w:themeShade="FF"/>
+          <w:color w:val="4F80BD"/>
           <w:sz w:val="26"/>
           <w:szCs w:val="26"/>
           <w:lang w:val="en-US"/>
         </w:rPr>
-        <w:t xml:space="preserve"> -RDP</w:t>
-      </w:r>
-    </w:p>
-    <w:p>
-      <w:pPr>
-        <w:shd w:val="clear" w:color="auto" w:fill="FFFFFF" w:themeFill="background1"/>
-        <w:spacing w:before="0" w:beforeAutospacing="off" w:after="200" w:afterAutospacing="off"/>
-      </w:pPr>
-      <w:r>
-        <w:rPr>
-          <w:rFonts w:ascii="Cambria" w:hAnsi="Cambria" w:eastAsia="Cambria" w:cs="Cambria"/>
-          <w:b w:val="0"/>
-          <w:bCs w:val="0"/>
-          <w:i w:val="0"/>
-          <w:iCs w:val="0"/>
-          <w:caps w:val="0"/>
-          <w:smallCaps w:val="0"/>
-          <w:noProof w:val="0"/>
-          <w:color w:val="000000" w:themeColor="text1" w:themeTint="FF" w:themeShade="FF"/>
-          <w:sz w:val="22"/>
-          <w:szCs w:val="22"/>
-          <w:lang w:val="en-US"/>
-        </w:rPr>
-        <w:t>Problem</w:t>
-      </w:r>
-    </w:p>
-    <w:p>
-      <w:pPr>
-        <w:shd w:val="clear" w:color="auto" w:fill="FFFFFF" w:themeFill="background1"/>
-        <w:spacing w:before="0" w:beforeAutospacing="off" w:after="200" w:afterAutospacing="off"/>
-      </w:pPr>
-      <w:r>
-        <w:rPr>
-          <w:rFonts w:ascii="Cambria" w:hAnsi="Cambria" w:eastAsia="Cambria" w:cs="Cambria"/>
-          <w:b w:val="0"/>
-          <w:bCs w:val="0"/>
-          <w:i w:val="0"/>
-          <w:iCs w:val="0"/>
-          <w:caps w:val="0"/>
-          <w:smallCaps w:val="0"/>
-          <w:noProof w:val="0"/>
-          <w:color w:val="000000" w:themeColor="text1" w:themeTint="FF" w:themeShade="FF"/>
-          <w:sz w:val="22"/>
-          <w:szCs w:val="22"/>
-          <w:lang w:val="en-US"/>
-        </w:rPr>
-        <w:t>Ved det første forsøg på at oprette forbindelse fra klient-PC’en til serveren blev forbindelsen afvist. Fejlmeddelelsen viste, at brugerens konto ikke var godkendt til Remote Desktop-logon.</w:t>
-      </w:r>
-    </w:p>
-    <w:p>
-      <w:pPr>
-        <w:shd w:val="clear" w:color="auto" w:fill="FFFFFF" w:themeFill="background1"/>
-        <w:spacing w:before="0" w:beforeAutospacing="off" w:after="200" w:afterAutospacing="off"/>
-      </w:pPr>
-      <w:r>
-        <w:rPr>
-          <w:rFonts w:ascii="Cambria" w:hAnsi="Cambria" w:eastAsia="Cambria" w:cs="Cambria"/>
-          <w:b w:val="0"/>
-          <w:bCs w:val="0"/>
-          <w:i w:val="0"/>
-          <w:iCs w:val="0"/>
-          <w:caps w:val="0"/>
-          <w:smallCaps w:val="0"/>
-          <w:noProof w:val="0"/>
-          <w:color w:val="000000" w:themeColor="text1" w:themeTint="FF" w:themeShade="FF"/>
-          <w:sz w:val="22"/>
-          <w:szCs w:val="22"/>
-          <w:lang w:val="en-US"/>
-        </w:rPr>
-        <w:t>Problemet var derfor ikke selve RDP-forbindelsen, men brugerens rettigheder til at logge på via Remote Desktop Services.</w:t>
-      </w:r>
-    </w:p>
-    <w:p>
-      <w:pPr>
-        <w:shd w:val="clear" w:color="auto" w:fill="FFFFFF" w:themeFill="background1"/>
-        <w:spacing w:before="200" w:beforeAutospacing="off" w:after="0" w:afterAutospacing="off"/>
-      </w:pPr>
+        <w:t xml:space="preserve"> 4</w:t>
+      </w:r>
       <w:r>
         <w:rPr>
           <w:rFonts w:ascii="Calibri" w:hAnsi="Calibri" w:eastAsia="Calibri" w:cs="Calibri"/>
@@ -8583,12 +10950,12 @@
           <w:caps w:val="0"/>
           <w:smallCaps w:val="0"/>
           <w:noProof w:val="0"/>
-          <w:color w:val="4F81BD" w:themeColor="accent1" w:themeTint="FF" w:themeShade="FF"/>
+          <w:color w:val="4F80BD"/>
           <w:sz w:val="26"/>
           <w:szCs w:val="26"/>
           <w:lang w:val="en-US"/>
         </w:rPr>
-        <w:t>Løsning</w:t>
+        <w:t xml:space="preserve"> -RDP</w:t>
       </w:r>
     </w:p>
     <w:p>
@@ -8611,7 +10978,7 @@
           <w:szCs w:val="22"/>
           <w:lang w:val="en-US"/>
         </w:rPr>
-        <w:t>For at løse problemet blev Group Policy kontrolleret. Indstillingen Allow log on through Remote Desktop Services blev åbnet under:</w:t>
+        <w:t>Problem</w:t>
       </w:r>
     </w:p>
     <w:p>
@@ -8634,7 +11001,7 @@
           <w:szCs w:val="22"/>
           <w:lang w:val="en-US"/>
         </w:rPr>
-        <w:t>Computer Configuration → Windows Settings → Security Settings → Local Policies → User Rights Assignment</w:t>
+        <w:t>Ved det første forsøg på at oprette forbindelse fra klient-PC’en til serveren blev forbindelsen afvist. Fejlmeddelelsen viste, at brugerens konto ikke var godkendt til Remote Desktop-logon.</w:t>
       </w:r>
     </w:p>
     <w:p>
@@ -8657,7 +11024,7 @@
           <w:szCs w:val="22"/>
           <w:lang w:val="en-US"/>
         </w:rPr>
-        <w:t>Den relevante bruger blev derefter tilføjet til denne policy. Efter at rettighederne var blevet opdateret, blev RDP-forbindelsen testet igen fra klient-PC’en.</w:t>
+        <w:t>Problemet var derfor ikke selve RDP-forbindelsen, men brugerens rettigheder til at logge på via Remote Desktop Services.</w:t>
       </w:r>
     </w:p>
     <w:p>
@@ -8680,7 +11047,7 @@
           <w:szCs w:val="26"/>
           <w:lang w:val="en-US"/>
         </w:rPr>
-        <w:t>Resultat</w:t>
+        <w:t>Løsning</w:t>
       </w:r>
     </w:p>
     <w:p>
@@ -8703,7 +11070,7 @@
           <w:szCs w:val="22"/>
           <w:lang w:val="en-US"/>
         </w:rPr>
-        <w:t>Efter ændringen kunne brugeren oprette forbindelse fra Windows 11-klienten til SRV01 via Remote Desktop. Forbindelsen blev gennemført med succes, og serverens skrivebord blev vist på klient-PC’en.</w:t>
+        <w:t>For at løse problemet blev Group Policy kontrolleret. Indstillingen Allow log on through Remote Desktop Services blev åbnet under:</w:t>
       </w:r>
     </w:p>
     <w:p>
@@ -8726,7 +11093,7 @@
           <w:szCs w:val="22"/>
           <w:lang w:val="en-US"/>
         </w:rPr>
-        <w:t>Forbindelse: Windows 11 Client → RDP → SRV01</w:t>
+        <w:t>Computer Configuration → Windows Settings → Security Settings → Local Policies → User Rights Assignment</w:t>
       </w:r>
     </w:p>
     <w:p>
@@ -8749,7 +11116,2117 @@
           <w:szCs w:val="22"/>
           <w:lang w:val="en-US"/>
         </w:rPr>
+        <w:t>Den relevante bruger blev derefter tilføjet til denne policy. Efter at rettighederne var blevet opdateret, blev RDP-forbindelsen testet igen fra klient-PC’en.</w:t>
+      </w:r>
+    </w:p>
+    <w:p>
+      <w:pPr>
+        <w:shd w:val="clear" w:color="auto" w:fill="FFFFFF" w:themeFill="background1"/>
+        <w:spacing w:before="200" w:beforeAutospacing="off" w:after="0" w:afterAutospacing="off"/>
+      </w:pPr>
+      <w:r>
+        <w:rPr>
+          <w:rFonts w:ascii="Calibri" w:hAnsi="Calibri" w:eastAsia="Calibri" w:cs="Calibri"/>
+          <w:b w:val="1"/>
+          <w:bCs w:val="1"/>
+          <w:i w:val="0"/>
+          <w:iCs w:val="0"/>
+          <w:caps w:val="0"/>
+          <w:smallCaps w:val="0"/>
+          <w:noProof w:val="0"/>
+          <w:color w:val="4F81BD" w:themeColor="accent1" w:themeTint="FF" w:themeShade="FF"/>
+          <w:sz w:val="26"/>
+          <w:szCs w:val="26"/>
+          <w:lang w:val="en-US"/>
+        </w:rPr>
+        <w:t>Resultat</w:t>
+      </w:r>
+    </w:p>
+    <w:p>
+      <w:pPr>
+        <w:shd w:val="clear" w:color="auto" w:fill="FFFFFF" w:themeFill="background1"/>
+        <w:spacing w:before="0" w:beforeAutospacing="off" w:after="200" w:afterAutospacing="off"/>
+      </w:pPr>
+      <w:r>
+        <w:rPr>
+          <w:rFonts w:ascii="Cambria" w:hAnsi="Cambria" w:eastAsia="Cambria" w:cs="Cambria"/>
+          <w:b w:val="0"/>
+          <w:bCs w:val="0"/>
+          <w:i w:val="0"/>
+          <w:iCs w:val="0"/>
+          <w:caps w:val="0"/>
+          <w:smallCaps w:val="0"/>
+          <w:noProof w:val="0"/>
+          <w:color w:val="000000" w:themeColor="text1" w:themeTint="FF" w:themeShade="FF"/>
+          <w:sz w:val="22"/>
+          <w:szCs w:val="22"/>
+          <w:lang w:val="en-US"/>
+        </w:rPr>
+        <w:t>Efter ændringen kunne brugeren oprette forbindelse fra Windows 11-klienten til SRV01 via Remote Desktop. Forbindelsen blev gennemført med succes, og serverens skrivebord blev vist på klient-PC’en.</w:t>
+      </w:r>
+    </w:p>
+    <w:p>
+      <w:pPr>
+        <w:shd w:val="clear" w:color="auto" w:fill="FFFFFF" w:themeFill="background1"/>
+        <w:spacing w:before="0" w:beforeAutospacing="off" w:after="200" w:afterAutospacing="off"/>
+      </w:pPr>
+      <w:r>
+        <w:rPr>
+          <w:rFonts w:ascii="Cambria" w:hAnsi="Cambria" w:eastAsia="Cambria" w:cs="Cambria"/>
+          <w:b w:val="0"/>
+          <w:bCs w:val="0"/>
+          <w:i w:val="0"/>
+          <w:iCs w:val="0"/>
+          <w:caps w:val="0"/>
+          <w:smallCaps w:val="0"/>
+          <w:noProof w:val="0"/>
+          <w:color w:val="000000" w:themeColor="text1" w:themeTint="FF" w:themeShade="FF"/>
+          <w:sz w:val="22"/>
+          <w:szCs w:val="22"/>
+          <w:lang w:val="en-US"/>
+        </w:rPr>
+        <w:t>Forbindelse: Windows 11 Client → RDP → SRV01</w:t>
+      </w:r>
+    </w:p>
+    <w:p>
+      <w:pPr>
+        <w:shd w:val="clear" w:color="auto" w:fill="FFFFFF" w:themeFill="background1"/>
+        <w:spacing w:before="0" w:beforeAutospacing="off" w:after="200" w:afterAutospacing="off"/>
+      </w:pPr>
+      <w:r>
+        <w:rPr>
+          <w:rFonts w:ascii="Cambria" w:hAnsi="Cambria" w:eastAsia="Cambria" w:cs="Cambria"/>
+          <w:b w:val="0"/>
+          <w:bCs w:val="0"/>
+          <w:i w:val="0"/>
+          <w:iCs w:val="0"/>
+          <w:caps w:val="0"/>
+          <w:smallCaps w:val="0"/>
+          <w:noProof w:val="0"/>
+          <w:color w:val="000000" w:themeColor="text1" w:themeTint="FF" w:themeShade="FF"/>
+          <w:sz w:val="22"/>
+          <w:szCs w:val="22"/>
+          <w:lang w:val="en-US"/>
+        </w:rPr>
         <w:t>Dette dokumenterer, at kravet om en fungerende RDP-forbindelse fra klient-PC’en til SERVER er opfyldt.</w:t>
+      </w:r>
+    </w:p>
+    <w:p>
+      <w:pPr>
+        <w:pStyle w:val="Heading1"/>
+        <w:spacing w:before="480" w:beforeAutospacing="off" w:after="0" w:afterAutospacing="off" w:line="276" w:lineRule="auto"/>
+        <w:rPr>
+          <w:rFonts w:ascii="Calibri" w:hAnsi="Calibri" w:eastAsia="Calibri" w:cs="Calibri" w:asciiTheme="majorAscii" w:hAnsiTheme="majorAscii" w:eastAsiaTheme="majorAscii" w:cstheme="majorAscii"/>
+          <w:b w:val="0"/>
+          <w:bCs w:val="0"/>
+          <w:noProof w:val="0"/>
+          <w:color w:val="365F91" w:themeColor="accent1" w:themeTint="FF" w:themeShade="BF"/>
+          <w:sz w:val="22"/>
+          <w:szCs w:val="22"/>
+          <w:lang w:val="en-US"/>
+        </w:rPr>
+      </w:pPr>
+      <w:r>
+        <w:rPr>
+          <w:rFonts w:ascii="Calibri" w:hAnsi="Calibri" w:eastAsia="Calibri" w:cs="Calibri" w:asciiTheme="majorAscii" w:hAnsiTheme="majorAscii" w:eastAsiaTheme="majorAscii" w:cstheme="majorAscii"/>
+          <w:b w:val="0"/>
+          <w:bCs w:val="0"/>
+          <w:noProof w:val="0"/>
+          <w:color w:val="365F91" w:themeColor="accent1" w:themeTint="FF" w:themeShade="BF"/>
+          <w:sz w:val="22"/>
+          <w:szCs w:val="22"/>
+          <w:lang w:val="en-US"/>
+        </w:rPr>
+        <w:t>Udfordringe</w:t>
+      </w:r>
+      <w:r>
+        <w:rPr>
+          <w:rFonts w:ascii="Calibri" w:hAnsi="Calibri" w:eastAsia="Calibri" w:cs="Calibri" w:asciiTheme="majorAscii" w:hAnsiTheme="majorAscii" w:eastAsiaTheme="majorAscii" w:cstheme="majorAscii"/>
+          <w:b w:val="0"/>
+          <w:bCs w:val="0"/>
+          <w:noProof w:val="0"/>
+          <w:color w:val="365F91" w:themeColor="accent1" w:themeTint="FF" w:themeShade="BF"/>
+          <w:sz w:val="22"/>
+          <w:szCs w:val="22"/>
+          <w:lang w:val="en-US"/>
+        </w:rPr>
+        <w:t xml:space="preserve"> 5.</w:t>
+      </w:r>
+      <w:r>
+        <w:rPr>
+          <w:rFonts w:ascii="Calibri" w:hAnsi="Calibri" w:eastAsia="Calibri" w:cs="Calibri" w:asciiTheme="majorAscii" w:hAnsiTheme="majorAscii" w:eastAsiaTheme="majorAscii" w:cstheme="majorAscii"/>
+          <w:b w:val="0"/>
+          <w:bCs w:val="0"/>
+          <w:noProof w:val="0"/>
+          <w:color w:val="365F91" w:themeColor="accent1" w:themeTint="FF" w:themeShade="BF"/>
+          <w:sz w:val="22"/>
+          <w:szCs w:val="22"/>
+          <w:lang w:val="en-US"/>
+        </w:rPr>
+        <w:t>V</w:t>
+      </w:r>
+      <w:r>
+        <w:rPr>
+          <w:rFonts w:ascii="Calibri" w:hAnsi="Calibri" w:eastAsia="Calibri" w:cs="Calibri" w:asciiTheme="majorAscii" w:hAnsiTheme="majorAscii" w:eastAsiaTheme="majorAscii" w:cstheme="majorAscii"/>
+          <w:b w:val="0"/>
+          <w:bCs w:val="0"/>
+          <w:noProof w:val="0"/>
+          <w:color w:val="365F91" w:themeColor="accent1" w:themeTint="FF" w:themeShade="BF"/>
+          <w:sz w:val="22"/>
+          <w:szCs w:val="22"/>
+          <w:lang w:val="en-US"/>
+        </w:rPr>
+        <w:t xml:space="preserve">PN </w:t>
+      </w:r>
+    </w:p>
+    <w:p>
+      <w:pPr>
+        <w:pStyle w:val="Heading2"/>
+        <w:suppressLineNumbers w:val="0"/>
+        <w:bidi w:val="0"/>
+        <w:spacing w:before="200" w:beforeAutospacing="off" w:after="0" w:afterAutospacing="off" w:line="276" w:lineRule="auto"/>
+        <w:ind w:left="0" w:right="0"/>
+        <w:jc w:val="left"/>
+        <w:rPr>
+          <w:rFonts w:ascii="Calibri" w:hAnsi="Calibri" w:eastAsia="Calibri" w:cs="Calibri" w:asciiTheme="majorAscii" w:hAnsiTheme="majorAscii" w:eastAsiaTheme="majorAscii" w:cstheme="majorAscii"/>
+          <w:b w:val="0"/>
+          <w:bCs w:val="0"/>
+          <w:noProof w:val="0"/>
+          <w:color w:val="4F81BD" w:themeColor="accent1" w:themeTint="FF" w:themeShade="FF"/>
+          <w:sz w:val="22"/>
+          <w:szCs w:val="22"/>
+          <w:lang w:val="en-US"/>
+        </w:rPr>
+      </w:pPr>
+      <w:r>
+        <w:rPr>
+          <w:rFonts w:ascii="Calibri" w:hAnsi="Calibri" w:eastAsia="Calibri" w:cs="Calibri" w:asciiTheme="majorAscii" w:hAnsiTheme="majorAscii" w:eastAsiaTheme="majorAscii" w:cstheme="majorAscii"/>
+          <w:b w:val="0"/>
+          <w:bCs w:val="0"/>
+          <w:noProof w:val="0"/>
+          <w:color w:val="4F81BD" w:themeColor="accent1" w:themeTint="FF" w:themeShade="FF"/>
+          <w:sz w:val="22"/>
+          <w:szCs w:val="22"/>
+          <w:lang w:val="en-US"/>
+        </w:rPr>
+        <w:t xml:space="preserve"> – RRAS </w:t>
+      </w:r>
+      <w:r>
+        <w:rPr>
+          <w:rFonts w:ascii="Calibri" w:hAnsi="Calibri" w:eastAsia="Calibri" w:cs="Calibri" w:asciiTheme="majorAscii" w:hAnsiTheme="majorAscii" w:eastAsiaTheme="majorAscii" w:cstheme="majorAscii"/>
+          <w:b w:val="0"/>
+          <w:bCs w:val="0"/>
+          <w:noProof w:val="0"/>
+          <w:color w:val="4F81BD" w:themeColor="accent1" w:themeTint="FF" w:themeShade="FF"/>
+          <w:sz w:val="22"/>
+          <w:szCs w:val="22"/>
+          <w:lang w:val="en-US"/>
+        </w:rPr>
+        <w:t>kunne</w:t>
+      </w:r>
+      <w:r>
+        <w:rPr>
+          <w:rFonts w:ascii="Calibri" w:hAnsi="Calibri" w:eastAsia="Calibri" w:cs="Calibri" w:asciiTheme="majorAscii" w:hAnsiTheme="majorAscii" w:eastAsiaTheme="majorAscii" w:cstheme="majorAscii"/>
+          <w:b w:val="0"/>
+          <w:bCs w:val="0"/>
+          <w:noProof w:val="0"/>
+          <w:color w:val="4F81BD" w:themeColor="accent1" w:themeTint="FF" w:themeShade="FF"/>
+          <w:sz w:val="22"/>
+          <w:szCs w:val="22"/>
+          <w:lang w:val="en-US"/>
+        </w:rPr>
+        <w:t xml:space="preserve"> </w:t>
+      </w:r>
+      <w:r>
+        <w:rPr>
+          <w:rFonts w:ascii="Calibri" w:hAnsi="Calibri" w:eastAsia="Calibri" w:cs="Calibri" w:asciiTheme="majorAscii" w:hAnsiTheme="majorAscii" w:eastAsiaTheme="majorAscii" w:cstheme="majorAscii"/>
+          <w:b w:val="0"/>
+          <w:bCs w:val="0"/>
+          <w:noProof w:val="0"/>
+          <w:color w:val="4F81BD" w:themeColor="accent1" w:themeTint="FF" w:themeShade="FF"/>
+          <w:sz w:val="22"/>
+          <w:szCs w:val="22"/>
+          <w:lang w:val="en-US"/>
+        </w:rPr>
+        <w:t>ikke</w:t>
+      </w:r>
+      <w:r>
+        <w:rPr>
+          <w:rFonts w:ascii="Calibri" w:hAnsi="Calibri" w:eastAsia="Calibri" w:cs="Calibri" w:asciiTheme="majorAscii" w:hAnsiTheme="majorAscii" w:eastAsiaTheme="majorAscii" w:cstheme="majorAscii"/>
+          <w:b w:val="0"/>
+          <w:bCs w:val="0"/>
+          <w:noProof w:val="0"/>
+          <w:color w:val="4F81BD" w:themeColor="accent1" w:themeTint="FF" w:themeShade="FF"/>
+          <w:sz w:val="22"/>
+          <w:szCs w:val="22"/>
+          <w:lang w:val="en-US"/>
+        </w:rPr>
+        <w:t xml:space="preserve"> </w:t>
+      </w:r>
+      <w:r>
+        <w:rPr>
+          <w:rFonts w:ascii="Calibri" w:hAnsi="Calibri" w:eastAsia="Calibri" w:cs="Calibri" w:asciiTheme="majorAscii" w:hAnsiTheme="majorAscii" w:eastAsiaTheme="majorAscii" w:cstheme="majorAscii"/>
+          <w:b w:val="0"/>
+          <w:bCs w:val="0"/>
+          <w:noProof w:val="0"/>
+          <w:color w:val="4F81BD" w:themeColor="accent1" w:themeTint="FF" w:themeShade="FF"/>
+          <w:sz w:val="22"/>
+          <w:szCs w:val="22"/>
+          <w:lang w:val="en-US"/>
+        </w:rPr>
+        <w:t>konfigureres</w:t>
+      </w:r>
+    </w:p>
+    <w:p>
+      <w:pPr>
+        <w:pStyle w:val="Heading3"/>
+        <w:spacing w:before="200" w:beforeAutospacing="off" w:after="0" w:afterAutospacing="off" w:line="276" w:lineRule="auto"/>
+        <w:rPr>
+          <w:rFonts w:ascii="Calibri" w:hAnsi="Calibri" w:eastAsia="Calibri" w:cs="Calibri" w:asciiTheme="majorAscii" w:hAnsiTheme="majorAscii" w:eastAsiaTheme="majorAscii" w:cstheme="majorAscii"/>
+          <w:b w:val="0"/>
+          <w:bCs w:val="0"/>
+          <w:noProof w:val="0"/>
+          <w:color w:val="4F81BD" w:themeColor="accent1" w:themeTint="FF" w:themeShade="FF"/>
+          <w:sz w:val="22"/>
+          <w:szCs w:val="22"/>
+          <w:lang w:val="en-US"/>
+        </w:rPr>
+      </w:pPr>
+      <w:r>
+        <w:rPr>
+          <w:rFonts w:ascii="Calibri" w:hAnsi="Calibri" w:eastAsia="Calibri" w:cs="Calibri" w:asciiTheme="majorAscii" w:hAnsiTheme="majorAscii" w:eastAsiaTheme="majorAscii" w:cstheme="majorAscii"/>
+          <w:b w:val="0"/>
+          <w:bCs w:val="0"/>
+          <w:noProof w:val="0"/>
+          <w:color w:val="4F81BD" w:themeColor="accent1" w:themeTint="FF" w:themeShade="FF"/>
+          <w:sz w:val="22"/>
+          <w:szCs w:val="22"/>
+          <w:lang w:val="en-US"/>
+        </w:rPr>
+        <w:t>Problem</w:t>
+      </w:r>
+    </w:p>
+    <w:p>
+      <w:pPr>
+        <w:spacing w:before="0" w:beforeAutospacing="off" w:after="200" w:afterAutospacing="off" w:line="276" w:lineRule="auto"/>
+        <w:rPr>
+          <w:rFonts w:ascii="Calibri" w:hAnsi="Calibri" w:eastAsia="Calibri" w:cs="Calibri" w:asciiTheme="majorAscii" w:hAnsiTheme="majorAscii" w:eastAsiaTheme="majorAscii" w:cstheme="majorAscii"/>
+          <w:b w:val="0"/>
+          <w:bCs w:val="0"/>
+          <w:noProof w:val="0"/>
+          <w:sz w:val="22"/>
+          <w:szCs w:val="22"/>
+          <w:lang w:val="en-US"/>
+        </w:rPr>
+      </w:pPr>
+      <w:r>
+        <w:rPr>
+          <w:rFonts w:ascii="Calibri" w:hAnsi="Calibri" w:eastAsia="Calibri" w:cs="Calibri" w:asciiTheme="majorAscii" w:hAnsiTheme="majorAscii" w:eastAsiaTheme="majorAscii" w:cstheme="majorAscii"/>
+          <w:b w:val="0"/>
+          <w:bCs w:val="0"/>
+          <w:noProof w:val="0"/>
+          <w:sz w:val="22"/>
+          <w:szCs w:val="22"/>
+          <w:lang w:val="en-US"/>
+        </w:rPr>
+        <w:t>Ved første forsøg på at konfigurere Routing and Remote Access (RRAS) mislykkedes konfigurationen med fejlen:</w:t>
+      </w:r>
+    </w:p>
+    <w:p>
+      <w:pPr>
+        <w:spacing w:before="0" w:beforeAutospacing="off" w:after="200" w:afterAutospacing="off" w:line="276" w:lineRule="auto"/>
+        <w:rPr>
+          <w:rFonts w:ascii="Calibri" w:hAnsi="Calibri" w:eastAsia="Calibri" w:cs="Calibri" w:asciiTheme="majorAscii" w:hAnsiTheme="majorAscii" w:eastAsiaTheme="majorAscii" w:cstheme="majorAscii"/>
+          <w:b w:val="0"/>
+          <w:bCs w:val="0"/>
+          <w:noProof w:val="0"/>
+          <w:sz w:val="22"/>
+          <w:szCs w:val="22"/>
+          <w:lang w:val="en-US"/>
+        </w:rPr>
+      </w:pPr>
+      <w:r>
+        <w:rPr>
+          <w:rFonts w:ascii="Calibri" w:hAnsi="Calibri" w:eastAsia="Calibri" w:cs="Calibri" w:asciiTheme="majorAscii" w:hAnsiTheme="majorAscii" w:eastAsiaTheme="majorAscii" w:cstheme="majorAscii"/>
+          <w:b w:val="0"/>
+          <w:bCs w:val="0"/>
+          <w:noProof w:val="0"/>
+          <w:sz w:val="22"/>
+          <w:szCs w:val="22"/>
+          <w:lang w:val="en-US"/>
+        </w:rPr>
+        <w:t>Class not registered (80040154)</w:t>
+      </w:r>
+    </w:p>
+    <w:p>
+      <w:pPr>
+        <w:pStyle w:val="Heading3"/>
+        <w:spacing w:before="200" w:beforeAutospacing="off" w:after="0" w:afterAutospacing="off" w:line="276" w:lineRule="auto"/>
+        <w:rPr>
+          <w:rFonts w:ascii="Calibri" w:hAnsi="Calibri" w:eastAsia="Calibri" w:cs="Calibri" w:asciiTheme="majorAscii" w:hAnsiTheme="majorAscii" w:eastAsiaTheme="majorAscii" w:cstheme="majorAscii"/>
+          <w:b w:val="0"/>
+          <w:bCs w:val="0"/>
+          <w:noProof w:val="0"/>
+          <w:color w:val="4F81BD" w:themeColor="accent1" w:themeTint="FF" w:themeShade="FF"/>
+          <w:sz w:val="22"/>
+          <w:szCs w:val="22"/>
+          <w:lang w:val="en-US"/>
+        </w:rPr>
+      </w:pPr>
+      <w:r>
+        <w:rPr>
+          <w:rFonts w:ascii="Calibri" w:hAnsi="Calibri" w:eastAsia="Calibri" w:cs="Calibri" w:asciiTheme="majorAscii" w:hAnsiTheme="majorAscii" w:eastAsiaTheme="majorAscii" w:cstheme="majorAscii"/>
+          <w:b w:val="0"/>
+          <w:bCs w:val="0"/>
+          <w:noProof w:val="0"/>
+          <w:color w:val="4F81BD" w:themeColor="accent1" w:themeTint="FF" w:themeShade="FF"/>
+          <w:sz w:val="22"/>
+          <w:szCs w:val="22"/>
+          <w:lang w:val="en-US"/>
+        </w:rPr>
+        <w:t>Årsag</w:t>
+      </w:r>
+    </w:p>
+    <w:p>
+      <w:pPr>
+        <w:spacing w:before="0" w:beforeAutospacing="off" w:after="200" w:afterAutospacing="off" w:line="276" w:lineRule="auto"/>
+        <w:rPr>
+          <w:rFonts w:ascii="Calibri" w:hAnsi="Calibri" w:eastAsia="Calibri" w:cs="Calibri" w:asciiTheme="majorAscii" w:hAnsiTheme="majorAscii" w:eastAsiaTheme="majorAscii" w:cstheme="majorAscii"/>
+          <w:b w:val="0"/>
+          <w:bCs w:val="0"/>
+          <w:noProof w:val="0"/>
+          <w:sz w:val="22"/>
+          <w:szCs w:val="22"/>
+          <w:lang w:val="en-US"/>
+        </w:rPr>
+      </w:pPr>
+      <w:r>
+        <w:rPr>
+          <w:rFonts w:ascii="Calibri" w:hAnsi="Calibri" w:eastAsia="Calibri" w:cs="Calibri" w:asciiTheme="majorAscii" w:hAnsiTheme="majorAscii" w:eastAsiaTheme="majorAscii" w:cstheme="majorAscii"/>
+          <w:b w:val="0"/>
+          <w:bCs w:val="0"/>
+          <w:noProof w:val="0"/>
+          <w:sz w:val="22"/>
+          <w:szCs w:val="22"/>
+          <w:lang w:val="en-US"/>
+        </w:rPr>
+        <w:t>Remote Access/RRAS-komponenterne var ikke installeret eller registreret korrekt på serveren.</w:t>
+      </w:r>
+    </w:p>
+    <w:p>
+      <w:pPr>
+        <w:pStyle w:val="Heading3"/>
+        <w:spacing w:before="200" w:beforeAutospacing="off" w:after="0" w:afterAutospacing="off" w:line="276" w:lineRule="auto"/>
+        <w:rPr>
+          <w:rFonts w:ascii="Calibri" w:hAnsi="Calibri" w:eastAsia="Calibri" w:cs="Calibri" w:asciiTheme="majorAscii" w:hAnsiTheme="majorAscii" w:eastAsiaTheme="majorAscii" w:cstheme="majorAscii"/>
+          <w:b w:val="0"/>
+          <w:bCs w:val="0"/>
+          <w:noProof w:val="0"/>
+          <w:color w:val="4F81BD" w:themeColor="accent1" w:themeTint="FF" w:themeShade="FF"/>
+          <w:sz w:val="22"/>
+          <w:szCs w:val="22"/>
+          <w:lang w:val="en-US"/>
+        </w:rPr>
+      </w:pPr>
+      <w:r>
+        <w:rPr>
+          <w:rFonts w:ascii="Calibri" w:hAnsi="Calibri" w:eastAsia="Calibri" w:cs="Calibri" w:asciiTheme="majorAscii" w:hAnsiTheme="majorAscii" w:eastAsiaTheme="majorAscii" w:cstheme="majorAscii"/>
+          <w:b w:val="0"/>
+          <w:bCs w:val="0"/>
+          <w:noProof w:val="0"/>
+          <w:color w:val="4F81BD" w:themeColor="accent1" w:themeTint="FF" w:themeShade="FF"/>
+          <w:sz w:val="22"/>
+          <w:szCs w:val="22"/>
+          <w:lang w:val="en-US"/>
+        </w:rPr>
+        <w:t>Løsning</w:t>
+      </w:r>
+    </w:p>
+    <w:p>
+      <w:pPr>
+        <w:spacing w:before="0" w:beforeAutospacing="off" w:after="200" w:afterAutospacing="off" w:line="276" w:lineRule="auto"/>
+        <w:rPr>
+          <w:rFonts w:ascii="Calibri" w:hAnsi="Calibri" w:eastAsia="Calibri" w:cs="Calibri" w:asciiTheme="majorAscii" w:hAnsiTheme="majorAscii" w:eastAsiaTheme="majorAscii" w:cstheme="majorAscii"/>
+          <w:b w:val="0"/>
+          <w:bCs w:val="0"/>
+          <w:noProof w:val="0"/>
+          <w:sz w:val="22"/>
+          <w:szCs w:val="22"/>
+          <w:lang w:val="en-US"/>
+        </w:rPr>
+      </w:pPr>
+      <w:r>
+        <w:rPr>
+          <w:rFonts w:ascii="Calibri" w:hAnsi="Calibri" w:eastAsia="Calibri" w:cs="Calibri" w:asciiTheme="majorAscii" w:hAnsiTheme="majorAscii" w:eastAsiaTheme="majorAscii" w:cstheme="majorAscii"/>
+          <w:b w:val="0"/>
+          <w:bCs w:val="0"/>
+          <w:noProof w:val="0"/>
+          <w:sz w:val="22"/>
+          <w:szCs w:val="22"/>
+          <w:lang w:val="en-US"/>
+        </w:rPr>
+        <w:t>Remote Access-rollen blev fjernet og derefter installeret igen via:</w:t>
+      </w:r>
+    </w:p>
+    <w:p>
+      <w:pPr>
+        <w:spacing w:before="0" w:beforeAutospacing="off" w:after="200" w:afterAutospacing="off" w:line="276" w:lineRule="auto"/>
+        <w:rPr>
+          <w:rFonts w:ascii="Calibri" w:hAnsi="Calibri" w:eastAsia="Calibri" w:cs="Calibri" w:asciiTheme="majorAscii" w:hAnsiTheme="majorAscii" w:eastAsiaTheme="majorAscii" w:cstheme="majorAscii"/>
+          <w:b w:val="0"/>
+          <w:bCs w:val="0"/>
+          <w:noProof w:val="0"/>
+          <w:sz w:val="22"/>
+          <w:szCs w:val="22"/>
+          <w:lang w:val="en-US"/>
+        </w:rPr>
+      </w:pPr>
+      <w:r>
+        <w:rPr>
+          <w:rFonts w:ascii="Calibri" w:hAnsi="Calibri" w:eastAsia="Calibri" w:cs="Calibri" w:asciiTheme="majorAscii" w:hAnsiTheme="majorAscii" w:eastAsiaTheme="majorAscii" w:cstheme="majorAscii"/>
+          <w:b w:val="0"/>
+          <w:bCs w:val="0"/>
+          <w:noProof w:val="0"/>
+          <w:sz w:val="22"/>
+          <w:szCs w:val="22"/>
+          <w:lang w:val="en-US"/>
+        </w:rPr>
+        <w:t>Server Manager → Add Roles and Features → Remote Access</w:t>
+      </w:r>
+    </w:p>
+    <w:p>
+      <w:pPr>
+        <w:spacing w:before="0" w:beforeAutospacing="off" w:after="200" w:afterAutospacing="off" w:line="276" w:lineRule="auto"/>
+        <w:rPr>
+          <w:rFonts w:ascii="Calibri" w:hAnsi="Calibri" w:eastAsia="Calibri" w:cs="Calibri" w:asciiTheme="majorAscii" w:hAnsiTheme="majorAscii" w:eastAsiaTheme="majorAscii" w:cstheme="majorAscii"/>
+          <w:b w:val="0"/>
+          <w:bCs w:val="0"/>
+          <w:noProof w:val="0"/>
+          <w:sz w:val="22"/>
+          <w:szCs w:val="22"/>
+          <w:lang w:val="en-US"/>
+        </w:rPr>
+      </w:pPr>
+      <w:r>
+        <w:rPr>
+          <w:rFonts w:ascii="Calibri" w:hAnsi="Calibri" w:eastAsia="Calibri" w:cs="Calibri" w:asciiTheme="majorAscii" w:hAnsiTheme="majorAscii" w:eastAsiaTheme="majorAscii" w:cstheme="majorAscii"/>
+          <w:b w:val="0"/>
+          <w:bCs w:val="0"/>
+          <w:noProof w:val="0"/>
+          <w:sz w:val="22"/>
+          <w:szCs w:val="22"/>
+          <w:lang w:val="en-US"/>
+        </w:rPr>
+        <w:t>Under Role Services blev DirectAccess and VPN (RAS) samt Routing installeret.</w:t>
+      </w:r>
+    </w:p>
+    <w:p>
+      <w:pPr>
+        <w:pStyle w:val="Heading3"/>
+        <w:spacing w:before="200" w:beforeAutospacing="off" w:after="0" w:afterAutospacing="off" w:line="276" w:lineRule="auto"/>
+        <w:rPr>
+          <w:rFonts w:ascii="Calibri" w:hAnsi="Calibri" w:eastAsia="Calibri" w:cs="Calibri" w:asciiTheme="majorAscii" w:hAnsiTheme="majorAscii" w:eastAsiaTheme="majorAscii" w:cstheme="majorAscii"/>
+          <w:b w:val="0"/>
+          <w:bCs w:val="0"/>
+          <w:noProof w:val="0"/>
+          <w:color w:val="4F81BD" w:themeColor="accent1" w:themeTint="FF" w:themeShade="FF"/>
+          <w:sz w:val="22"/>
+          <w:szCs w:val="22"/>
+          <w:lang w:val="en-US"/>
+        </w:rPr>
+      </w:pPr>
+      <w:r>
+        <w:rPr>
+          <w:rFonts w:ascii="Calibri" w:hAnsi="Calibri" w:eastAsia="Calibri" w:cs="Calibri" w:asciiTheme="majorAscii" w:hAnsiTheme="majorAscii" w:eastAsiaTheme="majorAscii" w:cstheme="majorAscii"/>
+          <w:b w:val="0"/>
+          <w:bCs w:val="0"/>
+          <w:noProof w:val="0"/>
+          <w:color w:val="4F81BD" w:themeColor="accent1" w:themeTint="FF" w:themeShade="FF"/>
+          <w:sz w:val="22"/>
+          <w:szCs w:val="22"/>
+          <w:lang w:val="en-US"/>
+        </w:rPr>
+        <w:t>Resultat</w:t>
+      </w:r>
+    </w:p>
+    <w:p>
+      <w:pPr>
+        <w:spacing w:before="0" w:beforeAutospacing="off" w:after="200" w:afterAutospacing="off" w:line="276" w:lineRule="auto"/>
+        <w:rPr>
+          <w:rFonts w:ascii="Calibri" w:hAnsi="Calibri" w:eastAsia="Calibri" w:cs="Calibri" w:asciiTheme="majorAscii" w:hAnsiTheme="majorAscii" w:eastAsiaTheme="majorAscii" w:cstheme="majorAscii"/>
+          <w:b w:val="0"/>
+          <w:bCs w:val="0"/>
+          <w:noProof w:val="0"/>
+          <w:sz w:val="22"/>
+          <w:szCs w:val="22"/>
+          <w:lang w:val="en-US"/>
+        </w:rPr>
+      </w:pPr>
+      <w:r>
+        <w:rPr>
+          <w:rFonts w:ascii="Calibri" w:hAnsi="Calibri" w:eastAsia="Calibri" w:cs="Calibri" w:asciiTheme="majorAscii" w:hAnsiTheme="majorAscii" w:eastAsiaTheme="majorAscii" w:cstheme="majorAscii"/>
+          <w:b w:val="0"/>
+          <w:bCs w:val="0"/>
+          <w:noProof w:val="0"/>
+          <w:sz w:val="22"/>
+          <w:szCs w:val="22"/>
+          <w:lang w:val="en-US"/>
+        </w:rPr>
+        <w:t>Installationen blev gennemført korrekt, og RRAS kunne efterfølgende startes og konfigureres.</w:t>
+      </w:r>
+    </w:p>
+    <w:p>
+      <w:pPr>
+        <w:pStyle w:val="Heading2"/>
+        <w:spacing w:before="200" w:beforeAutospacing="off" w:after="0" w:afterAutospacing="off" w:line="276" w:lineRule="auto"/>
+        <w:rPr>
+          <w:rFonts w:ascii="Calibri" w:hAnsi="Calibri" w:eastAsia="Calibri" w:cs="Calibri" w:asciiTheme="majorAscii" w:hAnsiTheme="majorAscii" w:eastAsiaTheme="majorAscii" w:cstheme="majorAscii"/>
+          <w:b w:val="0"/>
+          <w:bCs w:val="0"/>
+          <w:noProof w:val="0"/>
+          <w:color w:val="4F81BD" w:themeColor="accent1" w:themeTint="FF" w:themeShade="FF"/>
+          <w:sz w:val="22"/>
+          <w:szCs w:val="22"/>
+          <w:lang w:val="en-US"/>
+        </w:rPr>
+      </w:pPr>
+      <w:r>
+        <w:rPr>
+          <w:rFonts w:ascii="Calibri" w:hAnsi="Calibri" w:eastAsia="Calibri" w:cs="Calibri" w:asciiTheme="majorAscii" w:hAnsiTheme="majorAscii" w:eastAsiaTheme="majorAscii" w:cstheme="majorAscii"/>
+          <w:b w:val="0"/>
+          <w:bCs w:val="0"/>
+          <w:noProof w:val="0"/>
+          <w:color w:val="4F81BD" w:themeColor="accent1" w:themeTint="FF" w:themeShade="FF"/>
+          <w:sz w:val="22"/>
+          <w:szCs w:val="22"/>
+          <w:lang w:val="en-US"/>
+        </w:rPr>
+        <w:t>– VPN-</w:t>
+      </w:r>
+      <w:r>
+        <w:rPr>
+          <w:rFonts w:ascii="Calibri" w:hAnsi="Calibri" w:eastAsia="Calibri" w:cs="Calibri" w:asciiTheme="majorAscii" w:hAnsiTheme="majorAscii" w:eastAsiaTheme="majorAscii" w:cstheme="majorAscii"/>
+          <w:b w:val="0"/>
+          <w:bCs w:val="0"/>
+          <w:noProof w:val="0"/>
+          <w:color w:val="4F81BD" w:themeColor="accent1" w:themeTint="FF" w:themeShade="FF"/>
+          <w:sz w:val="22"/>
+          <w:szCs w:val="22"/>
+          <w:lang w:val="en-US"/>
+        </w:rPr>
+        <w:t>porte</w:t>
+      </w:r>
+      <w:r>
+        <w:rPr>
+          <w:rFonts w:ascii="Calibri" w:hAnsi="Calibri" w:eastAsia="Calibri" w:cs="Calibri" w:asciiTheme="majorAscii" w:hAnsiTheme="majorAscii" w:eastAsiaTheme="majorAscii" w:cstheme="majorAscii"/>
+          <w:b w:val="0"/>
+          <w:bCs w:val="0"/>
+          <w:noProof w:val="0"/>
+          <w:color w:val="4F81BD" w:themeColor="accent1" w:themeTint="FF" w:themeShade="FF"/>
+          <w:sz w:val="22"/>
+          <w:szCs w:val="22"/>
+          <w:lang w:val="en-US"/>
+        </w:rPr>
+        <w:t xml:space="preserve"> var </w:t>
+      </w:r>
+      <w:r>
+        <w:rPr>
+          <w:rFonts w:ascii="Calibri" w:hAnsi="Calibri" w:eastAsia="Calibri" w:cs="Calibri" w:asciiTheme="majorAscii" w:hAnsiTheme="majorAscii" w:eastAsiaTheme="majorAscii" w:cstheme="majorAscii"/>
+          <w:b w:val="0"/>
+          <w:bCs w:val="0"/>
+          <w:noProof w:val="0"/>
+          <w:color w:val="4F81BD" w:themeColor="accent1" w:themeTint="FF" w:themeShade="FF"/>
+          <w:sz w:val="22"/>
+          <w:szCs w:val="22"/>
+          <w:lang w:val="en-US"/>
+        </w:rPr>
+        <w:t>blokeret</w:t>
+      </w:r>
+      <w:r>
+        <w:rPr>
+          <w:rFonts w:ascii="Calibri" w:hAnsi="Calibri" w:eastAsia="Calibri" w:cs="Calibri" w:asciiTheme="majorAscii" w:hAnsiTheme="majorAscii" w:eastAsiaTheme="majorAscii" w:cstheme="majorAscii"/>
+          <w:b w:val="0"/>
+          <w:bCs w:val="0"/>
+          <w:noProof w:val="0"/>
+          <w:color w:val="4F81BD" w:themeColor="accent1" w:themeTint="FF" w:themeShade="FF"/>
+          <w:sz w:val="22"/>
+          <w:szCs w:val="22"/>
+          <w:lang w:val="en-US"/>
+        </w:rPr>
+        <w:t xml:space="preserve"> </w:t>
+      </w:r>
+      <w:r>
+        <w:rPr>
+          <w:rFonts w:ascii="Calibri" w:hAnsi="Calibri" w:eastAsia="Calibri" w:cs="Calibri" w:asciiTheme="majorAscii" w:hAnsiTheme="majorAscii" w:eastAsiaTheme="majorAscii" w:cstheme="majorAscii"/>
+          <w:b w:val="0"/>
+          <w:bCs w:val="0"/>
+          <w:noProof w:val="0"/>
+          <w:color w:val="4F81BD" w:themeColor="accent1" w:themeTint="FF" w:themeShade="FF"/>
+          <w:sz w:val="22"/>
+          <w:szCs w:val="22"/>
+          <w:lang w:val="en-US"/>
+        </w:rPr>
+        <w:t>af</w:t>
+      </w:r>
+      <w:r>
+        <w:rPr>
+          <w:rFonts w:ascii="Calibri" w:hAnsi="Calibri" w:eastAsia="Calibri" w:cs="Calibri" w:asciiTheme="majorAscii" w:hAnsiTheme="majorAscii" w:eastAsiaTheme="majorAscii" w:cstheme="majorAscii"/>
+          <w:b w:val="0"/>
+          <w:bCs w:val="0"/>
+          <w:noProof w:val="0"/>
+          <w:color w:val="4F81BD" w:themeColor="accent1" w:themeTint="FF" w:themeShade="FF"/>
+          <w:sz w:val="22"/>
+          <w:szCs w:val="22"/>
+          <w:lang w:val="en-US"/>
+        </w:rPr>
+        <w:t xml:space="preserve"> Windows Firewall</w:t>
+      </w:r>
+    </w:p>
+    <w:p>
+      <w:pPr>
+        <w:pStyle w:val="Heading3"/>
+        <w:spacing w:before="200" w:beforeAutospacing="off" w:after="0" w:afterAutospacing="off" w:line="276" w:lineRule="auto"/>
+        <w:rPr>
+          <w:rFonts w:ascii="Calibri" w:hAnsi="Calibri" w:eastAsia="Calibri" w:cs="Calibri" w:asciiTheme="majorAscii" w:hAnsiTheme="majorAscii" w:eastAsiaTheme="majorAscii" w:cstheme="majorAscii"/>
+          <w:b w:val="0"/>
+          <w:bCs w:val="0"/>
+          <w:noProof w:val="0"/>
+          <w:color w:val="4F81BD" w:themeColor="accent1" w:themeTint="FF" w:themeShade="FF"/>
+          <w:sz w:val="22"/>
+          <w:szCs w:val="22"/>
+          <w:lang w:val="en-US"/>
+        </w:rPr>
+      </w:pPr>
+      <w:r>
+        <w:rPr>
+          <w:rFonts w:ascii="Calibri" w:hAnsi="Calibri" w:eastAsia="Calibri" w:cs="Calibri" w:asciiTheme="majorAscii" w:hAnsiTheme="majorAscii" w:eastAsiaTheme="majorAscii" w:cstheme="majorAscii"/>
+          <w:b w:val="0"/>
+          <w:bCs w:val="0"/>
+          <w:noProof w:val="0"/>
+          <w:color w:val="4F81BD" w:themeColor="accent1" w:themeTint="FF" w:themeShade="FF"/>
+          <w:sz w:val="22"/>
+          <w:szCs w:val="22"/>
+          <w:lang w:val="en-US"/>
+        </w:rPr>
+        <w:t>Problem</w:t>
+      </w:r>
+    </w:p>
+    <w:p>
+      <w:pPr>
+        <w:spacing w:before="0" w:beforeAutospacing="off" w:after="200" w:afterAutospacing="off" w:line="276" w:lineRule="auto"/>
+        <w:rPr>
+          <w:rFonts w:ascii="Calibri" w:hAnsi="Calibri" w:eastAsia="Calibri" w:cs="Calibri" w:asciiTheme="majorAscii" w:hAnsiTheme="majorAscii" w:eastAsiaTheme="majorAscii" w:cstheme="majorAscii"/>
+          <w:b w:val="0"/>
+          <w:bCs w:val="0"/>
+          <w:noProof w:val="0"/>
+          <w:sz w:val="22"/>
+          <w:szCs w:val="22"/>
+          <w:lang w:val="en-US"/>
+        </w:rPr>
+      </w:pPr>
+      <w:r>
+        <w:rPr>
+          <w:rFonts w:ascii="Calibri" w:hAnsi="Calibri" w:eastAsia="Calibri" w:cs="Calibri" w:asciiTheme="majorAscii" w:hAnsiTheme="majorAscii" w:eastAsiaTheme="majorAscii" w:cstheme="majorAscii"/>
+          <w:b w:val="0"/>
+          <w:bCs w:val="0"/>
+          <w:noProof w:val="0"/>
+          <w:sz w:val="22"/>
+          <w:szCs w:val="22"/>
+          <w:lang w:val="en-US"/>
+        </w:rPr>
+        <w:t>Efter RRAS var installeret, viste serveren:</w:t>
+      </w:r>
+    </w:p>
+    <w:p>
+      <w:pPr>
+        <w:spacing w:before="0" w:beforeAutospacing="off" w:after="200" w:afterAutospacing="off" w:line="276" w:lineRule="auto"/>
+        <w:rPr>
+          <w:rFonts w:ascii="Calibri" w:hAnsi="Calibri" w:eastAsia="Calibri" w:cs="Calibri" w:asciiTheme="majorAscii" w:hAnsiTheme="majorAscii" w:eastAsiaTheme="majorAscii" w:cstheme="majorAscii"/>
+          <w:b w:val="0"/>
+          <w:bCs w:val="0"/>
+          <w:noProof w:val="0"/>
+          <w:sz w:val="22"/>
+          <w:szCs w:val="22"/>
+          <w:lang w:val="en-US"/>
+        </w:rPr>
+      </w:pPr>
+      <w:r>
+        <w:rPr>
+          <w:rFonts w:ascii="Calibri" w:hAnsi="Calibri" w:eastAsia="Calibri" w:cs="Calibri" w:asciiTheme="majorAscii" w:hAnsiTheme="majorAscii" w:eastAsiaTheme="majorAscii" w:cstheme="majorAscii"/>
+          <w:b w:val="0"/>
+          <w:bCs w:val="0"/>
+          <w:noProof w:val="0"/>
+          <w:sz w:val="22"/>
+          <w:szCs w:val="22"/>
+          <w:lang w:val="en-US"/>
+        </w:rPr>
+        <w:t>VPN connectivity – Ports required for VPN connections have been blocked by the firewall.</w:t>
+      </w:r>
+    </w:p>
+    <w:p>
+      <w:pPr>
+        <w:pStyle w:val="Heading3"/>
+        <w:spacing w:before="200" w:beforeAutospacing="off" w:after="0" w:afterAutospacing="off" w:line="276" w:lineRule="auto"/>
+        <w:rPr>
+          <w:rFonts w:ascii="Calibri" w:hAnsi="Calibri" w:eastAsia="Calibri" w:cs="Calibri" w:asciiTheme="majorAscii" w:hAnsiTheme="majorAscii" w:eastAsiaTheme="majorAscii" w:cstheme="majorAscii"/>
+          <w:b w:val="0"/>
+          <w:bCs w:val="0"/>
+          <w:noProof w:val="0"/>
+          <w:color w:val="4F81BD" w:themeColor="accent1" w:themeTint="FF" w:themeShade="FF"/>
+          <w:sz w:val="22"/>
+          <w:szCs w:val="22"/>
+          <w:lang w:val="en-US"/>
+        </w:rPr>
+      </w:pPr>
+      <w:r>
+        <w:rPr>
+          <w:rFonts w:ascii="Calibri" w:hAnsi="Calibri" w:eastAsia="Calibri" w:cs="Calibri" w:asciiTheme="majorAscii" w:hAnsiTheme="majorAscii" w:eastAsiaTheme="majorAscii" w:cstheme="majorAscii"/>
+          <w:b w:val="0"/>
+          <w:bCs w:val="0"/>
+          <w:noProof w:val="0"/>
+          <w:color w:val="4F81BD" w:themeColor="accent1" w:themeTint="FF" w:themeShade="FF"/>
+          <w:sz w:val="22"/>
+          <w:szCs w:val="22"/>
+          <w:lang w:val="en-US"/>
+        </w:rPr>
+        <w:t>Årsag</w:t>
+      </w:r>
+    </w:p>
+    <w:p>
+      <w:pPr>
+        <w:spacing w:before="0" w:beforeAutospacing="off" w:after="200" w:afterAutospacing="off" w:line="276" w:lineRule="auto"/>
+        <w:rPr>
+          <w:rFonts w:ascii="Calibri" w:hAnsi="Calibri" w:eastAsia="Calibri" w:cs="Calibri" w:asciiTheme="majorAscii" w:hAnsiTheme="majorAscii" w:eastAsiaTheme="majorAscii" w:cstheme="majorAscii"/>
+          <w:b w:val="0"/>
+          <w:bCs w:val="0"/>
+          <w:noProof w:val="0"/>
+          <w:sz w:val="22"/>
+          <w:szCs w:val="22"/>
+          <w:lang w:val="en-US"/>
+        </w:rPr>
+      </w:pPr>
+      <w:r>
+        <w:rPr>
+          <w:rFonts w:ascii="Calibri" w:hAnsi="Calibri" w:eastAsia="Calibri" w:cs="Calibri" w:asciiTheme="majorAscii" w:hAnsiTheme="majorAscii" w:eastAsiaTheme="majorAscii" w:cstheme="majorAscii"/>
+          <w:b w:val="0"/>
+          <w:bCs w:val="0"/>
+          <w:noProof w:val="0"/>
+          <w:sz w:val="22"/>
+          <w:szCs w:val="22"/>
+          <w:lang w:val="en-US"/>
+        </w:rPr>
+        <w:t>Firewall-reglerne for Routing and Remote Access var deaktiverede, selv om Windows Firewall-profilerne var aktive.</w:t>
+      </w:r>
+    </w:p>
+    <w:p>
+      <w:pPr>
+        <w:pStyle w:val="Heading3"/>
+        <w:spacing w:before="200" w:beforeAutospacing="off" w:after="0" w:afterAutospacing="off" w:line="276" w:lineRule="auto"/>
+        <w:rPr>
+          <w:rFonts w:ascii="Calibri" w:hAnsi="Calibri" w:eastAsia="Calibri" w:cs="Calibri" w:asciiTheme="majorAscii" w:hAnsiTheme="majorAscii" w:eastAsiaTheme="majorAscii" w:cstheme="majorAscii"/>
+          <w:b w:val="0"/>
+          <w:bCs w:val="0"/>
+          <w:noProof w:val="0"/>
+          <w:color w:val="4F81BD" w:themeColor="accent1" w:themeTint="FF" w:themeShade="FF"/>
+          <w:sz w:val="22"/>
+          <w:szCs w:val="22"/>
+          <w:lang w:val="en-US"/>
+        </w:rPr>
+      </w:pPr>
+      <w:r>
+        <w:rPr>
+          <w:rFonts w:ascii="Calibri" w:hAnsi="Calibri" w:eastAsia="Calibri" w:cs="Calibri" w:asciiTheme="majorAscii" w:hAnsiTheme="majorAscii" w:eastAsiaTheme="majorAscii" w:cstheme="majorAscii"/>
+          <w:b w:val="0"/>
+          <w:bCs w:val="0"/>
+          <w:noProof w:val="0"/>
+          <w:color w:val="4F81BD" w:themeColor="accent1" w:themeTint="FF" w:themeShade="FF"/>
+          <w:sz w:val="22"/>
+          <w:szCs w:val="22"/>
+          <w:lang w:val="en-US"/>
+        </w:rPr>
+        <w:t>Løsning</w:t>
+      </w:r>
+    </w:p>
+    <w:p>
+      <w:pPr>
+        <w:spacing w:before="0" w:beforeAutospacing="off" w:after="200" w:afterAutospacing="off" w:line="276" w:lineRule="auto"/>
+        <w:rPr>
+          <w:rFonts w:ascii="Calibri" w:hAnsi="Calibri" w:eastAsia="Calibri" w:cs="Calibri" w:asciiTheme="majorAscii" w:hAnsiTheme="majorAscii" w:eastAsiaTheme="majorAscii" w:cstheme="majorAscii"/>
+          <w:b w:val="0"/>
+          <w:bCs w:val="0"/>
+          <w:noProof w:val="0"/>
+          <w:sz w:val="22"/>
+          <w:szCs w:val="22"/>
+          <w:lang w:val="en-US"/>
+        </w:rPr>
+      </w:pPr>
+      <w:r>
+        <w:rPr>
+          <w:rFonts w:ascii="Calibri" w:hAnsi="Calibri" w:eastAsia="Calibri" w:cs="Calibri" w:asciiTheme="majorAscii" w:hAnsiTheme="majorAscii" w:eastAsiaTheme="majorAscii" w:cstheme="majorAscii"/>
+          <w:b w:val="0"/>
+          <w:bCs w:val="0"/>
+          <w:noProof w:val="0"/>
+          <w:sz w:val="22"/>
+          <w:szCs w:val="22"/>
+          <w:lang w:val="en-US"/>
+        </w:rPr>
+        <w:t>Firewall-reglerne blev kontrolleret med PowerShell:</w:t>
+      </w:r>
+    </w:p>
+    <w:p>
+      <w:pPr>
+        <w:spacing w:before="0" w:beforeAutospacing="off" w:after="200" w:afterAutospacing="off" w:line="276" w:lineRule="auto"/>
+        <w:rPr>
+          <w:rFonts w:ascii="Calibri" w:hAnsi="Calibri" w:eastAsia="Calibri" w:cs="Calibri" w:asciiTheme="majorAscii" w:hAnsiTheme="majorAscii" w:eastAsiaTheme="majorAscii" w:cstheme="majorAscii"/>
+          <w:b w:val="0"/>
+          <w:bCs w:val="0"/>
+          <w:noProof w:val="0"/>
+          <w:sz w:val="22"/>
+          <w:szCs w:val="22"/>
+          <w:lang w:val="en-US"/>
+        </w:rPr>
+      </w:pPr>
+      <w:r>
+        <w:rPr>
+          <w:rFonts w:ascii="Calibri" w:hAnsi="Calibri" w:eastAsia="Calibri" w:cs="Calibri" w:asciiTheme="majorAscii" w:hAnsiTheme="majorAscii" w:eastAsiaTheme="majorAscii" w:cstheme="majorAscii"/>
+          <w:b w:val="0"/>
+          <w:bCs w:val="0"/>
+          <w:noProof w:val="0"/>
+          <w:sz w:val="22"/>
+          <w:szCs w:val="22"/>
+          <w:lang w:val="en-US"/>
+        </w:rPr>
+        <w:t>Get-NetFirewallRule -DisplayGroup "Routing and Remote Access"</w:t>
+      </w:r>
+    </w:p>
+    <w:p>
+      <w:pPr>
+        <w:spacing w:before="0" w:beforeAutospacing="off" w:after="200" w:afterAutospacing="off" w:line="276" w:lineRule="auto"/>
+        <w:rPr>
+          <w:rFonts w:ascii="Calibri" w:hAnsi="Calibri" w:eastAsia="Calibri" w:cs="Calibri" w:asciiTheme="majorAscii" w:hAnsiTheme="majorAscii" w:eastAsiaTheme="majorAscii" w:cstheme="majorAscii"/>
+          <w:b w:val="0"/>
+          <w:bCs w:val="0"/>
+          <w:noProof w:val="0"/>
+          <w:sz w:val="22"/>
+          <w:szCs w:val="22"/>
+          <w:lang w:val="en-US"/>
+        </w:rPr>
+      </w:pPr>
+      <w:r>
+        <w:rPr>
+          <w:rFonts w:ascii="Calibri" w:hAnsi="Calibri" w:eastAsia="Calibri" w:cs="Calibri" w:asciiTheme="majorAscii" w:hAnsiTheme="majorAscii" w:eastAsiaTheme="majorAscii" w:cstheme="majorAscii"/>
+          <w:b w:val="0"/>
+          <w:bCs w:val="0"/>
+          <w:noProof w:val="0"/>
+          <w:sz w:val="22"/>
+          <w:szCs w:val="22"/>
+          <w:lang w:val="en-US"/>
+        </w:rPr>
+        <w:t>Reglerne blev derefter aktiveret med:</w:t>
+      </w:r>
+    </w:p>
+    <w:p>
+      <w:pPr>
+        <w:spacing w:before="0" w:beforeAutospacing="off" w:after="200" w:afterAutospacing="off" w:line="276" w:lineRule="auto"/>
+        <w:rPr>
+          <w:rFonts w:ascii="Calibri" w:hAnsi="Calibri" w:eastAsia="Calibri" w:cs="Calibri" w:asciiTheme="majorAscii" w:hAnsiTheme="majorAscii" w:eastAsiaTheme="majorAscii" w:cstheme="majorAscii"/>
+          <w:b w:val="0"/>
+          <w:bCs w:val="0"/>
+          <w:noProof w:val="0"/>
+          <w:sz w:val="22"/>
+          <w:szCs w:val="22"/>
+          <w:lang w:val="en-US"/>
+        </w:rPr>
+      </w:pPr>
+      <w:r>
+        <w:rPr>
+          <w:rFonts w:ascii="Calibri" w:hAnsi="Calibri" w:eastAsia="Calibri" w:cs="Calibri" w:asciiTheme="majorAscii" w:hAnsiTheme="majorAscii" w:eastAsiaTheme="majorAscii" w:cstheme="majorAscii"/>
+          <w:b w:val="0"/>
+          <w:bCs w:val="0"/>
+          <w:noProof w:val="0"/>
+          <w:sz w:val="22"/>
+          <w:szCs w:val="22"/>
+          <w:lang w:val="en-US"/>
+        </w:rPr>
+        <w:t>Set-NetFirewallRule -DisplayGroup "Routing and Remote Access" -Enabled True</w:t>
+      </w:r>
+    </w:p>
+    <w:p>
+      <w:pPr>
+        <w:pStyle w:val="Heading3"/>
+        <w:spacing w:before="200" w:beforeAutospacing="off" w:after="0" w:afterAutospacing="off" w:line="276" w:lineRule="auto"/>
+        <w:rPr>
+          <w:rFonts w:ascii="Calibri" w:hAnsi="Calibri" w:eastAsia="Calibri" w:cs="Calibri" w:asciiTheme="majorAscii" w:hAnsiTheme="majorAscii" w:eastAsiaTheme="majorAscii" w:cstheme="majorAscii"/>
+          <w:b w:val="0"/>
+          <w:bCs w:val="0"/>
+          <w:noProof w:val="0"/>
+          <w:color w:val="4F81BD" w:themeColor="accent1" w:themeTint="FF" w:themeShade="FF"/>
+          <w:sz w:val="22"/>
+          <w:szCs w:val="22"/>
+          <w:lang w:val="en-US"/>
+        </w:rPr>
+      </w:pPr>
+      <w:r>
+        <w:rPr>
+          <w:rFonts w:ascii="Calibri" w:hAnsi="Calibri" w:eastAsia="Calibri" w:cs="Calibri" w:asciiTheme="majorAscii" w:hAnsiTheme="majorAscii" w:eastAsiaTheme="majorAscii" w:cstheme="majorAscii"/>
+          <w:b w:val="0"/>
+          <w:bCs w:val="0"/>
+          <w:noProof w:val="0"/>
+          <w:color w:val="4F81BD" w:themeColor="accent1" w:themeTint="FF" w:themeShade="FF"/>
+          <w:sz w:val="22"/>
+          <w:szCs w:val="22"/>
+          <w:lang w:val="en-US"/>
+        </w:rPr>
+        <w:t>Resultat</w:t>
+      </w:r>
+    </w:p>
+    <w:p>
+      <w:pPr>
+        <w:spacing w:before="0" w:beforeAutospacing="off" w:after="200" w:afterAutospacing="off" w:line="276" w:lineRule="auto"/>
+        <w:rPr>
+          <w:rFonts w:ascii="Calibri" w:hAnsi="Calibri" w:eastAsia="Calibri" w:cs="Calibri" w:asciiTheme="majorAscii" w:hAnsiTheme="majorAscii" w:eastAsiaTheme="majorAscii" w:cstheme="majorAscii"/>
+          <w:b w:val="0"/>
+          <w:bCs w:val="0"/>
+          <w:noProof w:val="0"/>
+          <w:sz w:val="22"/>
+          <w:szCs w:val="22"/>
+          <w:lang w:val="en-US"/>
+        </w:rPr>
+      </w:pPr>
+      <w:r>
+        <w:rPr>
+          <w:rFonts w:ascii="Calibri" w:hAnsi="Calibri" w:eastAsia="Calibri" w:cs="Calibri" w:asciiTheme="majorAscii" w:hAnsiTheme="majorAscii" w:eastAsiaTheme="majorAscii" w:cstheme="majorAscii"/>
+          <w:b w:val="0"/>
+          <w:bCs w:val="0"/>
+          <w:noProof w:val="0"/>
+          <w:sz w:val="22"/>
+          <w:szCs w:val="22"/>
+          <w:lang w:val="en-US"/>
+        </w:rPr>
+        <w:t>RRAS viste efterfølgende:</w:t>
+      </w:r>
+    </w:p>
+    <w:p>
+      <w:pPr>
+        <w:spacing w:before="0" w:beforeAutospacing="off" w:after="200" w:afterAutospacing="off" w:line="276" w:lineRule="auto"/>
+        <w:rPr>
+          <w:rFonts w:ascii="Calibri" w:hAnsi="Calibri" w:eastAsia="Calibri" w:cs="Calibri" w:asciiTheme="majorAscii" w:hAnsiTheme="majorAscii" w:eastAsiaTheme="majorAscii" w:cstheme="majorAscii"/>
+          <w:b w:val="0"/>
+          <w:bCs w:val="0"/>
+          <w:noProof w:val="0"/>
+          <w:sz w:val="22"/>
+          <w:szCs w:val="22"/>
+          <w:lang w:val="en-US"/>
+        </w:rPr>
+      </w:pPr>
+      <w:r>
+        <w:rPr>
+          <w:rFonts w:ascii="Calibri" w:hAnsi="Calibri" w:eastAsia="Calibri" w:cs="Calibri" w:asciiTheme="majorAscii" w:hAnsiTheme="majorAscii" w:eastAsiaTheme="majorAscii" w:cstheme="majorAscii"/>
+          <w:b w:val="0"/>
+          <w:bCs w:val="0"/>
+          <w:noProof w:val="0"/>
+          <w:sz w:val="22"/>
+          <w:szCs w:val="22"/>
+          <w:lang w:val="en-US"/>
+        </w:rPr>
+        <w:t>VPN connectivity: Working properly</w:t>
+      </w:r>
+    </w:p>
+    <w:p>
+      <w:pPr>
+        <w:spacing w:before="0" w:beforeAutospacing="off" w:after="200" w:afterAutospacing="off" w:line="276" w:lineRule="auto"/>
+        <w:rPr>
+          <w:rFonts w:ascii="Calibri" w:hAnsi="Calibri" w:eastAsia="Calibri" w:cs="Calibri" w:asciiTheme="majorAscii" w:hAnsiTheme="majorAscii" w:eastAsiaTheme="majorAscii" w:cstheme="majorAscii"/>
+          <w:b w:val="0"/>
+          <w:bCs w:val="0"/>
+          <w:noProof w:val="0"/>
+          <w:sz w:val="22"/>
+          <w:szCs w:val="22"/>
+          <w:lang w:val="en-US"/>
+        </w:rPr>
+      </w:pPr>
+      <w:r>
+        <w:rPr>
+          <w:rFonts w:ascii="Calibri" w:hAnsi="Calibri" w:eastAsia="Calibri" w:cs="Calibri" w:asciiTheme="majorAscii" w:hAnsiTheme="majorAscii" w:eastAsiaTheme="majorAscii" w:cstheme="majorAscii"/>
+          <w:b w:val="0"/>
+          <w:bCs w:val="0"/>
+          <w:noProof w:val="0"/>
+          <w:sz w:val="22"/>
+          <w:szCs w:val="22"/>
+          <w:lang w:val="en-US"/>
+        </w:rPr>
+        <w:t>VPN-servicen fungerede derefter korrekt.</w:t>
+      </w:r>
+    </w:p>
+    <w:p>
+      <w:pPr>
+        <w:pStyle w:val="Heading2"/>
+        <w:spacing w:before="200" w:beforeAutospacing="off" w:after="0" w:afterAutospacing="off" w:line="276" w:lineRule="auto"/>
+        <w:rPr>
+          <w:rFonts w:ascii="Calibri" w:hAnsi="Calibri" w:eastAsia="Calibri" w:cs="Calibri" w:asciiTheme="majorAscii" w:hAnsiTheme="majorAscii" w:eastAsiaTheme="majorAscii" w:cstheme="majorAscii"/>
+          <w:b w:val="0"/>
+          <w:bCs w:val="0"/>
+          <w:noProof w:val="0"/>
+          <w:color w:val="4F81BD" w:themeColor="accent1" w:themeTint="FF" w:themeShade="FF"/>
+          <w:sz w:val="22"/>
+          <w:szCs w:val="22"/>
+          <w:lang w:val="en-US"/>
+        </w:rPr>
+      </w:pPr>
+      <w:r>
+        <w:rPr>
+          <w:rFonts w:ascii="Calibri" w:hAnsi="Calibri" w:eastAsia="Calibri" w:cs="Calibri" w:asciiTheme="majorAscii" w:hAnsiTheme="majorAscii" w:eastAsiaTheme="majorAscii" w:cstheme="majorAscii"/>
+          <w:b w:val="0"/>
+          <w:bCs w:val="0"/>
+          <w:noProof w:val="0"/>
+          <w:color w:val="4F81BD" w:themeColor="accent1" w:themeTint="FF" w:themeShade="FF"/>
+          <w:sz w:val="22"/>
+          <w:szCs w:val="22"/>
+          <w:lang w:val="en-US"/>
+        </w:rPr>
+        <w:t xml:space="preserve">– </w:t>
+      </w:r>
+      <w:r>
+        <w:rPr>
+          <w:rFonts w:ascii="Calibri" w:hAnsi="Calibri" w:eastAsia="Calibri" w:cs="Calibri" w:asciiTheme="majorAscii" w:hAnsiTheme="majorAscii" w:eastAsiaTheme="majorAscii" w:cstheme="majorAscii"/>
+          <w:b w:val="0"/>
+          <w:bCs w:val="0"/>
+          <w:noProof w:val="0"/>
+          <w:color w:val="4F81BD" w:themeColor="accent1" w:themeTint="FF" w:themeShade="FF"/>
+          <w:sz w:val="22"/>
+          <w:szCs w:val="22"/>
+          <w:lang w:val="en-US"/>
+        </w:rPr>
+        <w:t>Klienten</w:t>
+      </w:r>
+      <w:r>
+        <w:rPr>
+          <w:rFonts w:ascii="Calibri" w:hAnsi="Calibri" w:eastAsia="Calibri" w:cs="Calibri" w:asciiTheme="majorAscii" w:hAnsiTheme="majorAscii" w:eastAsiaTheme="majorAscii" w:cstheme="majorAscii"/>
+          <w:b w:val="0"/>
+          <w:bCs w:val="0"/>
+          <w:noProof w:val="0"/>
+          <w:color w:val="4F81BD" w:themeColor="accent1" w:themeTint="FF" w:themeShade="FF"/>
+          <w:sz w:val="22"/>
+          <w:szCs w:val="22"/>
+          <w:lang w:val="en-US"/>
+        </w:rPr>
+        <w:t xml:space="preserve"> </w:t>
+      </w:r>
+      <w:r>
+        <w:rPr>
+          <w:rFonts w:ascii="Calibri" w:hAnsi="Calibri" w:eastAsia="Calibri" w:cs="Calibri" w:asciiTheme="majorAscii" w:hAnsiTheme="majorAscii" w:eastAsiaTheme="majorAscii" w:cstheme="majorAscii"/>
+          <w:b w:val="0"/>
+          <w:bCs w:val="0"/>
+          <w:noProof w:val="0"/>
+          <w:color w:val="4F81BD" w:themeColor="accent1" w:themeTint="FF" w:themeShade="FF"/>
+          <w:sz w:val="22"/>
+          <w:szCs w:val="22"/>
+          <w:lang w:val="en-US"/>
+        </w:rPr>
+        <w:t>kunne</w:t>
+      </w:r>
+      <w:r>
+        <w:rPr>
+          <w:rFonts w:ascii="Calibri" w:hAnsi="Calibri" w:eastAsia="Calibri" w:cs="Calibri" w:asciiTheme="majorAscii" w:hAnsiTheme="majorAscii" w:eastAsiaTheme="majorAscii" w:cstheme="majorAscii"/>
+          <w:b w:val="0"/>
+          <w:bCs w:val="0"/>
+          <w:noProof w:val="0"/>
+          <w:color w:val="4F81BD" w:themeColor="accent1" w:themeTint="FF" w:themeShade="FF"/>
+          <w:sz w:val="22"/>
+          <w:szCs w:val="22"/>
+          <w:lang w:val="en-US"/>
+        </w:rPr>
+        <w:t xml:space="preserve"> </w:t>
+      </w:r>
+      <w:r>
+        <w:rPr>
+          <w:rFonts w:ascii="Calibri" w:hAnsi="Calibri" w:eastAsia="Calibri" w:cs="Calibri" w:asciiTheme="majorAscii" w:hAnsiTheme="majorAscii" w:eastAsiaTheme="majorAscii" w:cstheme="majorAscii"/>
+          <w:b w:val="0"/>
+          <w:bCs w:val="0"/>
+          <w:noProof w:val="0"/>
+          <w:color w:val="4F81BD" w:themeColor="accent1" w:themeTint="FF" w:themeShade="FF"/>
+          <w:sz w:val="22"/>
+          <w:szCs w:val="22"/>
+          <w:lang w:val="en-US"/>
+        </w:rPr>
+        <w:t>ikke</w:t>
+      </w:r>
+      <w:r>
+        <w:rPr>
+          <w:rFonts w:ascii="Calibri" w:hAnsi="Calibri" w:eastAsia="Calibri" w:cs="Calibri" w:asciiTheme="majorAscii" w:hAnsiTheme="majorAscii" w:eastAsiaTheme="majorAscii" w:cstheme="majorAscii"/>
+          <w:b w:val="0"/>
+          <w:bCs w:val="0"/>
+          <w:noProof w:val="0"/>
+          <w:color w:val="4F81BD" w:themeColor="accent1" w:themeTint="FF" w:themeShade="FF"/>
+          <w:sz w:val="22"/>
+          <w:szCs w:val="22"/>
+          <w:lang w:val="en-US"/>
+        </w:rPr>
+        <w:t xml:space="preserve"> </w:t>
+      </w:r>
+      <w:r>
+        <w:rPr>
+          <w:rFonts w:ascii="Calibri" w:hAnsi="Calibri" w:eastAsia="Calibri" w:cs="Calibri" w:asciiTheme="majorAscii" w:hAnsiTheme="majorAscii" w:eastAsiaTheme="majorAscii" w:cstheme="majorAscii"/>
+          <w:b w:val="0"/>
+          <w:bCs w:val="0"/>
+          <w:noProof w:val="0"/>
+          <w:color w:val="4F81BD" w:themeColor="accent1" w:themeTint="FF" w:themeShade="FF"/>
+          <w:sz w:val="22"/>
+          <w:szCs w:val="22"/>
+          <w:lang w:val="en-US"/>
+        </w:rPr>
+        <w:t>åbne</w:t>
+      </w:r>
+      <w:r>
+        <w:rPr>
+          <w:rFonts w:ascii="Calibri" w:hAnsi="Calibri" w:eastAsia="Calibri" w:cs="Calibri" w:asciiTheme="majorAscii" w:hAnsiTheme="majorAscii" w:eastAsiaTheme="majorAscii" w:cstheme="majorAscii"/>
+          <w:b w:val="0"/>
+          <w:bCs w:val="0"/>
+          <w:noProof w:val="0"/>
+          <w:color w:val="4F81BD" w:themeColor="accent1" w:themeTint="FF" w:themeShade="FF"/>
+          <w:sz w:val="22"/>
+          <w:szCs w:val="22"/>
+          <w:lang w:val="en-US"/>
+        </w:rPr>
+        <w:t xml:space="preserve"> VPN-</w:t>
+      </w:r>
+      <w:r>
+        <w:rPr>
+          <w:rFonts w:ascii="Calibri" w:hAnsi="Calibri" w:eastAsia="Calibri" w:cs="Calibri" w:asciiTheme="majorAscii" w:hAnsiTheme="majorAscii" w:eastAsiaTheme="majorAscii" w:cstheme="majorAscii"/>
+          <w:b w:val="0"/>
+          <w:bCs w:val="0"/>
+          <w:noProof w:val="0"/>
+          <w:color w:val="4F81BD" w:themeColor="accent1" w:themeTint="FF" w:themeShade="FF"/>
+          <w:sz w:val="22"/>
+          <w:szCs w:val="22"/>
+          <w:lang w:val="en-US"/>
+        </w:rPr>
+        <w:t>indstillinger</w:t>
+      </w:r>
+    </w:p>
+    <w:p>
+      <w:pPr>
+        <w:pStyle w:val="Heading3"/>
+        <w:spacing w:before="200" w:beforeAutospacing="off" w:after="0" w:afterAutospacing="off" w:line="276" w:lineRule="auto"/>
+        <w:rPr>
+          <w:rFonts w:ascii="Calibri" w:hAnsi="Calibri" w:eastAsia="Calibri" w:cs="Calibri" w:asciiTheme="majorAscii" w:hAnsiTheme="majorAscii" w:eastAsiaTheme="majorAscii" w:cstheme="majorAscii"/>
+          <w:b w:val="0"/>
+          <w:bCs w:val="0"/>
+          <w:noProof w:val="0"/>
+          <w:color w:val="4F81BD" w:themeColor="accent1" w:themeTint="FF" w:themeShade="FF"/>
+          <w:sz w:val="22"/>
+          <w:szCs w:val="22"/>
+          <w:lang w:val="en-US"/>
+        </w:rPr>
+      </w:pPr>
+      <w:r>
+        <w:rPr>
+          <w:rFonts w:ascii="Calibri" w:hAnsi="Calibri" w:eastAsia="Calibri" w:cs="Calibri" w:asciiTheme="majorAscii" w:hAnsiTheme="majorAscii" w:eastAsiaTheme="majorAscii" w:cstheme="majorAscii"/>
+          <w:b w:val="0"/>
+          <w:bCs w:val="0"/>
+          <w:noProof w:val="0"/>
+          <w:color w:val="4F81BD" w:themeColor="accent1" w:themeTint="FF" w:themeShade="FF"/>
+          <w:sz w:val="22"/>
+          <w:szCs w:val="22"/>
+          <w:lang w:val="en-US"/>
+        </w:rPr>
+        <w:t>Problem</w:t>
+      </w:r>
+    </w:p>
+    <w:p>
+      <w:pPr>
+        <w:spacing w:before="0" w:beforeAutospacing="off" w:after="200" w:afterAutospacing="off" w:line="276" w:lineRule="auto"/>
+        <w:rPr>
+          <w:rFonts w:ascii="Calibri" w:hAnsi="Calibri" w:eastAsia="Calibri" w:cs="Calibri" w:asciiTheme="majorAscii" w:hAnsiTheme="majorAscii" w:eastAsiaTheme="majorAscii" w:cstheme="majorAscii"/>
+          <w:b w:val="0"/>
+          <w:bCs w:val="0"/>
+          <w:noProof w:val="0"/>
+          <w:sz w:val="22"/>
+          <w:szCs w:val="22"/>
+          <w:lang w:val="en-US"/>
+        </w:rPr>
+      </w:pPr>
+      <w:r>
+        <w:rPr>
+          <w:rFonts w:ascii="Calibri" w:hAnsi="Calibri" w:eastAsia="Calibri" w:cs="Calibri" w:asciiTheme="majorAscii" w:hAnsiTheme="majorAscii" w:eastAsiaTheme="majorAscii" w:cstheme="majorAscii"/>
+          <w:b w:val="0"/>
+          <w:bCs w:val="0"/>
+          <w:noProof w:val="0"/>
+          <w:sz w:val="22"/>
+          <w:szCs w:val="22"/>
+          <w:lang w:val="en-US"/>
+        </w:rPr>
+        <w:t>På klienten kunne VPN-indstillingerne ikke åbnes, og Windows viste en meddelelse om, at handlingen var blokeret på grund af begrænsninger på computeren.</w:t>
+      </w:r>
+    </w:p>
+    <w:p>
+      <w:pPr>
+        <w:pStyle w:val="Heading3"/>
+        <w:spacing w:before="200" w:beforeAutospacing="off" w:after="0" w:afterAutospacing="off" w:line="276" w:lineRule="auto"/>
+        <w:rPr>
+          <w:rFonts w:ascii="Calibri" w:hAnsi="Calibri" w:eastAsia="Calibri" w:cs="Calibri" w:asciiTheme="majorAscii" w:hAnsiTheme="majorAscii" w:eastAsiaTheme="majorAscii" w:cstheme="majorAscii"/>
+          <w:b w:val="0"/>
+          <w:bCs w:val="0"/>
+          <w:noProof w:val="0"/>
+          <w:color w:val="4F81BD" w:themeColor="accent1" w:themeTint="FF" w:themeShade="FF"/>
+          <w:sz w:val="22"/>
+          <w:szCs w:val="22"/>
+          <w:lang w:val="en-US"/>
+        </w:rPr>
+      </w:pPr>
+      <w:r>
+        <w:rPr>
+          <w:rFonts w:ascii="Calibri" w:hAnsi="Calibri" w:eastAsia="Calibri" w:cs="Calibri" w:asciiTheme="majorAscii" w:hAnsiTheme="majorAscii" w:eastAsiaTheme="majorAscii" w:cstheme="majorAscii"/>
+          <w:b w:val="0"/>
+          <w:bCs w:val="0"/>
+          <w:noProof w:val="0"/>
+          <w:color w:val="4F81BD" w:themeColor="accent1" w:themeTint="FF" w:themeShade="FF"/>
+          <w:sz w:val="22"/>
+          <w:szCs w:val="22"/>
+          <w:lang w:val="en-US"/>
+        </w:rPr>
+        <w:t>Årsag</w:t>
+      </w:r>
+    </w:p>
+    <w:p>
+      <w:pPr>
+        <w:spacing w:before="0" w:beforeAutospacing="off" w:after="200" w:afterAutospacing="off" w:line="276" w:lineRule="auto"/>
+        <w:rPr>
+          <w:rFonts w:ascii="Calibri" w:hAnsi="Calibri" w:eastAsia="Calibri" w:cs="Calibri" w:asciiTheme="majorAscii" w:hAnsiTheme="majorAscii" w:eastAsiaTheme="majorAscii" w:cstheme="majorAscii"/>
+          <w:b w:val="0"/>
+          <w:bCs w:val="0"/>
+          <w:noProof w:val="0"/>
+          <w:sz w:val="22"/>
+          <w:szCs w:val="22"/>
+          <w:lang w:val="en-US"/>
+        </w:rPr>
+      </w:pPr>
+      <w:r>
+        <w:rPr>
+          <w:rFonts w:ascii="Calibri" w:hAnsi="Calibri" w:eastAsia="Calibri" w:cs="Calibri" w:asciiTheme="majorAscii" w:hAnsiTheme="majorAscii" w:eastAsiaTheme="majorAscii" w:cstheme="majorAscii"/>
+          <w:b w:val="0"/>
+          <w:bCs w:val="0"/>
+          <w:noProof w:val="0"/>
+          <w:sz w:val="22"/>
+          <w:szCs w:val="22"/>
+          <w:lang w:val="en-US"/>
+        </w:rPr>
+        <w:t>En Group Policy begrænsede adgangen til Control Panel og PC Settings.</w:t>
+      </w:r>
+    </w:p>
+    <w:p>
+      <w:pPr>
+        <w:spacing w:before="0" w:beforeAutospacing="off" w:after="200" w:afterAutospacing="off" w:line="276" w:lineRule="auto"/>
+        <w:rPr>
+          <w:rFonts w:ascii="Calibri" w:hAnsi="Calibri" w:eastAsia="Calibri" w:cs="Calibri" w:asciiTheme="majorAscii" w:hAnsiTheme="majorAscii" w:eastAsiaTheme="majorAscii" w:cstheme="majorAscii"/>
+          <w:b w:val="0"/>
+          <w:bCs w:val="0"/>
+          <w:noProof w:val="0"/>
+          <w:sz w:val="22"/>
+          <w:szCs w:val="22"/>
+          <w:lang w:val="en-US"/>
+        </w:rPr>
+      </w:pPr>
+      <w:r>
+        <w:rPr>
+          <w:rFonts w:ascii="Calibri" w:hAnsi="Calibri" w:eastAsia="Calibri" w:cs="Calibri" w:asciiTheme="majorAscii" w:hAnsiTheme="majorAscii" w:eastAsiaTheme="majorAscii" w:cstheme="majorAscii"/>
+          <w:b w:val="0"/>
+          <w:bCs w:val="0"/>
+          <w:noProof w:val="0"/>
+          <w:sz w:val="22"/>
+          <w:szCs w:val="22"/>
+          <w:lang w:val="en-US"/>
+        </w:rPr>
+        <w:t>Den relevante policy var:</w:t>
+      </w:r>
+    </w:p>
+    <w:p>
+      <w:pPr>
+        <w:spacing w:before="0" w:beforeAutospacing="off" w:after="200" w:afterAutospacing="off" w:line="276" w:lineRule="auto"/>
+        <w:rPr>
+          <w:rFonts w:ascii="Calibri" w:hAnsi="Calibri" w:eastAsia="Calibri" w:cs="Calibri" w:asciiTheme="majorAscii" w:hAnsiTheme="majorAscii" w:eastAsiaTheme="majorAscii" w:cstheme="majorAscii"/>
+          <w:b w:val="0"/>
+          <w:bCs w:val="0"/>
+          <w:noProof w:val="0"/>
+          <w:sz w:val="22"/>
+          <w:szCs w:val="22"/>
+          <w:lang w:val="en-US"/>
+        </w:rPr>
+      </w:pPr>
+      <w:r>
+        <w:rPr>
+          <w:rFonts w:ascii="Calibri" w:hAnsi="Calibri" w:eastAsia="Calibri" w:cs="Calibri" w:asciiTheme="majorAscii" w:hAnsiTheme="majorAscii" w:eastAsiaTheme="majorAscii" w:cstheme="majorAscii"/>
+          <w:b w:val="0"/>
+          <w:bCs w:val="0"/>
+          <w:noProof w:val="0"/>
+          <w:sz w:val="22"/>
+          <w:szCs w:val="22"/>
+          <w:lang w:val="en-US"/>
+        </w:rPr>
+        <w:t>Prohibit access to Control Panel and PC settings</w:t>
+      </w:r>
+    </w:p>
+    <w:p>
+      <w:pPr>
+        <w:pStyle w:val="Heading3"/>
+        <w:spacing w:before="200" w:beforeAutospacing="off" w:after="0" w:afterAutospacing="off" w:line="276" w:lineRule="auto"/>
+        <w:rPr>
+          <w:rFonts w:ascii="Calibri" w:hAnsi="Calibri" w:eastAsia="Calibri" w:cs="Calibri" w:asciiTheme="majorAscii" w:hAnsiTheme="majorAscii" w:eastAsiaTheme="majorAscii" w:cstheme="majorAscii"/>
+          <w:b w:val="0"/>
+          <w:bCs w:val="0"/>
+          <w:noProof w:val="0"/>
+          <w:color w:val="4F81BD" w:themeColor="accent1" w:themeTint="FF" w:themeShade="FF"/>
+          <w:sz w:val="22"/>
+          <w:szCs w:val="22"/>
+          <w:lang w:val="en-US"/>
+        </w:rPr>
+      </w:pPr>
+      <w:r>
+        <w:rPr>
+          <w:rFonts w:ascii="Calibri" w:hAnsi="Calibri" w:eastAsia="Calibri" w:cs="Calibri" w:asciiTheme="majorAscii" w:hAnsiTheme="majorAscii" w:eastAsiaTheme="majorAscii" w:cstheme="majorAscii"/>
+          <w:b w:val="0"/>
+          <w:bCs w:val="0"/>
+          <w:noProof w:val="0"/>
+          <w:color w:val="4F81BD" w:themeColor="accent1" w:themeTint="FF" w:themeShade="FF"/>
+          <w:sz w:val="22"/>
+          <w:szCs w:val="22"/>
+          <w:lang w:val="en-US"/>
+        </w:rPr>
+        <w:t>Løsning</w:t>
+      </w:r>
+    </w:p>
+    <w:p>
+      <w:pPr>
+        <w:spacing w:before="0" w:beforeAutospacing="off" w:after="200" w:afterAutospacing="off" w:line="276" w:lineRule="auto"/>
+        <w:rPr>
+          <w:rFonts w:ascii="Calibri" w:hAnsi="Calibri" w:eastAsia="Calibri" w:cs="Calibri" w:asciiTheme="majorAscii" w:hAnsiTheme="majorAscii" w:eastAsiaTheme="majorAscii" w:cstheme="majorAscii"/>
+          <w:b w:val="0"/>
+          <w:bCs w:val="0"/>
+          <w:noProof w:val="0"/>
+          <w:sz w:val="22"/>
+          <w:szCs w:val="22"/>
+          <w:lang w:val="en-US"/>
+        </w:rPr>
+      </w:pPr>
+      <w:r>
+        <w:rPr>
+          <w:rFonts w:ascii="Calibri" w:hAnsi="Calibri" w:eastAsia="Calibri" w:cs="Calibri" w:asciiTheme="majorAscii" w:hAnsiTheme="majorAscii" w:eastAsiaTheme="majorAscii" w:cstheme="majorAscii"/>
+          <w:b w:val="0"/>
+          <w:bCs w:val="0"/>
+          <w:noProof w:val="0"/>
+          <w:sz w:val="22"/>
+          <w:szCs w:val="22"/>
+          <w:lang w:val="en-US"/>
+        </w:rPr>
+        <w:t>Policyen blev midlertidigt ændret til:</w:t>
+      </w:r>
+    </w:p>
+    <w:p>
+      <w:pPr>
+        <w:spacing w:before="0" w:beforeAutospacing="off" w:after="200" w:afterAutospacing="off" w:line="276" w:lineRule="auto"/>
+        <w:rPr>
+          <w:rFonts w:ascii="Calibri" w:hAnsi="Calibri" w:eastAsia="Calibri" w:cs="Calibri" w:asciiTheme="majorAscii" w:hAnsiTheme="majorAscii" w:eastAsiaTheme="majorAscii" w:cstheme="majorAscii"/>
+          <w:b w:val="0"/>
+          <w:bCs w:val="0"/>
+          <w:noProof w:val="0"/>
+          <w:sz w:val="22"/>
+          <w:szCs w:val="22"/>
+          <w:lang w:val="en-US"/>
+        </w:rPr>
+      </w:pPr>
+      <w:r>
+        <w:rPr>
+          <w:rFonts w:ascii="Calibri" w:hAnsi="Calibri" w:eastAsia="Calibri" w:cs="Calibri" w:asciiTheme="majorAscii" w:hAnsiTheme="majorAscii" w:eastAsiaTheme="majorAscii" w:cstheme="majorAscii"/>
+          <w:b w:val="0"/>
+          <w:bCs w:val="0"/>
+          <w:noProof w:val="0"/>
+          <w:sz w:val="22"/>
+          <w:szCs w:val="22"/>
+          <w:lang w:val="en-US"/>
+        </w:rPr>
+        <w:t>Disabled</w:t>
+      </w:r>
+    </w:p>
+    <w:p>
+      <w:pPr>
+        <w:spacing w:before="0" w:beforeAutospacing="off" w:after="200" w:afterAutospacing="off" w:line="276" w:lineRule="auto"/>
+        <w:rPr>
+          <w:rFonts w:ascii="Calibri" w:hAnsi="Calibri" w:eastAsia="Calibri" w:cs="Calibri" w:asciiTheme="majorAscii" w:hAnsiTheme="majorAscii" w:eastAsiaTheme="majorAscii" w:cstheme="majorAscii"/>
+          <w:b w:val="0"/>
+          <w:bCs w:val="0"/>
+          <w:noProof w:val="0"/>
+          <w:sz w:val="22"/>
+          <w:szCs w:val="22"/>
+          <w:lang w:val="en-US"/>
+        </w:rPr>
+      </w:pPr>
+      <w:r>
+        <w:rPr>
+          <w:rFonts w:ascii="Calibri" w:hAnsi="Calibri" w:eastAsia="Calibri" w:cs="Calibri" w:asciiTheme="majorAscii" w:hAnsiTheme="majorAscii" w:eastAsiaTheme="majorAscii" w:cstheme="majorAscii"/>
+          <w:b w:val="0"/>
+          <w:bCs w:val="0"/>
+          <w:noProof w:val="0"/>
+          <w:sz w:val="22"/>
+          <w:szCs w:val="22"/>
+          <w:lang w:val="en-US"/>
+        </w:rPr>
+        <w:t>Derefter blev Group Policy opdateret, så klienten kunne åbne de nødvendige netværks- og VPN-indstillinger.</w:t>
+      </w:r>
+    </w:p>
+    <w:p>
+      <w:pPr>
+        <w:pStyle w:val="Heading3"/>
+        <w:spacing w:before="200" w:beforeAutospacing="off" w:after="0" w:afterAutospacing="off" w:line="276" w:lineRule="auto"/>
+        <w:rPr>
+          <w:rFonts w:ascii="Calibri" w:hAnsi="Calibri" w:eastAsia="Calibri" w:cs="Calibri" w:asciiTheme="majorAscii" w:hAnsiTheme="majorAscii" w:eastAsiaTheme="majorAscii" w:cstheme="majorAscii"/>
+          <w:b w:val="0"/>
+          <w:bCs w:val="0"/>
+          <w:noProof w:val="0"/>
+          <w:color w:val="4F81BD" w:themeColor="accent1" w:themeTint="FF" w:themeShade="FF"/>
+          <w:sz w:val="22"/>
+          <w:szCs w:val="22"/>
+          <w:lang w:val="en-US"/>
+        </w:rPr>
+      </w:pPr>
+      <w:r>
+        <w:rPr>
+          <w:rFonts w:ascii="Calibri" w:hAnsi="Calibri" w:eastAsia="Calibri" w:cs="Calibri" w:asciiTheme="majorAscii" w:hAnsiTheme="majorAscii" w:eastAsiaTheme="majorAscii" w:cstheme="majorAscii"/>
+          <w:b w:val="0"/>
+          <w:bCs w:val="0"/>
+          <w:noProof w:val="0"/>
+          <w:color w:val="4F81BD" w:themeColor="accent1" w:themeTint="FF" w:themeShade="FF"/>
+          <w:sz w:val="22"/>
+          <w:szCs w:val="22"/>
+          <w:lang w:val="en-US"/>
+        </w:rPr>
+        <w:t>Resultat</w:t>
+      </w:r>
+    </w:p>
+    <w:p>
+      <w:pPr>
+        <w:spacing w:before="0" w:beforeAutospacing="off" w:after="200" w:afterAutospacing="off" w:line="276" w:lineRule="auto"/>
+        <w:rPr>
+          <w:rFonts w:ascii="Calibri" w:hAnsi="Calibri" w:eastAsia="Calibri" w:cs="Calibri" w:asciiTheme="majorAscii" w:hAnsiTheme="majorAscii" w:eastAsiaTheme="majorAscii" w:cstheme="majorAscii"/>
+          <w:b w:val="0"/>
+          <w:bCs w:val="0"/>
+          <w:noProof w:val="0"/>
+          <w:sz w:val="22"/>
+          <w:szCs w:val="22"/>
+          <w:lang w:val="en-US"/>
+        </w:rPr>
+      </w:pPr>
+      <w:r>
+        <w:rPr>
+          <w:rFonts w:ascii="Calibri" w:hAnsi="Calibri" w:eastAsia="Calibri" w:cs="Calibri" w:asciiTheme="majorAscii" w:hAnsiTheme="majorAscii" w:eastAsiaTheme="majorAscii" w:cstheme="majorAscii"/>
+          <w:b w:val="0"/>
+          <w:bCs w:val="0"/>
+          <w:noProof w:val="0"/>
+          <w:sz w:val="22"/>
+          <w:szCs w:val="22"/>
+          <w:lang w:val="en-US"/>
+        </w:rPr>
+        <w:t>VPN-menuen kunne åbnes på klienten, og en VPN-forbindelse kunne oprettes.</w:t>
+      </w:r>
+    </w:p>
+    <w:p>
+      <w:pPr>
+        <w:pStyle w:val="Heading2"/>
+        <w:spacing w:before="200" w:beforeAutospacing="off" w:after="0" w:afterAutospacing="off" w:line="276" w:lineRule="auto"/>
+        <w:rPr>
+          <w:rFonts w:ascii="Calibri" w:hAnsi="Calibri" w:eastAsia="Calibri" w:cs="Calibri" w:asciiTheme="majorAscii" w:hAnsiTheme="majorAscii" w:eastAsiaTheme="majorAscii" w:cstheme="majorAscii"/>
+          <w:b w:val="0"/>
+          <w:bCs w:val="0"/>
+          <w:noProof w:val="0"/>
+          <w:color w:val="4F81BD" w:themeColor="accent1" w:themeTint="FF" w:themeShade="FF"/>
+          <w:sz w:val="22"/>
+          <w:szCs w:val="22"/>
+          <w:lang w:val="en-US"/>
+        </w:rPr>
+      </w:pPr>
+      <w:r>
+        <w:rPr>
+          <w:rFonts w:ascii="Calibri" w:hAnsi="Calibri" w:eastAsia="Calibri" w:cs="Calibri" w:asciiTheme="majorAscii" w:hAnsiTheme="majorAscii" w:eastAsiaTheme="majorAscii" w:cstheme="majorAscii"/>
+          <w:b w:val="0"/>
+          <w:bCs w:val="0"/>
+          <w:noProof w:val="0"/>
+          <w:color w:val="4F81BD" w:themeColor="accent1" w:themeTint="FF" w:themeShade="FF"/>
+          <w:sz w:val="22"/>
+          <w:szCs w:val="22"/>
+          <w:lang w:val="en-US"/>
+        </w:rPr>
+        <w:t xml:space="preserve">– VPN </w:t>
+      </w:r>
+      <w:r>
+        <w:rPr>
+          <w:rFonts w:ascii="Calibri" w:hAnsi="Calibri" w:eastAsia="Calibri" w:cs="Calibri" w:asciiTheme="majorAscii" w:hAnsiTheme="majorAscii" w:eastAsiaTheme="majorAscii" w:cstheme="majorAscii"/>
+          <w:b w:val="0"/>
+          <w:bCs w:val="0"/>
+          <w:noProof w:val="0"/>
+          <w:color w:val="4F81BD" w:themeColor="accent1" w:themeTint="FF" w:themeShade="FF"/>
+          <w:sz w:val="22"/>
+          <w:szCs w:val="22"/>
+          <w:lang w:val="en-US"/>
+        </w:rPr>
+        <w:t>og</w:t>
+      </w:r>
+      <w:r>
+        <w:rPr>
+          <w:rFonts w:ascii="Calibri" w:hAnsi="Calibri" w:eastAsia="Calibri" w:cs="Calibri" w:asciiTheme="majorAscii" w:hAnsiTheme="majorAscii" w:eastAsiaTheme="majorAscii" w:cstheme="majorAscii"/>
+          <w:b w:val="0"/>
+          <w:bCs w:val="0"/>
+          <w:noProof w:val="0"/>
+          <w:color w:val="4F81BD" w:themeColor="accent1" w:themeTint="FF" w:themeShade="FF"/>
+          <w:sz w:val="22"/>
+          <w:szCs w:val="22"/>
+          <w:lang w:val="en-US"/>
+        </w:rPr>
+        <w:t xml:space="preserve"> LAN </w:t>
+      </w:r>
+      <w:r>
+        <w:rPr>
+          <w:rFonts w:ascii="Calibri" w:hAnsi="Calibri" w:eastAsia="Calibri" w:cs="Calibri" w:asciiTheme="majorAscii" w:hAnsiTheme="majorAscii" w:eastAsiaTheme="majorAscii" w:cstheme="majorAscii"/>
+          <w:b w:val="0"/>
+          <w:bCs w:val="0"/>
+          <w:noProof w:val="0"/>
+          <w:color w:val="4F81BD" w:themeColor="accent1" w:themeTint="FF" w:themeShade="FF"/>
+          <w:sz w:val="22"/>
+          <w:szCs w:val="22"/>
+          <w:lang w:val="en-US"/>
+        </w:rPr>
+        <w:t>brugte</w:t>
+      </w:r>
+      <w:r>
+        <w:rPr>
+          <w:rFonts w:ascii="Calibri" w:hAnsi="Calibri" w:eastAsia="Calibri" w:cs="Calibri" w:asciiTheme="majorAscii" w:hAnsiTheme="majorAscii" w:eastAsiaTheme="majorAscii" w:cstheme="majorAscii"/>
+          <w:b w:val="0"/>
+          <w:bCs w:val="0"/>
+          <w:noProof w:val="0"/>
+          <w:color w:val="4F81BD" w:themeColor="accent1" w:themeTint="FF" w:themeShade="FF"/>
+          <w:sz w:val="22"/>
+          <w:szCs w:val="22"/>
+          <w:lang w:val="en-US"/>
+        </w:rPr>
+        <w:t xml:space="preserve"> </w:t>
+      </w:r>
+      <w:r>
+        <w:rPr>
+          <w:rFonts w:ascii="Calibri" w:hAnsi="Calibri" w:eastAsia="Calibri" w:cs="Calibri" w:asciiTheme="majorAscii" w:hAnsiTheme="majorAscii" w:eastAsiaTheme="majorAscii" w:cstheme="majorAscii"/>
+          <w:b w:val="0"/>
+          <w:bCs w:val="0"/>
+          <w:noProof w:val="0"/>
+          <w:color w:val="4F81BD" w:themeColor="accent1" w:themeTint="FF" w:themeShade="FF"/>
+          <w:sz w:val="22"/>
+          <w:szCs w:val="22"/>
+          <w:lang w:val="en-US"/>
+        </w:rPr>
+        <w:t>samme</w:t>
+      </w:r>
+      <w:r>
+        <w:rPr>
+          <w:rFonts w:ascii="Calibri" w:hAnsi="Calibri" w:eastAsia="Calibri" w:cs="Calibri" w:asciiTheme="majorAscii" w:hAnsiTheme="majorAscii" w:eastAsiaTheme="majorAscii" w:cstheme="majorAscii"/>
+          <w:b w:val="0"/>
+          <w:bCs w:val="0"/>
+          <w:noProof w:val="0"/>
+          <w:color w:val="4F81BD" w:themeColor="accent1" w:themeTint="FF" w:themeShade="FF"/>
+          <w:sz w:val="22"/>
+          <w:szCs w:val="22"/>
+          <w:lang w:val="en-US"/>
+        </w:rPr>
+        <w:t xml:space="preserve"> IP-</w:t>
+      </w:r>
+      <w:r>
+        <w:rPr>
+          <w:rFonts w:ascii="Calibri" w:hAnsi="Calibri" w:eastAsia="Calibri" w:cs="Calibri" w:asciiTheme="majorAscii" w:hAnsiTheme="majorAscii" w:eastAsiaTheme="majorAscii" w:cstheme="majorAscii"/>
+          <w:b w:val="0"/>
+          <w:bCs w:val="0"/>
+          <w:noProof w:val="0"/>
+          <w:color w:val="4F81BD" w:themeColor="accent1" w:themeTint="FF" w:themeShade="FF"/>
+          <w:sz w:val="22"/>
+          <w:szCs w:val="22"/>
+          <w:lang w:val="en-US"/>
+        </w:rPr>
+        <w:t>netværk</w:t>
+      </w:r>
+    </w:p>
+    <w:p>
+      <w:pPr>
+        <w:pStyle w:val="Heading3"/>
+        <w:spacing w:before="200" w:beforeAutospacing="off" w:after="0" w:afterAutospacing="off" w:line="276" w:lineRule="auto"/>
+        <w:rPr>
+          <w:rFonts w:ascii="Calibri" w:hAnsi="Calibri" w:eastAsia="Calibri" w:cs="Calibri" w:asciiTheme="majorAscii" w:hAnsiTheme="majorAscii" w:eastAsiaTheme="majorAscii" w:cstheme="majorAscii"/>
+          <w:b w:val="0"/>
+          <w:bCs w:val="0"/>
+          <w:noProof w:val="0"/>
+          <w:color w:val="4F81BD" w:themeColor="accent1" w:themeTint="FF" w:themeShade="FF"/>
+          <w:sz w:val="22"/>
+          <w:szCs w:val="22"/>
+          <w:lang w:val="en-US"/>
+        </w:rPr>
+      </w:pPr>
+      <w:r>
+        <w:rPr>
+          <w:rFonts w:ascii="Calibri" w:hAnsi="Calibri" w:eastAsia="Calibri" w:cs="Calibri" w:asciiTheme="majorAscii" w:hAnsiTheme="majorAscii" w:eastAsiaTheme="majorAscii" w:cstheme="majorAscii"/>
+          <w:b w:val="0"/>
+          <w:bCs w:val="0"/>
+          <w:noProof w:val="0"/>
+          <w:color w:val="4F81BD" w:themeColor="accent1" w:themeTint="FF" w:themeShade="FF"/>
+          <w:sz w:val="22"/>
+          <w:szCs w:val="22"/>
+          <w:lang w:val="en-US"/>
+        </w:rPr>
+        <w:t>Problem</w:t>
+      </w:r>
+    </w:p>
+    <w:p>
+      <w:pPr>
+        <w:spacing w:before="0" w:beforeAutospacing="off" w:after="200" w:afterAutospacing="off" w:line="276" w:lineRule="auto"/>
+        <w:rPr>
+          <w:rFonts w:ascii="Calibri" w:hAnsi="Calibri" w:eastAsia="Calibri" w:cs="Calibri" w:asciiTheme="majorAscii" w:hAnsiTheme="majorAscii" w:eastAsiaTheme="majorAscii" w:cstheme="majorAscii"/>
+          <w:b w:val="0"/>
+          <w:bCs w:val="0"/>
+          <w:noProof w:val="0"/>
+          <w:sz w:val="22"/>
+          <w:szCs w:val="22"/>
+          <w:lang w:val="en-US"/>
+        </w:rPr>
+      </w:pPr>
+      <w:r>
+        <w:rPr>
+          <w:rFonts w:ascii="Calibri" w:hAnsi="Calibri" w:eastAsia="Calibri" w:cs="Calibri" w:asciiTheme="majorAscii" w:hAnsiTheme="majorAscii" w:eastAsiaTheme="majorAscii" w:cstheme="majorAscii"/>
+          <w:b w:val="0"/>
+          <w:bCs w:val="0"/>
+          <w:noProof w:val="0"/>
+          <w:sz w:val="22"/>
+          <w:szCs w:val="22"/>
+          <w:lang w:val="en-US"/>
+        </w:rPr>
+        <w:t>VPN-klienten kunne godt oprette forbindelse, men både LAN og VPN brugte adresser fra samme subnet:</w:t>
+      </w:r>
+    </w:p>
+    <w:p>
+      <w:pPr>
+        <w:spacing w:before="0" w:beforeAutospacing="off" w:after="200" w:afterAutospacing="off" w:line="276" w:lineRule="auto"/>
+        <w:rPr>
+          <w:rFonts w:ascii="Calibri" w:hAnsi="Calibri" w:eastAsia="Calibri" w:cs="Calibri" w:asciiTheme="majorAscii" w:hAnsiTheme="majorAscii" w:eastAsiaTheme="majorAscii" w:cstheme="majorAscii"/>
+          <w:b w:val="0"/>
+          <w:bCs w:val="0"/>
+          <w:noProof w:val="0"/>
+          <w:sz w:val="22"/>
+          <w:szCs w:val="22"/>
+          <w:lang w:val="en-US"/>
+        </w:rPr>
+      </w:pPr>
+      <w:r>
+        <w:rPr>
+          <w:rFonts w:ascii="Calibri" w:hAnsi="Calibri" w:eastAsia="Calibri" w:cs="Calibri" w:asciiTheme="majorAscii" w:hAnsiTheme="majorAscii" w:eastAsiaTheme="majorAscii" w:cstheme="majorAscii"/>
+          <w:b w:val="0"/>
+          <w:bCs w:val="0"/>
+          <w:noProof w:val="0"/>
+          <w:sz w:val="22"/>
+          <w:szCs w:val="22"/>
+          <w:lang w:val="en-US"/>
+        </w:rPr>
+        <w:t>192.168.10.0/24</w:t>
+      </w:r>
+    </w:p>
+    <w:p>
+      <w:pPr>
+        <w:spacing w:before="0" w:beforeAutospacing="off" w:after="200" w:afterAutospacing="off" w:line="276" w:lineRule="auto"/>
+        <w:rPr>
+          <w:rFonts w:ascii="Calibri" w:hAnsi="Calibri" w:eastAsia="Calibri" w:cs="Calibri" w:asciiTheme="majorAscii" w:hAnsiTheme="majorAscii" w:eastAsiaTheme="majorAscii" w:cstheme="majorAscii"/>
+          <w:b w:val="0"/>
+          <w:bCs w:val="0"/>
+          <w:noProof w:val="0"/>
+          <w:sz w:val="22"/>
+          <w:szCs w:val="22"/>
+          <w:lang w:val="en-US"/>
+        </w:rPr>
+      </w:pPr>
+      <w:r>
+        <w:rPr>
+          <w:rFonts w:ascii="Calibri" w:hAnsi="Calibri" w:eastAsia="Calibri" w:cs="Calibri" w:asciiTheme="majorAscii" w:hAnsiTheme="majorAscii" w:eastAsiaTheme="majorAscii" w:cstheme="majorAscii"/>
+          <w:b w:val="0"/>
+          <w:bCs w:val="0"/>
+          <w:noProof w:val="0"/>
+          <w:sz w:val="22"/>
+          <w:szCs w:val="22"/>
+          <w:lang w:val="en-US"/>
+        </w:rPr>
+        <w:t>Det gjorde det uklart, om trafikken til serveren gik gennem VPN-tunnelen eller direkte gennem LAN-forbindelsen.</w:t>
+      </w:r>
+    </w:p>
+    <w:p>
+      <w:pPr>
+        <w:pStyle w:val="Heading3"/>
+        <w:spacing w:before="200" w:beforeAutospacing="off" w:after="0" w:afterAutospacing="off" w:line="276" w:lineRule="auto"/>
+        <w:rPr>
+          <w:rFonts w:ascii="Calibri" w:hAnsi="Calibri" w:eastAsia="Calibri" w:cs="Calibri" w:asciiTheme="majorAscii" w:hAnsiTheme="majorAscii" w:eastAsiaTheme="majorAscii" w:cstheme="majorAscii"/>
+          <w:b w:val="0"/>
+          <w:bCs w:val="0"/>
+          <w:noProof w:val="0"/>
+          <w:color w:val="4F81BD" w:themeColor="accent1" w:themeTint="FF" w:themeShade="FF"/>
+          <w:sz w:val="22"/>
+          <w:szCs w:val="22"/>
+          <w:lang w:val="en-US"/>
+        </w:rPr>
+      </w:pPr>
+      <w:r>
+        <w:rPr>
+          <w:rFonts w:ascii="Calibri" w:hAnsi="Calibri" w:eastAsia="Calibri" w:cs="Calibri" w:asciiTheme="majorAscii" w:hAnsiTheme="majorAscii" w:eastAsiaTheme="majorAscii" w:cstheme="majorAscii"/>
+          <w:b w:val="0"/>
+          <w:bCs w:val="0"/>
+          <w:noProof w:val="0"/>
+          <w:color w:val="4F81BD" w:themeColor="accent1" w:themeTint="FF" w:themeShade="FF"/>
+          <w:sz w:val="22"/>
+          <w:szCs w:val="22"/>
+          <w:lang w:val="en-US"/>
+        </w:rPr>
+        <w:t>Årsag</w:t>
+      </w:r>
+    </w:p>
+    <w:p>
+      <w:pPr>
+        <w:spacing w:before="0" w:beforeAutospacing="off" w:after="200" w:afterAutospacing="off" w:line="276" w:lineRule="auto"/>
+        <w:rPr>
+          <w:rFonts w:ascii="Calibri" w:hAnsi="Calibri" w:eastAsia="Calibri" w:cs="Calibri" w:asciiTheme="majorAscii" w:hAnsiTheme="majorAscii" w:eastAsiaTheme="majorAscii" w:cstheme="majorAscii"/>
+          <w:b w:val="0"/>
+          <w:bCs w:val="0"/>
+          <w:noProof w:val="0"/>
+          <w:sz w:val="22"/>
+          <w:szCs w:val="22"/>
+          <w:lang w:val="en-US"/>
+        </w:rPr>
+      </w:pPr>
+      <w:r>
+        <w:rPr>
+          <w:rFonts w:ascii="Calibri" w:hAnsi="Calibri" w:eastAsia="Calibri" w:cs="Calibri" w:asciiTheme="majorAscii" w:hAnsiTheme="majorAscii" w:eastAsiaTheme="majorAscii" w:cstheme="majorAscii"/>
+          <w:b w:val="0"/>
+          <w:bCs w:val="0"/>
+          <w:noProof w:val="0"/>
+          <w:sz w:val="22"/>
+          <w:szCs w:val="22"/>
+          <w:lang w:val="en-US"/>
+        </w:rPr>
+        <w:t>VPN-adressepoolen var oprindeligt konfigureret i samme netværk som det interne LAN.</w:t>
+      </w:r>
+    </w:p>
+    <w:p>
+      <w:pPr>
+        <w:pStyle w:val="Heading3"/>
+        <w:spacing w:before="200" w:beforeAutospacing="off" w:after="0" w:afterAutospacing="off" w:line="276" w:lineRule="auto"/>
+        <w:rPr>
+          <w:rFonts w:ascii="Calibri" w:hAnsi="Calibri" w:eastAsia="Calibri" w:cs="Calibri" w:asciiTheme="majorAscii" w:hAnsiTheme="majorAscii" w:eastAsiaTheme="majorAscii" w:cstheme="majorAscii"/>
+          <w:b w:val="0"/>
+          <w:bCs w:val="0"/>
+          <w:noProof w:val="0"/>
+          <w:color w:val="4F81BD" w:themeColor="accent1" w:themeTint="FF" w:themeShade="FF"/>
+          <w:sz w:val="22"/>
+          <w:szCs w:val="22"/>
+          <w:lang w:val="en-US"/>
+        </w:rPr>
+      </w:pPr>
+      <w:r>
+        <w:rPr>
+          <w:rFonts w:ascii="Calibri" w:hAnsi="Calibri" w:eastAsia="Calibri" w:cs="Calibri" w:asciiTheme="majorAscii" w:hAnsiTheme="majorAscii" w:eastAsiaTheme="majorAscii" w:cstheme="majorAscii"/>
+          <w:b w:val="0"/>
+          <w:bCs w:val="0"/>
+          <w:noProof w:val="0"/>
+          <w:color w:val="4F81BD" w:themeColor="accent1" w:themeTint="FF" w:themeShade="FF"/>
+          <w:sz w:val="22"/>
+          <w:szCs w:val="22"/>
+          <w:lang w:val="en-US"/>
+        </w:rPr>
+        <w:t>Løsning</w:t>
+      </w:r>
+    </w:p>
+    <w:p>
+      <w:pPr>
+        <w:spacing w:before="0" w:beforeAutospacing="off" w:after="200" w:afterAutospacing="off" w:line="276" w:lineRule="auto"/>
+        <w:rPr>
+          <w:rFonts w:ascii="Calibri" w:hAnsi="Calibri" w:eastAsia="Calibri" w:cs="Calibri" w:asciiTheme="majorAscii" w:hAnsiTheme="majorAscii" w:eastAsiaTheme="majorAscii" w:cstheme="majorAscii"/>
+          <w:b w:val="0"/>
+          <w:bCs w:val="0"/>
+          <w:noProof w:val="0"/>
+          <w:sz w:val="22"/>
+          <w:szCs w:val="22"/>
+          <w:lang w:val="en-US"/>
+        </w:rPr>
+      </w:pPr>
+      <w:r>
+        <w:rPr>
+          <w:rFonts w:ascii="Calibri" w:hAnsi="Calibri" w:eastAsia="Calibri" w:cs="Calibri" w:asciiTheme="majorAscii" w:hAnsiTheme="majorAscii" w:eastAsiaTheme="majorAscii" w:cstheme="majorAscii"/>
+          <w:b w:val="0"/>
+          <w:bCs w:val="0"/>
+          <w:noProof w:val="0"/>
+          <w:sz w:val="22"/>
+          <w:szCs w:val="22"/>
+          <w:lang w:val="en-US"/>
+        </w:rPr>
+        <w:t>Der blev oprettet et separat VPN-netværk:</w:t>
+      </w:r>
+    </w:p>
+    <w:p>
+      <w:pPr>
+        <w:spacing w:before="0" w:beforeAutospacing="off" w:after="200" w:afterAutospacing="off" w:line="276" w:lineRule="auto"/>
+        <w:rPr>
+          <w:rFonts w:ascii="Calibri" w:hAnsi="Calibri" w:eastAsia="Calibri" w:cs="Calibri" w:asciiTheme="majorAscii" w:hAnsiTheme="majorAscii" w:eastAsiaTheme="majorAscii" w:cstheme="majorAscii"/>
+          <w:b w:val="0"/>
+          <w:bCs w:val="0"/>
+          <w:noProof w:val="0"/>
+          <w:sz w:val="22"/>
+          <w:szCs w:val="22"/>
+          <w:lang w:val="en-US"/>
+        </w:rPr>
+      </w:pPr>
+      <w:r>
+        <w:rPr>
+          <w:rFonts w:ascii="Calibri" w:hAnsi="Calibri" w:eastAsia="Calibri" w:cs="Calibri" w:asciiTheme="majorAscii" w:hAnsiTheme="majorAscii" w:eastAsiaTheme="majorAscii" w:cstheme="majorAscii"/>
+          <w:b w:val="0"/>
+          <w:bCs w:val="0"/>
+          <w:noProof w:val="0"/>
+          <w:sz w:val="22"/>
+          <w:szCs w:val="22"/>
+          <w:lang w:val="en-US"/>
+        </w:rPr>
+        <w:t>VPN-netværk: 192.168.20.0/24</w:t>
+      </w:r>
+    </w:p>
+    <w:p>
+      <w:pPr>
+        <w:spacing w:before="0" w:beforeAutospacing="off" w:after="200" w:afterAutospacing="off" w:line="276" w:lineRule="auto"/>
+        <w:rPr>
+          <w:rFonts w:ascii="Calibri" w:hAnsi="Calibri" w:eastAsia="Calibri" w:cs="Calibri" w:asciiTheme="majorAscii" w:hAnsiTheme="majorAscii" w:eastAsiaTheme="majorAscii" w:cstheme="majorAscii"/>
+          <w:b w:val="0"/>
+          <w:bCs w:val="0"/>
+          <w:noProof w:val="0"/>
+          <w:sz w:val="22"/>
+          <w:szCs w:val="22"/>
+          <w:lang w:val="en-US"/>
+        </w:rPr>
+      </w:pPr>
+      <w:r>
+        <w:rPr>
+          <w:rFonts w:ascii="Calibri" w:hAnsi="Calibri" w:eastAsia="Calibri" w:cs="Calibri" w:asciiTheme="majorAscii" w:hAnsiTheme="majorAscii" w:eastAsiaTheme="majorAscii" w:cstheme="majorAscii"/>
+          <w:b w:val="0"/>
+          <w:bCs w:val="0"/>
+          <w:noProof w:val="0"/>
+          <w:sz w:val="22"/>
+          <w:szCs w:val="22"/>
+          <w:lang w:val="en-US"/>
+        </w:rPr>
+        <w:t>VPN-adressepool: 192.168.20.200 – 192.168.20.220</w:t>
+      </w:r>
+    </w:p>
+    <w:p>
+      <w:pPr>
+        <w:spacing w:before="0" w:beforeAutospacing="off" w:after="200" w:afterAutospacing="off" w:line="276" w:lineRule="auto"/>
+        <w:rPr>
+          <w:rFonts w:ascii="Calibri" w:hAnsi="Calibri" w:eastAsia="Calibri" w:cs="Calibri" w:asciiTheme="majorAscii" w:hAnsiTheme="majorAscii" w:eastAsiaTheme="majorAscii" w:cstheme="majorAscii"/>
+          <w:b w:val="0"/>
+          <w:bCs w:val="0"/>
+          <w:noProof w:val="0"/>
+          <w:sz w:val="22"/>
+          <w:szCs w:val="22"/>
+          <w:lang w:val="en-US"/>
+        </w:rPr>
+      </w:pPr>
+      <w:r>
+        <w:rPr>
+          <w:rFonts w:ascii="Calibri" w:hAnsi="Calibri" w:eastAsia="Calibri" w:cs="Calibri" w:asciiTheme="majorAscii" w:hAnsiTheme="majorAscii" w:eastAsiaTheme="majorAscii" w:cstheme="majorAscii"/>
+          <w:b w:val="0"/>
+          <w:bCs w:val="0"/>
+          <w:noProof w:val="0"/>
+          <w:sz w:val="22"/>
+          <w:szCs w:val="22"/>
+          <w:lang w:val="en-US"/>
+        </w:rPr>
+        <w:t>VPN-klienten fik derefter eksempelvis:</w:t>
+      </w:r>
+    </w:p>
+    <w:p>
+      <w:pPr>
+        <w:spacing w:before="0" w:beforeAutospacing="off" w:after="200" w:afterAutospacing="off" w:line="276" w:lineRule="auto"/>
+        <w:rPr>
+          <w:rFonts w:ascii="Calibri" w:hAnsi="Calibri" w:eastAsia="Calibri" w:cs="Calibri" w:asciiTheme="majorAscii" w:hAnsiTheme="majorAscii" w:eastAsiaTheme="majorAscii" w:cstheme="majorAscii"/>
+          <w:b w:val="0"/>
+          <w:bCs w:val="0"/>
+          <w:noProof w:val="0"/>
+          <w:sz w:val="22"/>
+          <w:szCs w:val="22"/>
+          <w:lang w:val="en-US"/>
+        </w:rPr>
+      </w:pPr>
+      <w:r>
+        <w:rPr>
+          <w:rFonts w:ascii="Calibri" w:hAnsi="Calibri" w:eastAsia="Calibri" w:cs="Calibri" w:asciiTheme="majorAscii" w:hAnsiTheme="majorAscii" w:eastAsiaTheme="majorAscii" w:cstheme="majorAscii"/>
+          <w:b w:val="0"/>
+          <w:bCs w:val="0"/>
+          <w:noProof w:val="0"/>
+          <w:sz w:val="22"/>
+          <w:szCs w:val="22"/>
+          <w:lang w:val="en-US"/>
+        </w:rPr>
+        <w:t>192.168.20.201</w:t>
+      </w:r>
+    </w:p>
+    <w:p>
+      <w:pPr>
+        <w:pStyle w:val="Heading3"/>
+        <w:spacing w:before="200" w:beforeAutospacing="off" w:after="0" w:afterAutospacing="off" w:line="276" w:lineRule="auto"/>
+        <w:rPr>
+          <w:rFonts w:ascii="Calibri" w:hAnsi="Calibri" w:eastAsia="Calibri" w:cs="Calibri" w:asciiTheme="majorAscii" w:hAnsiTheme="majorAscii" w:eastAsiaTheme="majorAscii" w:cstheme="majorAscii"/>
+          <w:b w:val="0"/>
+          <w:bCs w:val="0"/>
+          <w:noProof w:val="0"/>
+          <w:color w:val="4F81BD" w:themeColor="accent1" w:themeTint="FF" w:themeShade="FF"/>
+          <w:sz w:val="22"/>
+          <w:szCs w:val="22"/>
+          <w:lang w:val="en-US"/>
+        </w:rPr>
+      </w:pPr>
+      <w:r>
+        <w:rPr>
+          <w:rFonts w:ascii="Calibri" w:hAnsi="Calibri" w:eastAsia="Calibri" w:cs="Calibri" w:asciiTheme="majorAscii" w:hAnsiTheme="majorAscii" w:eastAsiaTheme="majorAscii" w:cstheme="majorAscii"/>
+          <w:b w:val="0"/>
+          <w:bCs w:val="0"/>
+          <w:noProof w:val="0"/>
+          <w:color w:val="4F81BD" w:themeColor="accent1" w:themeTint="FF" w:themeShade="FF"/>
+          <w:sz w:val="22"/>
+          <w:szCs w:val="22"/>
+          <w:lang w:val="en-US"/>
+        </w:rPr>
+        <w:t>Resultat</w:t>
+      </w:r>
+    </w:p>
+    <w:p>
+      <w:pPr>
+        <w:spacing w:before="0" w:beforeAutospacing="off" w:after="200" w:afterAutospacing="off" w:line="276" w:lineRule="auto"/>
+        <w:rPr>
+          <w:rFonts w:ascii="Calibri" w:hAnsi="Calibri" w:eastAsia="Calibri" w:cs="Calibri" w:asciiTheme="majorAscii" w:hAnsiTheme="majorAscii" w:eastAsiaTheme="majorAscii" w:cstheme="majorAscii"/>
+          <w:b w:val="0"/>
+          <w:bCs w:val="0"/>
+          <w:noProof w:val="0"/>
+          <w:sz w:val="22"/>
+          <w:szCs w:val="22"/>
+          <w:lang w:val="en-US"/>
+        </w:rPr>
+      </w:pPr>
+      <w:r>
+        <w:rPr>
+          <w:rFonts w:ascii="Calibri" w:hAnsi="Calibri" w:eastAsia="Calibri" w:cs="Calibri" w:asciiTheme="majorAscii" w:hAnsiTheme="majorAscii" w:eastAsiaTheme="majorAscii" w:cstheme="majorAscii"/>
+          <w:b w:val="0"/>
+          <w:bCs w:val="0"/>
+          <w:noProof w:val="0"/>
+          <w:sz w:val="22"/>
+          <w:szCs w:val="22"/>
+          <w:lang w:val="en-US"/>
+        </w:rPr>
+        <w:t>VPN-klienten fik en separat IP-adresse fra VPN-netværket. Routing blev testet med:</w:t>
+      </w:r>
+    </w:p>
+    <w:p>
+      <w:pPr>
+        <w:spacing w:before="0" w:beforeAutospacing="off" w:after="200" w:afterAutospacing="off" w:line="276" w:lineRule="auto"/>
+        <w:rPr>
+          <w:rFonts w:ascii="Calibri" w:hAnsi="Calibri" w:eastAsia="Calibri" w:cs="Calibri" w:asciiTheme="majorAscii" w:hAnsiTheme="majorAscii" w:eastAsiaTheme="majorAscii" w:cstheme="majorAscii"/>
+          <w:b w:val="0"/>
+          <w:bCs w:val="0"/>
+          <w:noProof w:val="0"/>
+          <w:sz w:val="22"/>
+          <w:szCs w:val="22"/>
+          <w:lang w:val="en-US"/>
+        </w:rPr>
+      </w:pPr>
+      <w:r>
+        <w:rPr>
+          <w:rFonts w:ascii="Calibri" w:hAnsi="Calibri" w:eastAsia="Calibri" w:cs="Calibri" w:asciiTheme="majorAscii" w:hAnsiTheme="majorAscii" w:eastAsiaTheme="majorAscii" w:cstheme="majorAscii"/>
+          <w:b w:val="0"/>
+          <w:bCs w:val="0"/>
+          <w:noProof w:val="0"/>
+          <w:sz w:val="22"/>
+          <w:szCs w:val="22"/>
+          <w:lang w:val="en-US"/>
+        </w:rPr>
+        <w:t>tracert -d 192.168.10.10</w:t>
+      </w:r>
+    </w:p>
+    <w:p>
+      <w:pPr>
+        <w:spacing w:before="0" w:beforeAutospacing="off" w:after="200" w:afterAutospacing="off" w:line="276" w:lineRule="auto"/>
+        <w:rPr>
+          <w:rFonts w:ascii="Calibri" w:hAnsi="Calibri" w:eastAsia="Calibri" w:cs="Calibri" w:asciiTheme="majorAscii" w:hAnsiTheme="majorAscii" w:eastAsiaTheme="majorAscii" w:cstheme="majorAscii"/>
+          <w:b w:val="0"/>
+          <w:bCs w:val="0"/>
+          <w:noProof w:val="0"/>
+          <w:sz w:val="22"/>
+          <w:szCs w:val="22"/>
+          <w:lang w:val="en-US"/>
+        </w:rPr>
+      </w:pPr>
+      <w:r>
+        <w:rPr>
+          <w:rFonts w:ascii="Calibri" w:hAnsi="Calibri" w:eastAsia="Calibri" w:cs="Calibri" w:asciiTheme="majorAscii" w:hAnsiTheme="majorAscii" w:eastAsiaTheme="majorAscii" w:cstheme="majorAscii"/>
+          <w:b w:val="0"/>
+          <w:bCs w:val="0"/>
+          <w:noProof w:val="0"/>
+          <w:sz w:val="22"/>
+          <w:szCs w:val="22"/>
+          <w:lang w:val="en-US"/>
+        </w:rPr>
+        <w:t>og forbindelsen blev bekræftet med:</w:t>
+      </w:r>
+    </w:p>
+    <w:p>
+      <w:pPr>
+        <w:spacing w:before="0" w:beforeAutospacing="off" w:after="200" w:afterAutospacing="off" w:line="276" w:lineRule="auto"/>
+        <w:rPr>
+          <w:rFonts w:ascii="Calibri" w:hAnsi="Calibri" w:eastAsia="Calibri" w:cs="Calibri" w:asciiTheme="majorAscii" w:hAnsiTheme="majorAscii" w:eastAsiaTheme="majorAscii" w:cstheme="majorAscii"/>
+          <w:b w:val="0"/>
+          <w:bCs w:val="0"/>
+          <w:noProof w:val="0"/>
+          <w:sz w:val="22"/>
+          <w:szCs w:val="22"/>
+          <w:lang w:val="en-US"/>
+        </w:rPr>
+      </w:pPr>
+      <w:r>
+        <w:rPr>
+          <w:rFonts w:ascii="Calibri" w:hAnsi="Calibri" w:eastAsia="Calibri" w:cs="Calibri" w:asciiTheme="majorAscii" w:hAnsiTheme="majorAscii" w:eastAsiaTheme="majorAscii" w:cstheme="majorAscii"/>
+          <w:b w:val="0"/>
+          <w:bCs w:val="0"/>
+          <w:noProof w:val="0"/>
+          <w:sz w:val="22"/>
+          <w:szCs w:val="22"/>
+          <w:lang w:val="en-US"/>
+        </w:rPr>
+        <w:t>ping 192.168.10.10</w:t>
+      </w:r>
+    </w:p>
+    <w:p>
+      <w:pPr>
+        <w:spacing w:before="0" w:beforeAutospacing="off" w:after="200" w:afterAutospacing="off" w:line="276" w:lineRule="auto"/>
+      </w:pPr>
+      <w:r>
+        <w:rPr>
+          <w:rFonts w:ascii="Calibri" w:hAnsi="Calibri" w:eastAsia="Calibri" w:cs="Calibri" w:asciiTheme="majorAscii" w:hAnsiTheme="majorAscii" w:eastAsiaTheme="majorAscii" w:cstheme="majorAscii"/>
+          <w:b w:val="0"/>
+          <w:bCs w:val="0"/>
+          <w:noProof w:val="0"/>
+          <w:sz w:val="22"/>
+          <w:szCs w:val="22"/>
+          <w:lang w:val="en-US"/>
+        </w:rPr>
+        <w:t xml:space="preserve">Resultatet var 0 % packet loss, og klienten kunne efterfølgende få adgang til serverens </w:t>
+      </w:r>
+      <w:r>
+        <w:rPr>
+          <w:rFonts w:ascii="Arial" w:hAnsi="Arial" w:eastAsia="Arial" w:cs="Arial"/>
+          <w:noProof w:val="0"/>
+          <w:sz w:val="22"/>
+          <w:szCs w:val="22"/>
+          <w:lang w:val="en-US"/>
+        </w:rPr>
+        <w:t>SMB-shares.</w:t>
       </w:r>
     </w:p>
     <w:p>

</xml_diff>

<commit_message>
Add backup, Windows Update and web server configuration
</commit_message>
<xml_diff>
--- a/Documentation/rapport.docx
+++ b/Documentation/rapport.docx
@@ -6110,25 +6110,86 @@
         <w:t>4.12 Webserver (IIS)</w:t>
       </w:r>
     </w:p>
-    <w:p xmlns:wp14="http://schemas.microsoft.com/office/word/2010/wordml" wp14:textId="77777777">
-      <w:pPr>
-        <w:rPr>
-          <w:b w:val="0"/>
-          <w:bCs w:val="0"/>
-          <w:u w:val="none"/>
-        </w:rPr>
-      </w:pPr>
-      <w:r>
-        <w:rPr>
-          <w:b w:val="0"/>
-          <w:bCs w:val="0"/>
-          <w:u w:val="none"/>
-        </w:rPr>
-        <w:t>Skriv indhold her...</w:t>
-      </w:r>
-      <w:r>
-        <w:br/>
-      </w:r>
+    <w:p xmlns:wp14="http://schemas.microsoft.com/office/word/2010/wordml" wp14:textId="2E519DCF">
+      <w:pPr/>
+      <w:r>
+        <w:rPr/>
+        <w:t>•</w:t>
+      </w:r>
+      <w:r>
+        <w:tab/>
+      </w:r>
+      <w:r>
+        <w:rPr/>
+        <w:t>IIS blev installeret på Windows Server.</w:t>
+      </w:r>
+    </w:p>
+    <w:p xmlns:wp14="http://schemas.microsoft.com/office/word/2010/wordml" wp14:textId="35F90BF1">
+      <w:pPr>
+        <w:pStyle w:val="Normal"/>
+      </w:pPr>
+      <w:r>
+        <w:rPr/>
+        <w:t>•</w:t>
+      </w:r>
+      <w:r>
+        <w:tab/>
+      </w:r>
+      <w:r>
+        <w:rPr/>
+        <w:t>Webmappen er C:\inetpub\wwwroot.</w:t>
+      </w:r>
+    </w:p>
+    <w:p xmlns:wp14="http://schemas.microsoft.com/office/word/2010/wordml" wp14:textId="34175C8B">
+      <w:pPr>
+        <w:pStyle w:val="Normal"/>
+      </w:pPr>
+      <w:r>
+        <w:rPr/>
+        <w:t>•</w:t>
+      </w:r>
+      <w:r>
+        <w:tab/>
+      </w:r>
+      <w:r>
+        <w:rPr/>
+        <w:t>index.html blev placeret i wwwroot.</w:t>
+      </w:r>
+    </w:p>
+    <w:p xmlns:wp14="http://schemas.microsoft.com/office/word/2010/wordml" wp14:textId="6BB3E3C2">
+      <w:pPr>
+        <w:pStyle w:val="Normal"/>
+      </w:pPr>
+      <w:r>
+        <w:rPr/>
+        <w:t>•</w:t>
+      </w:r>
+      <w:r>
+        <w:tab/>
+      </w:r>
+      <w:r>
+        <w:rPr/>
+        <w:t>Webserveren blev testet via browseren.</w:t>
+      </w:r>
+    </w:p>
+    <w:p xmlns:wp14="http://schemas.microsoft.com/office/word/2010/wordml" wp14:textId="0EBCCACA">
+      <w:pPr>
+        <w:pStyle w:val="Normal"/>
+      </w:pPr>
+      <w:r>
+        <w:rPr/>
+        <w:t>•</w:t>
+      </w:r>
+      <w:r>
+        <w:tab/>
+      </w:r>
+      <w:r>
+        <w:rPr/>
+        <w:t>Novatech-websiden bruges som serverens hjemmeside.</w:t>
+      </w:r>
+    </w:p>
+    <w:p xmlns:wp14="http://schemas.microsoft.com/office/word/2010/wordml" wp14:textId="069B824F">
+      <w:pPr/>
     </w:p>
     <w:p xmlns:wp14="http://schemas.microsoft.com/office/word/2010/wordml" wp14:textId="77777777">
       <w:pPr>
@@ -6675,7 +6736,7 @@
         </w:rPr>
         <w:t xml:space="preserve">SMB-adgang blev testet via </w:t>
       </w:r>
-      <w:hyperlink r:id="R33b4df5d0e5748db">
+      <w:hyperlink r:id="R5453d1e14a6d4637">
         <w:r>
           <w:rPr>
             <w:rStyle w:val="Hyperlink"/>
@@ -6695,7 +6756,7 @@
         </w:rPr>
         <w:t xml:space="preserve"> og </w:t>
       </w:r>
-      <w:hyperlink r:id="R92aa2b8a2357483c">
+      <w:hyperlink r:id="R9092a9f23e324867">
         <w:r>
           <w:rPr>
             <w:rStyle w:val="Hyperlink"/>
@@ -7366,25 +7427,316 @@
         <w:t>5.6 Backup</w:t>
       </w:r>
     </w:p>
-    <w:p xmlns:wp14="http://schemas.microsoft.com/office/word/2010/wordml" wp14:textId="77777777">
-      <w:pPr>
-        <w:rPr>
-          <w:b w:val="0"/>
-          <w:bCs w:val="0"/>
-          <w:u w:val="none"/>
-        </w:rPr>
-      </w:pPr>
-      <w:r>
-        <w:rPr>
-          <w:b w:val="0"/>
-          <w:bCs w:val="0"/>
-          <w:u w:val="none"/>
-        </w:rPr>
-        <w:t>Skriv indhold her...</w:t>
-      </w:r>
-      <w:r>
-        <w:br/>
-      </w:r>
+    <w:p xmlns:wp14="http://schemas.microsoft.com/office/word/2010/wordml" wp14:textId="74E87570">
+      <w:pPr/>
+      <w:r>
+        <w:rPr/>
+        <w:t>Formål</w:t>
+      </w:r>
+    </w:p>
+    <w:p xmlns:wp14="http://schemas.microsoft.com/office/word/2010/wordml" wp14:textId="51AE0041">
+      <w:pPr>
+        <w:pStyle w:val="Normal"/>
+      </w:pPr>
+      <w:r>
+        <w:rPr/>
+        <w:t>Formålet med scriptet er automatisk at kopiere brugerens dokumenter til brugerens personlige mappe på serveren ved logon/logoff-processen.</w:t>
+      </w:r>
+    </w:p>
+    <w:p xmlns:wp14="http://schemas.microsoft.com/office/word/2010/wordml" wp14:textId="6BC1ED69">
+      <w:pPr>
+        <w:pStyle w:val="Normal"/>
+      </w:pPr>
+      <w:r>
+        <w:rPr/>
+        <w:t>1. Oprettelse af scriptet</w:t>
+      </w:r>
+    </w:p>
+    <w:p xmlns:wp14="http://schemas.microsoft.com/office/word/2010/wordml" wp14:textId="372FAB70">
+      <w:pPr>
+        <w:pStyle w:val="Normal"/>
+      </w:pPr>
+      <w:r>
+        <w:rPr/>
+        <w:t>Der blev oprettet et batch-script med navnet logoff.bat. Scriptet blev placeret på serverens delte mappe, så det kunne anvendes af klienterne.</w:t>
+      </w:r>
+    </w:p>
+    <w:p xmlns:wp14="http://schemas.microsoft.com/office/word/2010/wordml" wp14:textId="59A8F871">
+      <w:pPr>
+        <w:pStyle w:val="Normal"/>
+      </w:pPr>
+      <w:r>
+        <w:rPr/>
+        <w:t>2. Kontrol af administratorbrugeren</w:t>
+      </w:r>
+    </w:p>
+    <w:p xmlns:wp14="http://schemas.microsoft.com/office/word/2010/wordml" wp14:textId="2C8765E9">
+      <w:pPr>
+        <w:pStyle w:val="Normal"/>
+      </w:pPr>
+      <w:r>
+        <w:rPr/>
+        <w:t>Scriptet kontrollerer først brugernavnet. Hvis brugeren er Administrator, afsluttes scriptet, så administratorens filer ikke bliver kopieret.</w:t>
+      </w:r>
+    </w:p>
+    <w:p xmlns:wp14="http://schemas.microsoft.com/office/word/2010/wordml" wp14:textId="435A02FD">
+      <w:pPr>
+        <w:pStyle w:val="Normal"/>
+      </w:pPr>
+      <w:r>
+        <w:rPr/>
+        <w:t>3. Oprettelse af brugerens backupmappe</w:t>
+      </w:r>
+    </w:p>
+    <w:p xmlns:wp14="http://schemas.microsoft.com/office/word/2010/wordml" wp14:textId="3EA1391B">
+      <w:pPr>
+        <w:pStyle w:val="Normal"/>
+      </w:pPr>
+      <w:r>
+        <w:rPr/>
+        <w:t>Hvis brugerens destinationsmappe ikke findes på serveren, opretter scriptet den automatisk. Destinationen følger brugerens navn, fx:</w:t>
+      </w:r>
+    </w:p>
+    <w:p xmlns:wp14="http://schemas.microsoft.com/office/word/2010/wordml" wp14:textId="04B328BD">
+      <w:pPr>
+        <w:pStyle w:val="Normal"/>
+      </w:pPr>
+      <w:r>
+        <w:fldChar w:fldCharType="begin"/>
+      </w:r>
+      <w:r>
+        <w:instrText xml:space="preserve">HYPERLINK "file:///\\SRV01\users\%USERNAME%\Dokumenter" </w:instrText>
+      </w:r>
+      <w:r>
+        <w:fldChar w:fldCharType="separate"/>
+      </w:r>
+      <w:r>
+        <w:rPr/>
+        <w:t>\\SRV01\users\%USERNAME%\Dokumenter</w:t>
+      </w:r>
+      <w:r>
+        <w:fldChar w:fldCharType="end"/>
+      </w:r>
+    </w:p>
+    <w:p xmlns:wp14="http://schemas.microsoft.com/office/word/2010/wordml" wp14:textId="4A9A62C6">
+      <w:pPr>
+        <w:pStyle w:val="Normal"/>
+      </w:pPr>
+      <w:r>
+        <w:rPr/>
+        <w:t>4. Kopiering med Robocopy</w:t>
+      </w:r>
+    </w:p>
+    <w:p xmlns:wp14="http://schemas.microsoft.com/office/word/2010/wordml" wp14:textId="5443F3B6">
+      <w:pPr>
+        <w:pStyle w:val="Normal"/>
+      </w:pPr>
+      <w:r>
+        <w:rPr/>
+        <w:t>Til selve kopieringen anvendes Robocopy. Den lokale Documents-mappe kopieres til brugerens personlige mappe på serveren.</w:t>
+      </w:r>
+    </w:p>
+    <w:p xmlns:wp14="http://schemas.microsoft.com/office/word/2010/wordml" wp14:textId="4D64B840">
+      <w:pPr>
+        <w:pStyle w:val="Normal"/>
+      </w:pPr>
+      <w:r>
+        <w:rPr/>
+        <w:t>robocopy "%USERPROFILE%\Documents" "</w:t>
+      </w:r>
+      <w:r>
+        <w:fldChar w:fldCharType="begin"/>
+      </w:r>
+      <w:r>
+        <w:instrText xml:space="preserve">HYPERLINK "file:///\\SRV01\users\%USERNAME%\Dokumenter" </w:instrText>
+      </w:r>
+      <w:r>
+        <w:fldChar w:fldCharType="separate"/>
+      </w:r>
+      <w:r>
+        <w:rPr/>
+        <w:t>\\SRV01\users\%USERNAME%\Dokumenter</w:t>
+      </w:r>
+      <w:r>
+        <w:fldChar w:fldCharType="end"/>
+      </w:r>
+      <w:r>
+        <w:rPr/>
+        <w:t>" /E /XO /R:2 /W:2 /NP</w:t>
+      </w:r>
+    </w:p>
+    <w:p xmlns:wp14="http://schemas.microsoft.com/office/word/2010/wordml" wp14:textId="567E2DCF">
+      <w:pPr>
+        <w:pStyle w:val="Normal"/>
+      </w:pPr>
+      <w:r>
+        <w:rPr/>
+        <w:t>Parametre i Robocopy:</w:t>
+      </w:r>
+    </w:p>
+    <w:p xmlns:wp14="http://schemas.microsoft.com/office/word/2010/wordml" wp14:textId="05DB1119">
+      <w:pPr>
+        <w:pStyle w:val="Normal"/>
+      </w:pPr>
+      <w:r>
+        <w:rPr/>
+        <w:t xml:space="preserve"> </w:t>
+      </w:r>
+    </w:p>
+    <w:p xmlns:wp14="http://schemas.microsoft.com/office/word/2010/wordml" wp14:textId="0C77D5FA">
+      <w:pPr>
+        <w:pStyle w:val="Normal"/>
+      </w:pPr>
+      <w:r>
+        <w:rPr/>
+        <w:t>•</w:t>
+      </w:r>
+      <w:r>
+        <w:tab/>
+      </w:r>
+      <w:r>
+        <w:rPr/>
+        <w:t>/E – kopierer også undermapper.</w:t>
+      </w:r>
+    </w:p>
+    <w:p xmlns:wp14="http://schemas.microsoft.com/office/word/2010/wordml" wp14:textId="6176DB5A">
+      <w:pPr>
+        <w:pStyle w:val="Normal"/>
+      </w:pPr>
+      <w:r>
+        <w:rPr/>
+        <w:t>•</w:t>
+      </w:r>
+      <w:r>
+        <w:tab/>
+      </w:r>
+      <w:r>
+        <w:rPr/>
+        <w:t>/XO – undgår at overskrive nyere filer med ældre filer.</w:t>
+      </w:r>
+    </w:p>
+    <w:p xmlns:wp14="http://schemas.microsoft.com/office/word/2010/wordml" wp14:textId="63A9ADD0">
+      <w:pPr>
+        <w:pStyle w:val="Normal"/>
+      </w:pPr>
+      <w:r>
+        <w:rPr/>
+        <w:t>•</w:t>
+      </w:r>
+      <w:r>
+        <w:tab/>
+      </w:r>
+      <w:r>
+        <w:rPr/>
+        <w:t>/R:2 – forsøger højst to gange igen ved fejl.</w:t>
+      </w:r>
+    </w:p>
+    <w:p xmlns:wp14="http://schemas.microsoft.com/office/word/2010/wordml" wp14:textId="6337834D">
+      <w:pPr>
+        <w:pStyle w:val="Normal"/>
+      </w:pPr>
+      <w:r>
+        <w:rPr/>
+        <w:t>•</w:t>
+      </w:r>
+      <w:r>
+        <w:tab/>
+      </w:r>
+      <w:r>
+        <w:rPr/>
+        <w:t>/W:2 – venter to sekunder mellem forsøg.</w:t>
+      </w:r>
+    </w:p>
+    <w:p xmlns:wp14="http://schemas.microsoft.com/office/word/2010/wordml" wp14:textId="3D91FDD2">
+      <w:pPr>
+        <w:pStyle w:val="Normal"/>
+      </w:pPr>
+      <w:r>
+        <w:rPr/>
+        <w:t>•</w:t>
+      </w:r>
+      <w:r>
+        <w:tab/>
+      </w:r>
+      <w:r>
+        <w:rPr/>
+        <w:t>/NP – viser ikke progressionsprocent.</w:t>
+      </w:r>
+    </w:p>
+    <w:p xmlns:wp14="http://schemas.microsoft.com/office/word/2010/wordml" wp14:textId="50427758">
+      <w:pPr>
+        <w:pStyle w:val="Normal"/>
+      </w:pPr>
+      <w:r>
+        <w:rPr/>
+        <w:t>5. Tilknytning via Group Policy</w:t>
+      </w:r>
+    </w:p>
+    <w:p xmlns:wp14="http://schemas.microsoft.com/office/word/2010/wordml" wp14:textId="3D94E334">
+      <w:pPr>
+        <w:pStyle w:val="Normal"/>
+      </w:pPr>
+      <w:r>
+        <w:rPr/>
+        <w:t>Scriptet blev tilknyttet i Group Policy som et logoff-script, så det køres automatisk, når brugeren logger af klienten.</w:t>
+      </w:r>
+    </w:p>
+    <w:p xmlns:wp14="http://schemas.microsoft.com/office/word/2010/wordml" wp14:textId="0DCA0736">
+      <w:pPr>
+        <w:pStyle w:val="Normal"/>
+      </w:pPr>
+      <w:r>
+        <w:rPr/>
+        <w:t>6. Test og fejlfinding</w:t>
+      </w:r>
+    </w:p>
+    <w:p xmlns:wp14="http://schemas.microsoft.com/office/word/2010/wordml" wp14:textId="65EAE798">
+      <w:pPr>
+        <w:pStyle w:val="Normal"/>
+      </w:pPr>
+      <w:r>
+        <w:rPr/>
+        <w:t>Løsningen blev testet med flere brugere. Undervejs blev scriptet ændret flere gange for at løse problemer med sti, oprettelse af mapper og kopiering. Efter justeringerne blev løsningen testet igen ved at oprette testfiler i brugerens Documents-mappe og derefter logge af.</w:t>
+      </w:r>
+    </w:p>
+    <w:p xmlns:wp14="http://schemas.microsoft.com/office/word/2010/wordml" wp14:textId="00EA5836">
+      <w:pPr>
+        <w:pStyle w:val="Normal"/>
+      </w:pPr>
+      <w:r>
+        <w:rPr/>
+        <w:t>7. Resultat</w:t>
+      </w:r>
+    </w:p>
+    <w:p xmlns:wp14="http://schemas.microsoft.com/office/word/2010/wordml" wp14:textId="573AD70F">
+      <w:pPr>
+        <w:pStyle w:val="Normal"/>
+      </w:pPr>
+      <w:r>
+        <w:rPr/>
+        <w:t>Ved den endelige test blev brugerens mappe automatisk oprettet på serveren, og testfilerne blev kopieret til den korrekte destinationsmappe. Backupfunktionen blev dermed verificeret.</w:t>
+      </w:r>
+    </w:p>
+    <w:p xmlns:wp14="http://schemas.microsoft.com/office/word/2010/wordml" wp14:textId="587BA6E9">
+      <w:pPr>
+        <w:pStyle w:val="Normal"/>
+      </w:pPr>
+      <w:r>
+        <w:rPr/>
+        <w:t>Bemærkning</w:t>
+      </w:r>
+    </w:p>
+    <w:p xmlns:wp14="http://schemas.microsoft.com/office/word/2010/wordml" wp14:textId="3F27F013">
+      <w:pPr>
+        <w:pStyle w:val="Normal"/>
+      </w:pPr>
+      <w:r>
+        <w:rPr/>
+        <w:t>Scriptet blev justeret flere gange under implementeringen. Ændringerne var en del af fejlfindingen og testfasen, indtil kopieringen fungerede korrekt for brugerne.</w:t>
+      </w:r>
+    </w:p>
+    <w:p xmlns:wp14="http://schemas.microsoft.com/office/word/2010/wordml" wp14:textId="7CB70CE1">
+      <w:pPr/>
     </w:p>
     <w:p xmlns:wp14="http://schemas.microsoft.com/office/word/2010/wordml" wp14:textId="77777777">
       <w:pPr>
@@ -9671,9 +10023,383 @@
     </w:p>
     <w:p>
       <w:pPr>
+        <w:spacing w:before="0" w:beforeAutospacing="off" w:after="200" w:afterAutospacing="off" w:line="276" w:lineRule="auto"/>
+        <w:rPr>
+          <w:rFonts w:ascii="Arial" w:hAnsi="Arial" w:eastAsia="Arial" w:cs="Arial"/>
+          <w:noProof w:val="0"/>
+          <w:sz w:val="21"/>
+          <w:szCs w:val="21"/>
+          <w:lang w:val="en-US"/>
+        </w:rPr>
+      </w:pPr>
+    </w:p>
+    <w:p>
+      <w:pPr>
+        <w:pStyle w:val="Heading1"/>
+        <w:rPr>
+          <w:noProof w:val="0"/>
+          <w:sz w:val="24"/>
+          <w:szCs w:val="24"/>
+          <w:lang w:val="en-US"/>
+        </w:rPr>
+      </w:pPr>
+      <w:r>
+        <w:rPr>
+          <w:noProof w:val="0"/>
+          <w:lang w:val="en-US"/>
+        </w:rPr>
+        <w:t>8.Windows Update service</w:t>
+      </w:r>
+    </w:p>
+    <w:p>
+      <w:pPr>
         <w:pStyle w:val="Normal"/>
-        <w:rPr>
-          <w:noProof w:val="0"/>
+        <w:spacing w:before="0" w:beforeAutospacing="off" w:after="0" w:afterAutospacing="off"/>
+        <w:rPr>
+          <w:rFonts w:ascii="Calibri" w:hAnsi="Calibri" w:eastAsia="Calibri" w:cs="Calibri"/>
+          <w:noProof w:val="0"/>
+          <w:sz w:val="24"/>
+          <w:szCs w:val="24"/>
+          <w:lang w:val="de-DE"/>
+        </w:rPr>
+      </w:pPr>
+      <w:r>
+        <w:rPr>
+          <w:rFonts w:ascii="Calibri" w:hAnsi="Calibri" w:eastAsia="Calibri" w:cs="Calibri"/>
+          <w:noProof w:val="0"/>
+          <w:sz w:val="24"/>
+          <w:szCs w:val="24"/>
+          <w:lang w:val="de-DE"/>
+        </w:rPr>
+        <w:t>Formål Formålet var at konfigurere Windows Server Update Services (WSUS), så Windows-klienterne kan hente Windows-opdateringer fra den interne opdateringsserver i stedet for direkte fra Microsoft. Derudover skulle Group Policy bruges til at angive WSUS-serveren for klienterne og kontrollere, at klienten faktisk kommunikerer med WSUS og modtager opdateringer.</w:t>
+      </w:r>
+    </w:p>
+    <w:p>
+      <w:pPr>
+        <w:pStyle w:val="Normal"/>
+        <w:spacing w:before="0" w:beforeAutospacing="off" w:after="0" w:afterAutospacing="off"/>
+        <w:rPr>
+          <w:rFonts w:ascii="Calibri" w:hAnsi="Calibri" w:eastAsia="Calibri" w:cs="Calibri"/>
+          <w:noProof w:val="0"/>
+          <w:sz w:val="24"/>
+          <w:szCs w:val="24"/>
+          <w:lang w:val="de-DE"/>
+        </w:rPr>
+      </w:pPr>
+      <w:r>
+        <w:rPr>
+          <w:rFonts w:ascii="Calibri" w:hAnsi="Calibri" w:eastAsia="Calibri" w:cs="Calibri"/>
+          <w:noProof w:val="0"/>
+          <w:sz w:val="24"/>
+          <w:szCs w:val="24"/>
+          <w:lang w:val="de-DE"/>
+        </w:rPr>
+        <w:t>WSUS på serveren WSUS blev åbnet på serveren, og serveren blev kontrolleret for opdateringer og synkronisering. WSUS-konsollen viste, at der var mange tilgængelige opdateringer, blandt andet sikkerheds- og kritiske opdateringer. På serveren blev WSUS konfigureret til at fungere som den interne opdateringsservice. Klienterne skulle derfor pege på serverens WSUS-adresse.</w:t>
+      </w:r>
+    </w:p>
+    <w:p>
+      <w:pPr>
+        <w:pStyle w:val="Normal"/>
+        <w:spacing w:before="0" w:beforeAutospacing="off" w:after="0" w:afterAutospacing="off"/>
+        <w:rPr>
+          <w:rFonts w:ascii="Calibri" w:hAnsi="Calibri" w:eastAsia="Calibri" w:cs="Calibri"/>
+          <w:noProof w:val="0"/>
+          <w:sz w:val="24"/>
+          <w:szCs w:val="24"/>
+          <w:lang w:val="de-DE"/>
+        </w:rPr>
+      </w:pPr>
+      <w:r>
+        <w:rPr>
+          <w:rFonts w:ascii="Calibri" w:hAnsi="Calibri" w:eastAsia="Calibri" w:cs="Calibri"/>
+          <w:noProof w:val="0"/>
+          <w:sz w:val="24"/>
+          <w:szCs w:val="24"/>
+          <w:lang w:val="de-DE"/>
+        </w:rPr>
+        <w:t xml:space="preserve">Group Policy – WSUS-server I Group Policy Management Editor blev politikken: • Computer Configuration → Administrative Templates → Windows Components → Windows Update åbnet. Indstillingen “Specify intranet Microsoft update service location” blev sat til Enabled. WSUS-serveren blev angivet som: </w:t>
+      </w:r>
+      <w:hyperlink r:id="R244847c668ba4f20">
+        <w:r>
+          <w:rPr>
+            <w:rStyle w:val="Hyperlink"/>
+            <w:noProof w:val="0"/>
+            <w:sz w:val="24"/>
+            <w:szCs w:val="24"/>
+            <w:lang w:val="de-DE"/>
+          </w:rPr>
+          <w:t>http://SRV01:8530</w:t>
+        </w:r>
+      </w:hyperlink>
+      <w:r>
+        <w:rPr>
+          <w:rFonts w:ascii="Calibri" w:hAnsi="Calibri" w:eastAsia="Calibri" w:cs="Calibri"/>
+          <w:noProof w:val="0"/>
+          <w:sz w:val="24"/>
+          <w:szCs w:val="24"/>
+          <w:lang w:val="de-DE"/>
+        </w:rPr>
+        <w:t xml:space="preserve"> Dette betyder, at Windows Update-klienten på klientmaskinen skal bruge SRV01 som intern opdateringsserver.</w:t>
+      </w:r>
+    </w:p>
+    <w:p>
+      <w:pPr>
+        <w:pStyle w:val="Normal"/>
+        <w:spacing w:before="0" w:beforeAutospacing="off" w:after="0" w:afterAutospacing="off"/>
+        <w:rPr>
+          <w:rFonts w:ascii="Calibri" w:hAnsi="Calibri" w:eastAsia="Calibri" w:cs="Calibri"/>
+          <w:noProof w:val="0"/>
+          <w:sz w:val="24"/>
+          <w:szCs w:val="24"/>
+          <w:lang w:val="de-DE"/>
+        </w:rPr>
+      </w:pPr>
+      <w:r>
+        <w:rPr>
+          <w:rFonts w:ascii="Calibri" w:hAnsi="Calibri" w:eastAsia="Calibri" w:cs="Calibri"/>
+          <w:noProof w:val="0"/>
+          <w:sz w:val="24"/>
+          <w:szCs w:val="24"/>
+          <w:lang w:val="de-DE"/>
+        </w:rPr>
+        <w:t xml:space="preserve">Kontrol af Group Policy på klienten På klientmaskinen blev Group Policy anvendt, og registreringsdatabasen blev kontrolleret for at bekræfte, at WSUS-konfigurationen var kommet ned på klienten. Følgende kommando blev brugt: reg query "HKLM\Software\Policies\Microsoft\Windows\WindowsUpdate" /v WUServer Resultatet viste: WUServer REG_SZ </w:t>
+      </w:r>
+      <w:hyperlink r:id="R305c980d4cd4440d">
+        <w:r>
+          <w:rPr>
+            <w:rStyle w:val="Hyperlink"/>
+            <w:noProof w:val="0"/>
+            <w:sz w:val="24"/>
+            <w:szCs w:val="24"/>
+            <w:lang w:val="de-DE"/>
+          </w:rPr>
+          <w:t>http://SRV01:8530</w:t>
+        </w:r>
+      </w:hyperlink>
+      <w:r>
+        <w:rPr>
+          <w:rFonts w:ascii="Calibri" w:hAnsi="Calibri" w:eastAsia="Calibri" w:cs="Calibri"/>
+          <w:noProof w:val="0"/>
+          <w:sz w:val="24"/>
+          <w:szCs w:val="24"/>
+          <w:lang w:val="de-DE"/>
+        </w:rPr>
+        <w:t xml:space="preserve"> Dette dokumenterer, at klienten har fået WSUS-serverens adresse via politikken.</w:t>
+      </w:r>
+    </w:p>
+    <w:p>
+      <w:pPr>
+        <w:pStyle w:val="Normal"/>
+        <w:spacing w:before="0" w:beforeAutospacing="off" w:after="0" w:afterAutospacing="off"/>
+        <w:rPr>
+          <w:rFonts w:ascii="Calibri" w:hAnsi="Calibri" w:eastAsia="Calibri" w:cs="Calibri"/>
+          <w:noProof w:val="0"/>
+          <w:sz w:val="24"/>
+          <w:szCs w:val="24"/>
+          <w:lang w:val="de-DE"/>
+        </w:rPr>
+      </w:pPr>
+      <w:r>
+        <w:rPr>
+          <w:rFonts w:ascii="Calibri" w:hAnsi="Calibri" w:eastAsia="Calibri" w:cs="Calibri"/>
+          <w:noProof w:val="0"/>
+          <w:sz w:val="24"/>
+          <w:szCs w:val="24"/>
+          <w:lang w:val="de-DE"/>
+        </w:rPr>
+        <w:t>Kontrol af UseWUServer Der blev også kontrolleret en yderligere Windows Update-politikværdi med: reg query "HKLM\Software\Policies\Microsoft\Windows\WindowsUpdate\AU" /v UseWUServer Resultatet viste værdien 0x1. Det betyder, at klienten er konfigureret til at bruge en intern WSUS-server.</w:t>
+      </w:r>
+    </w:p>
+    <w:p>
+      <w:pPr>
+        <w:pStyle w:val="Normal"/>
+        <w:spacing w:before="0" w:beforeAutospacing="off" w:after="0" w:afterAutospacing="off"/>
+        <w:rPr>
+          <w:rFonts w:ascii="Calibri" w:hAnsi="Calibri" w:eastAsia="Calibri" w:cs="Calibri"/>
+          <w:noProof w:val="0"/>
+          <w:sz w:val="24"/>
+          <w:szCs w:val="24"/>
+          <w:lang w:val="de-DE"/>
+        </w:rPr>
+      </w:pPr>
+      <w:r>
+        <w:rPr>
+          <w:rFonts w:ascii="Calibri" w:hAnsi="Calibri" w:eastAsia="Calibri" w:cs="Calibri"/>
+          <w:noProof w:val="0"/>
+          <w:sz w:val="24"/>
+          <w:szCs w:val="24"/>
+          <w:lang w:val="de-DE"/>
+        </w:rPr>
+        <w:t>Tvinget kontrol efter ændring af politik Efter Group Policy-konfigurationen blev Windows Update-klienten startet manuelt med: usoclient StartScan Kommandoen blev brugt til at starte en ny søgning efter opdateringer på klienten.</w:t>
+      </w:r>
+    </w:p>
+    <w:p>
+      <w:pPr>
+        <w:pStyle w:val="Normal"/>
+        <w:spacing w:before="0" w:beforeAutospacing="off" w:after="0" w:afterAutospacing="off"/>
+        <w:rPr>
+          <w:rFonts w:ascii="Calibri" w:hAnsi="Calibri" w:eastAsia="Calibri" w:cs="Calibri"/>
+          <w:noProof w:val="0"/>
+          <w:sz w:val="24"/>
+          <w:szCs w:val="24"/>
+          <w:lang w:val="de-DE"/>
+        </w:rPr>
+      </w:pPr>
+      <w:r>
+        <w:rPr>
+          <w:rFonts w:ascii="Calibri" w:hAnsi="Calibri" w:eastAsia="Calibri" w:cs="Calibri"/>
+          <w:noProof w:val="0"/>
+          <w:sz w:val="24"/>
+          <w:szCs w:val="24"/>
+          <w:lang w:val="de-DE"/>
+        </w:rPr>
+        <w:t>Kontrol i Windows Update på klienten På klientmaskinen blev Windows Update åbnet. Her blev det kontrolleret, at maskinen havde opdateringer, og at Windows viste, at enheden var opdateret. I Update History / Opdateringsoversigt blev tidligere installerede opdateringer vist. Der kunne blandt andet ses sikkerhedsopdateringer og .NET Framework-opdateringer med status som installeret.</w:t>
+      </w:r>
+    </w:p>
+    <w:p>
+      <w:pPr>
+        <w:pStyle w:val="Normal"/>
+        <w:spacing w:before="0" w:beforeAutospacing="off" w:after="0" w:afterAutospacing="off"/>
+        <w:rPr>
+          <w:rFonts w:ascii="Calibri" w:hAnsi="Calibri" w:eastAsia="Calibri" w:cs="Calibri"/>
+          <w:noProof w:val="0"/>
+          <w:sz w:val="24"/>
+          <w:szCs w:val="24"/>
+          <w:lang w:val="de-DE"/>
+        </w:rPr>
+      </w:pPr>
+      <w:r>
+        <w:rPr>
+          <w:rFonts w:ascii="Calibri" w:hAnsi="Calibri" w:eastAsia="Calibri" w:cs="Calibri"/>
+          <w:noProof w:val="0"/>
+          <w:sz w:val="24"/>
+          <w:szCs w:val="24"/>
+          <w:lang w:val="de-DE"/>
+        </w:rPr>
+        <w:t>Kontrol i Event Viewer For at dokumentere kommunikationen mellem klienten og Windows Update blev Event Viewer åbnet på klienten. Loggen: • Applications and Services Logs → Microsoft → Windows → WindowsUpdateClient → Operational blev kontrolleret. Der blev fundet WindowsUpdateClient-hændelser, blandt andet Event ID 41. En af hændelserne viste teksten “Der blev hentet en opdatering.” og kilden “WindowsUpdateClient”. Dette er et relevant bevis på, at Windows Update-klienten har kommunikeret med opdateringstjenesten og hentet en opdatering.</w:t>
+      </w:r>
+    </w:p>
+    <w:p>
+      <w:pPr>
+        <w:pStyle w:val="Normal"/>
+        <w:spacing w:before="0" w:beforeAutospacing="off" w:after="0" w:afterAutospacing="off"/>
+        <w:rPr>
+          <w:rFonts w:ascii="Calibri" w:hAnsi="Calibri" w:eastAsia="Calibri" w:cs="Calibri"/>
+          <w:noProof w:val="0"/>
+          <w:sz w:val="24"/>
+          <w:szCs w:val="24"/>
+          <w:lang w:val="de-DE"/>
+        </w:rPr>
+      </w:pPr>
+      <w:r>
+        <w:rPr>
+          <w:rFonts w:ascii="Calibri" w:hAnsi="Calibri" w:eastAsia="Calibri" w:cs="Calibri"/>
+          <w:noProof w:val="0"/>
+          <w:sz w:val="24"/>
+          <w:szCs w:val="24"/>
+          <w:lang w:val="de-DE"/>
+        </w:rPr>
+        <w:t>Kontrol i WSUS på serveren Til sidst blev WSUS-konsollen på serveren åbnet under: • Computers → All Computers → Unassigned Computers Klienten blev vist som: client-01.novatech.local WSUS viste klientens IP-adresse, Windows-version samt status for opdateringer. Klienten havde blandt andet værdier for installerede/ikke relevante opdateringer og opdateringer uden status. Dette dokumenterer, at klienten er registreret hos WSUS og kan ses fra WSUS-serverens administrationskonsol.</w:t>
+      </w:r>
+    </w:p>
+    <w:p>
+      <w:pPr>
+        <w:pStyle w:val="Normal"/>
+        <w:spacing w:before="0" w:beforeAutospacing="off" w:after="0" w:afterAutospacing="off"/>
+        <w:rPr>
+          <w:rFonts w:ascii="Calibri" w:hAnsi="Calibri" w:eastAsia="Calibri" w:cs="Calibri"/>
+          <w:noProof w:val="0"/>
+          <w:sz w:val="24"/>
+          <w:szCs w:val="24"/>
+          <w:lang w:val="de-DE"/>
+        </w:rPr>
+      </w:pPr>
+      <w:r>
+        <w:rPr>
+          <w:rFonts w:ascii="Calibri" w:hAnsi="Calibri" w:eastAsia="Calibri" w:cs="Calibri"/>
+          <w:noProof w:val="0"/>
+          <w:sz w:val="24"/>
+          <w:szCs w:val="24"/>
+          <w:lang w:val="de-DE"/>
+        </w:rPr>
+        <w:t xml:space="preserve">Dokumentation / screenshots • Group Policy: “Specify intranet Microsoft update service location” sat til Enabled. • Klientens Registry: WUServer = </w:t>
+      </w:r>
+      <w:hyperlink r:id="R9e0817f8abb14a48">
+        <w:r>
+          <w:rPr>
+            <w:rStyle w:val="Hyperlink"/>
+            <w:noProof w:val="0"/>
+            <w:sz w:val="24"/>
+            <w:szCs w:val="24"/>
+            <w:lang w:val="de-DE"/>
+          </w:rPr>
+          <w:t>http://SRV01:8530</w:t>
+        </w:r>
+      </w:hyperlink>
+      <w:r>
+        <w:rPr>
+          <w:rFonts w:ascii="Calibri" w:hAnsi="Calibri" w:eastAsia="Calibri" w:cs="Calibri"/>
+          <w:noProof w:val="0"/>
+          <w:sz w:val="24"/>
+          <w:szCs w:val="24"/>
+          <w:lang w:val="de-DE"/>
+        </w:rPr>
+        <w:t>. • Klientens Registry: UseWUServer = 0x1. • Windows Update på klienten med status “Your device is up to date”. • Windows Update → Update History med installerede opdateringer. • Event Viewer → WindowsUpdateClient/Operational med relevante hændelser. • WSUS → Computers → All Computers / Unassigned Computers, hvor client-01.novatech.local vises.</w:t>
+      </w:r>
+    </w:p>
+    <w:p>
+      <w:pPr>
+        <w:pStyle w:val="Normal"/>
+        <w:spacing w:before="0" w:beforeAutospacing="off" w:after="0" w:afterAutospacing="off"/>
+        <w:rPr>
+          <w:rFonts w:ascii="Calibri" w:hAnsi="Calibri" w:eastAsia="Calibri" w:cs="Calibri"/>
+          <w:noProof w:val="0"/>
+          <w:sz w:val="24"/>
+          <w:szCs w:val="24"/>
+          <w:lang w:val="de-DE"/>
+        </w:rPr>
+      </w:pPr>
+      <w:r>
+        <w:rPr>
+          <w:rFonts w:ascii="Calibri" w:hAnsi="Calibri" w:eastAsia="Calibri" w:cs="Calibri"/>
+          <w:noProof w:val="0"/>
+          <w:sz w:val="24"/>
+          <w:szCs w:val="24"/>
+          <w:lang w:val="de-DE"/>
+        </w:rPr>
+        <w:t>Resultat Konfigurationen blev verificeret fra flere sider: Group Policy angav WSUS-serveren, klientens Registry viste WUServer-adressen, Windows Update registrerede og installerede opdateringer, Event Viewer viste WindowsUpdateClient-hændelser, og klienten blev til sidst vist i WSUS-konsollen på serveren. På den baggrund kan det dokumenteres, at klienten er konfigureret til at bruge den interne WSUS-server og at WSUS kan registrere klienten og håndtere dens opdateringsstatus.</w:t>
+      </w:r>
+    </w:p>
+    <w:p>
+      <w:pPr>
+        <w:pStyle w:val="Normal"/>
+        <w:spacing w:before="0" w:beforeAutospacing="off" w:after="0" w:afterAutospacing="off"/>
+        <w:rPr>
+          <w:rFonts w:ascii="Calibri" w:hAnsi="Calibri" w:eastAsia="Calibri" w:cs="Calibri"/>
+          <w:noProof w:val="0"/>
+          <w:sz w:val="24"/>
+          <w:szCs w:val="24"/>
+          <w:lang w:val="de-DE"/>
+        </w:rPr>
+      </w:pPr>
+      <w:r>
+        <w:rPr>
+          <w:rFonts w:ascii="Calibri" w:hAnsi="Calibri" w:eastAsia="Calibri" w:cs="Calibri"/>
+          <w:noProof w:val="0"/>
+          <w:sz w:val="24"/>
+          <w:szCs w:val="24"/>
+          <w:lang w:val="de-DE"/>
+        </w:rPr>
+        <w:t>Bemærkning om serverens Windows Update Det centrale i opgaven er klienternes opdatering via WSUS. Den dokumentation, der blev lavet, viser derfor især WSUS-konfigurationen, Group Policy og klientens forbindelse til WSUS. WSUS-konsollen på serveren er den relevante administrationsdel for klientopdateringerne.</w:t>
+      </w:r>
+    </w:p>
+    <w:p>
+      <w:pPr>
+        <w:pStyle w:val="Normal"/>
+        <w:rPr>
+          <w:noProof w:val="0"/>
+          <w:sz w:val="24"/>
+          <w:szCs w:val="24"/>
           <w:lang w:val="de-DE"/>
         </w:rPr>
       </w:pPr>
@@ -13579,6 +14305,91 @@
 
 <file path=word/numbering.xml><?xml version="1.0" encoding="utf-8"?>
 <w:numbering xmlns:wpc="http://schemas.microsoft.com/office/word/2010/wordprocessingCanvas" xmlns:mo="http://schemas.microsoft.com/office/mac/office/2008/main" xmlns:mc="http://schemas.openxmlformats.org/markup-compatibility/2006" xmlns:mv="urn:schemas-microsoft-com:mac:vml" xmlns:o="urn:schemas-microsoft-com:office:office" xmlns:r="http://schemas.openxmlformats.org/officeDocument/2006/relationships" xmlns:m="http://schemas.openxmlformats.org/officeDocument/2006/math" xmlns:v="urn:schemas-microsoft-com:vml" xmlns:wp14="http://schemas.microsoft.com/office/word/2010/wordprocessingDrawing" xmlns:wp="http://schemas.openxmlformats.org/drawingml/2006/wordprocessingDrawing" xmlns:w10="urn:schemas-microsoft-com:office:word" xmlns:w="http://schemas.openxmlformats.org/wordprocessingml/2006/main" xmlns:w14="http://schemas.microsoft.com/office/word/2010/wordml" xmlns:wpg="http://schemas.microsoft.com/office/word/2010/wordprocessingGroup" xmlns:wpi="http://schemas.microsoft.com/office/word/2010/wordprocessingInk" xmlns:wne="http://schemas.microsoft.com/office/word/2006/wordml" xmlns:wps="http://schemas.microsoft.com/office/word/2010/wordprocessingShape" mc:Ignorable="w14 wp14">
+  <w:abstractNum xmlns:w="http://schemas.openxmlformats.org/wordprocessingml/2006/main" w:abstractNumId="12">
+    <w:nsid w:val="32d2d329"/>
+    <w:multiLevelType xmlns:w="http://schemas.openxmlformats.org/wordprocessingml/2006/main" w:val="hybridMultilevel"/>
+    <w:lvl xmlns:w="http://schemas.openxmlformats.org/wordprocessingml/2006/main" w:ilvl="0">
+      <w:start w:val="1"/>
+      <w:numFmt w:val="decimal"/>
+      <w:lvlText w:val="%1."/>
+      <w:lvlJc w:val="left"/>
+      <w:pPr>
+        <w:ind w:left="720" w:hanging="360"/>
+      </w:pPr>
+    </w:lvl>
+    <w:lvl xmlns:w="http://schemas.openxmlformats.org/wordprocessingml/2006/main" w:ilvl="1">
+      <w:start w:val="1"/>
+      <w:numFmt w:val="lowerLetter"/>
+      <w:lvlText w:val="%2."/>
+      <w:lvlJc w:val="left"/>
+      <w:pPr>
+        <w:ind w:left="1440" w:hanging="360"/>
+      </w:pPr>
+    </w:lvl>
+    <w:lvl xmlns:w="http://schemas.openxmlformats.org/wordprocessingml/2006/main" w:ilvl="2">
+      <w:start w:val="1"/>
+      <w:numFmt w:val="lowerRoman"/>
+      <w:lvlText w:val="%3."/>
+      <w:lvlJc w:val="right"/>
+      <w:pPr>
+        <w:ind w:left="2160" w:hanging="180"/>
+      </w:pPr>
+    </w:lvl>
+    <w:lvl xmlns:w="http://schemas.openxmlformats.org/wordprocessingml/2006/main" w:ilvl="3">
+      <w:start w:val="1"/>
+      <w:numFmt w:val="decimal"/>
+      <w:lvlText w:val="%4."/>
+      <w:lvlJc w:val="left"/>
+      <w:pPr>
+        <w:ind w:left="2880" w:hanging="360"/>
+      </w:pPr>
+    </w:lvl>
+    <w:lvl xmlns:w="http://schemas.openxmlformats.org/wordprocessingml/2006/main" w:ilvl="4">
+      <w:start w:val="1"/>
+      <w:numFmt w:val="lowerLetter"/>
+      <w:lvlText w:val="%5."/>
+      <w:lvlJc w:val="left"/>
+      <w:pPr>
+        <w:ind w:left="3600" w:hanging="360"/>
+      </w:pPr>
+    </w:lvl>
+    <w:lvl xmlns:w="http://schemas.openxmlformats.org/wordprocessingml/2006/main" w:ilvl="5">
+      <w:start w:val="1"/>
+      <w:numFmt w:val="lowerRoman"/>
+      <w:lvlText w:val="%6."/>
+      <w:lvlJc w:val="right"/>
+      <w:pPr>
+        <w:ind w:left="4320" w:hanging="180"/>
+      </w:pPr>
+    </w:lvl>
+    <w:lvl xmlns:w="http://schemas.openxmlformats.org/wordprocessingml/2006/main" w:ilvl="6">
+      <w:start w:val="1"/>
+      <w:numFmt w:val="decimal"/>
+      <w:lvlText w:val="%7."/>
+      <w:lvlJc w:val="left"/>
+      <w:pPr>
+        <w:ind w:left="5040" w:hanging="360"/>
+      </w:pPr>
+    </w:lvl>
+    <w:lvl xmlns:w="http://schemas.openxmlformats.org/wordprocessingml/2006/main" w:ilvl="7">
+      <w:start w:val="1"/>
+      <w:numFmt w:val="lowerLetter"/>
+      <w:lvlText w:val="%8."/>
+      <w:lvlJc w:val="left"/>
+      <w:pPr>
+        <w:ind w:left="5760" w:hanging="360"/>
+      </w:pPr>
+    </w:lvl>
+    <w:lvl xmlns:w="http://schemas.openxmlformats.org/wordprocessingml/2006/main" w:ilvl="8">
+      <w:start w:val="1"/>
+      <w:numFmt w:val="lowerRoman"/>
+      <w:lvlText w:val="%9."/>
+      <w:lvlJc w:val="right"/>
+      <w:pPr>
+        <w:ind w:left="6480" w:hanging="180"/>
+      </w:pPr>
+    </w:lvl>
+  </w:abstractNum>
   <w:abstractNum xmlns:w="http://schemas.openxmlformats.org/wordprocessingml/2006/main" w:abstractNumId="11">
     <w:nsid w:val="1df7891c"/>
     <w:multiLevelType xmlns:w="http://schemas.openxmlformats.org/wordprocessingml/2006/main" w:val="hybridMultilevel"/>
@@ -14086,6 +14897,9 @@
       </w:rPr>
     </w:lvl>
   </w:abstractNum>
+  <w:num w:numId="13">
+    <w:abstractNumId w:val="12"/>
+  </w:num>
   <w:num w:numId="12">
     <w:abstractNumId w:val="11"/>
   </w:num>

</xml_diff>

<commit_message>
Finalize NovaTech IT infrastructure documentation
</commit_message>
<xml_diff>
--- a/Documentation/rapport.docx
+++ b/Documentation/rapport.docx
@@ -9918,9 +9918,14 @@
         <w:t>Brugeradgang</w:t>
       </w:r>
     </w:p>
-    <w:p xmlns:wp14="http://schemas.microsoft.com/office/word/2010/wordml" wp14:textId="2651DB55">
-      <w:pPr>
+    <w:p xmlns:wp14="http://schemas.microsoft.com/office/word/2010/wordml" wp14:textId="06EB3C81">
+      <w:pPr>
+        <w:pStyle w:val="Normal"/>
+        <w:suppressLineNumbers w:val="0"/>
+        <w:bidi w:val="0"/>
         <w:spacing w:before="0" w:beforeAutospacing="off" w:after="120" w:afterAutospacing="off" w:line="276" w:lineRule="auto"/>
+        <w:ind w:left="0" w:right="0"/>
+        <w:jc w:val="left"/>
       </w:pPr>
       <w:r>
         <w:rPr>
@@ -9930,7 +9935,177 @@
           <w:szCs w:val="22"/>
           <w:lang w:val="en-US"/>
         </w:rPr>
-        <w:t>I Active Directory Users and Computers blev den relevante bruger åbnet. Under Dial-in blev Network Access Permission sat til Control access through NPS Network Policy.</w:t>
+        <w:t>I Active</w:t>
+      </w:r>
+      <w:r>
+        <w:rPr>
+          <w:rFonts w:ascii="Arial" w:hAnsi="Arial" w:eastAsia="Arial" w:cs="Arial"/>
+          <w:noProof w:val="0"/>
+          <w:sz w:val="22"/>
+          <w:szCs w:val="22"/>
+          <w:lang w:val="en-US"/>
+        </w:rPr>
+        <w:t xml:space="preserve"> Directory Users and Computers </w:t>
+      </w:r>
+      <w:r>
+        <w:rPr>
+          <w:rFonts w:ascii="Arial" w:hAnsi="Arial" w:eastAsia="Arial" w:cs="Arial"/>
+          <w:noProof w:val="0"/>
+          <w:sz w:val="22"/>
+          <w:szCs w:val="22"/>
+          <w:lang w:val="en-US"/>
+        </w:rPr>
+        <w:t>blev</w:t>
+      </w:r>
+      <w:r>
+        <w:rPr>
+          <w:rFonts w:ascii="Arial" w:hAnsi="Arial" w:eastAsia="Arial" w:cs="Arial"/>
+          <w:noProof w:val="0"/>
+          <w:sz w:val="22"/>
+          <w:szCs w:val="22"/>
+          <w:lang w:val="en-US"/>
+        </w:rPr>
+        <w:t xml:space="preserve"> den </w:t>
+      </w:r>
+      <w:r>
+        <w:rPr>
+          <w:rFonts w:ascii="Arial" w:hAnsi="Arial" w:eastAsia="Arial" w:cs="Arial"/>
+          <w:noProof w:val="0"/>
+          <w:sz w:val="22"/>
+          <w:szCs w:val="22"/>
+          <w:lang w:val="en-US"/>
+        </w:rPr>
+        <w:t>relevante</w:t>
+      </w:r>
+      <w:r>
+        <w:rPr>
+          <w:rFonts w:ascii="Arial" w:hAnsi="Arial" w:eastAsia="Arial" w:cs="Arial"/>
+          <w:noProof w:val="0"/>
+          <w:sz w:val="22"/>
+          <w:szCs w:val="22"/>
+          <w:lang w:val="en-US"/>
+        </w:rPr>
+        <w:t xml:space="preserve"> </w:t>
+      </w:r>
+      <w:r>
+        <w:rPr>
+          <w:rFonts w:ascii="Arial" w:hAnsi="Arial" w:eastAsia="Arial" w:cs="Arial"/>
+          <w:noProof w:val="0"/>
+          <w:sz w:val="22"/>
+          <w:szCs w:val="22"/>
+          <w:lang w:val="en-US"/>
+        </w:rPr>
+        <w:t>bruger</w:t>
+      </w:r>
+      <w:r>
+        <w:rPr>
+          <w:rFonts w:ascii="Arial" w:hAnsi="Arial" w:eastAsia="Arial" w:cs="Arial"/>
+          <w:noProof w:val="0"/>
+          <w:sz w:val="22"/>
+          <w:szCs w:val="22"/>
+          <w:lang w:val="en-US"/>
+        </w:rPr>
+        <w:t xml:space="preserve"> </w:t>
+      </w:r>
+      <w:r>
+        <w:rPr>
+          <w:rFonts w:ascii="Arial" w:hAnsi="Arial" w:eastAsia="Arial" w:cs="Arial"/>
+          <w:noProof w:val="0"/>
+          <w:sz w:val="22"/>
+          <w:szCs w:val="22"/>
+          <w:lang w:val="en-US"/>
+        </w:rPr>
+        <w:t>åbnet</w:t>
+      </w:r>
+      <w:r>
+        <w:rPr>
+          <w:rFonts w:ascii="Arial" w:hAnsi="Arial" w:eastAsia="Arial" w:cs="Arial"/>
+          <w:noProof w:val="0"/>
+          <w:sz w:val="22"/>
+          <w:szCs w:val="22"/>
+          <w:lang w:val="en-US"/>
+        </w:rPr>
+        <w:t xml:space="preserve">. Under Dial-in </w:t>
+      </w:r>
+      <w:r>
+        <w:rPr>
+          <w:rFonts w:ascii="Arial" w:hAnsi="Arial" w:eastAsia="Arial" w:cs="Arial"/>
+          <w:noProof w:val="0"/>
+          <w:sz w:val="22"/>
+          <w:szCs w:val="22"/>
+          <w:lang w:val="en-US"/>
+        </w:rPr>
+        <w:t>blev</w:t>
+      </w:r>
+      <w:r>
+        <w:rPr>
+          <w:rFonts w:ascii="Arial" w:hAnsi="Arial" w:eastAsia="Arial" w:cs="Arial"/>
+          <w:noProof w:val="0"/>
+          <w:sz w:val="22"/>
+          <w:szCs w:val="22"/>
+          <w:lang w:val="en-US"/>
+        </w:rPr>
+        <w:t xml:space="preserve"> Network Access </w:t>
+      </w:r>
+      <w:r>
+        <w:rPr>
+          <w:rFonts w:ascii="Arial" w:hAnsi="Arial" w:eastAsia="Arial" w:cs="Arial"/>
+          <w:noProof w:val="0"/>
+          <w:sz w:val="22"/>
+          <w:szCs w:val="22"/>
+          <w:lang w:val="en-US"/>
+        </w:rPr>
+        <w:t>Permission sat</w:t>
+      </w:r>
+      <w:r>
+        <w:rPr>
+          <w:rFonts w:ascii="Arial" w:hAnsi="Arial" w:eastAsia="Arial" w:cs="Arial"/>
+          <w:noProof w:val="0"/>
+          <w:sz w:val="22"/>
+          <w:szCs w:val="22"/>
+          <w:lang w:val="en-US"/>
+        </w:rPr>
+        <w:t xml:space="preserve"> </w:t>
+      </w:r>
+      <w:r>
+        <w:rPr>
+          <w:rFonts w:ascii="Arial" w:hAnsi="Arial" w:eastAsia="Arial" w:cs="Arial"/>
+          <w:noProof w:val="0"/>
+          <w:sz w:val="22"/>
+          <w:szCs w:val="22"/>
+          <w:lang w:val="en-US"/>
+        </w:rPr>
+        <w:t>til</w:t>
+      </w:r>
+      <w:r>
+        <w:rPr>
+          <w:rFonts w:ascii="Arial" w:hAnsi="Arial" w:eastAsia="Arial" w:cs="Arial"/>
+          <w:noProof w:val="0"/>
+          <w:sz w:val="22"/>
+          <w:szCs w:val="22"/>
+          <w:lang w:val="en-US"/>
+        </w:rPr>
+        <w:t xml:space="preserve"> </w:t>
+      </w:r>
+      <w:r>
+        <w:rPr>
+          <w:rFonts w:ascii="Arial" w:hAnsi="Arial" w:eastAsia="Arial" w:cs="Arial"/>
+          <w:noProof w:val="0"/>
+          <w:sz w:val="22"/>
+          <w:szCs w:val="22"/>
+          <w:lang w:val="en-US"/>
+        </w:rPr>
+        <w:t>Allow access</w:t>
+      </w:r>
+      <w:r>
+        <w:rPr>
+          <w:rFonts w:ascii="Arial" w:hAnsi="Arial" w:eastAsia="Arial" w:cs="Arial"/>
+          <w:noProof w:val="0"/>
+          <w:sz w:val="22"/>
+          <w:szCs w:val="22"/>
+          <w:lang w:val="en-US"/>
+        </w:rPr>
+        <w:t>.</w:t>
       </w:r>
     </w:p>
     <w:p xmlns:wp14="http://schemas.microsoft.com/office/word/2010/wordml" wp14:textId="1D585DC5">

</xml_diff>